<commit_message>
Update deck and Word report with full transaction analysis
Co-Authored-By: Claude Sonnet 5.5 <noreply@anthropic.com>
Claude-Session: https://claude.ai/code/session_017RLvirTSx84UWnroqbbqTM
</commit_message>
<xml_diff>
--- a/output/Laporan_Data_EverMart.docx
+++ b/output/Laporan_Data_EverMart.docx
@@ -54,7 +54,7 @@
         <w:spacing w:after="120"/>
       </w:pPr>
       <w:r>
-        <w:t xml:space="preserve">Catatan penting: tabel Transactions (evermart_online_transactions.xlsx) tidak ikut ter-upload, dan data di dalam file .pbix terkompresi sehingga tidak bisa dibaca di luar Power BI. Karena itu angka transaksi (total revenue, jumlah transaksi) belum dapat dihitung dan ditandai sebagai "menunggu data".</w:t>
+        <w:t xml:space="preserve">Sumber: file EverMart_Online_Transactions_uts.pbix (tabel Customers, Products, Transactions). Total 3 tabel dan 15 kolom, dengan 1.000 transaksi, 200 pelanggan, dan 100 produk. Periode transaksi 30 Desember 2023 sampai 28 Desember 2024.</w:t>
       </w:r>
     </w:p>
     <w:p>
@@ -507,7 +507,7 @@
                 <w:sz w:val="20"/>
                 <w:szCs w:val="20"/>
               </w:rPr>
-              <w:t xml:space="preserve">menunggu data</w:t>
+              <w:t xml:space="preserve">1.000</w:t>
             </w:r>
           </w:p>
         </w:tc>
@@ -535,7 +535,7 @@
                 <w:sz w:val="20"/>
                 <w:szCs w:val="20"/>
               </w:rPr>
-              <w:t xml:space="preserve">menunggu data</w:t>
+              <w:t xml:space="preserve">7</w:t>
             </w:r>
           </w:p>
         </w:tc>
@@ -563,7 +563,7 @@
                 <w:sz w:val="20"/>
                 <w:szCs w:val="20"/>
               </w:rPr>
-              <w:t xml:space="preserve">TransactionID; CustomerID dan ProductID sebagai foreign key</w:t>
+              <w:t xml:space="preserve">TransactionID; CustomerID dan ProductID sebagai foreign key (relasi banyak-ke-satu)</w:t>
             </w:r>
           </w:p>
         </w:tc>
@@ -573,14 +573,6 @@
       <w:pPr>
         <w:spacing w:after="120"/>
       </w:pPr>
-    </w:p>
-    <w:p>
-      <w:pPr>
-        <w:spacing w:after="120"/>
-      </w:pPr>
-      <w:r>
-        <w:t xml:space="preserve">Kolom Transactions yang terdeteksi dari visual di dashboard: TransactionID, CustomerID, ProductID, TransactionDate, TotalValue, dan Variation (hierarki tanggal). Kemungkinan ada Quantity dan Price, tetapi belum terkonfirmasi.</w:t>
-      </w:r>
     </w:p>
     <w:p>
       <w:pPr>
@@ -1554,10 +1546,760 @@
     </w:p>
     <w:p>
       <w:pPr>
+        <w:pStyle w:val="Heading2"/>
+        <w:spacing w:after="120" w:before="240"/>
+      </w:pPr>
+      <w:r>
+        <w:t xml:space="preserve">3.3 Tabel Transactions</w:t>
+      </w:r>
+    </w:p>
+    <w:tbl>
+      <w:tblPr>
+        <w:tblW w:type="dxa" w:w="9360"/>
+        <w:tblBorders>
+          <w:top w:val="single" w:color="auto" w:sz="4"/>
+          <w:left w:val="single" w:color="auto" w:sz="4"/>
+          <w:bottom w:val="single" w:color="auto" w:sz="4"/>
+          <w:right w:val="single" w:color="auto" w:sz="4"/>
+          <w:insideH w:val="single" w:color="auto" w:sz="4"/>
+          <w:insideV w:val="single" w:color="auto" w:sz="4"/>
+        </w:tblBorders>
+      </w:tblPr>
+      <w:tblGrid>
+        <w:gridCol w:w="2200"/>
+        <w:gridCol w:w="2200"/>
+        <w:gridCol w:w="4960"/>
+      </w:tblGrid>
+      <w:tr>
+        <w:trPr>
+          <w:tblHeader/>
+        </w:trPr>
+        <w:tc>
+          <w:tcPr>
+            <w:tcW w:type="dxa" w:w="2200"/>
+            <w:tcBorders>
+              <w:top w:val="single" w:color="BBBBBB" w:sz="4"/>
+              <w:left w:val="single" w:color="BBBBBB" w:sz="4"/>
+              <w:bottom w:val="single" w:color="BBBBBB" w:sz="4"/>
+              <w:right w:val="single" w:color="BBBBBB" w:sz="4"/>
+            </w:tcBorders>
+            <w:shd w:fill="1F4E79" w:color="auto" w:val="clear"/>
+            <w:tcMar>
+              <w:top w:type="dxa" w:w="60"/>
+              <w:left w:type="dxa" w:w="100"/>
+              <w:bottom w:type="dxa" w:w="60"/>
+              <w:right w:type="dxa" w:w="100"/>
+            </w:tcMar>
+          </w:tcPr>
+          <w:p>
+            <w:r>
+              <w:rPr>
+                <w:b/>
+                <w:bCs/>
+                <w:color w:val="FFFFFF"/>
+                <w:sz w:val="20"/>
+                <w:szCs w:val="20"/>
+              </w:rPr>
+              <w:t xml:space="preserve">Variabel</w:t>
+            </w:r>
+          </w:p>
+        </w:tc>
+        <w:tc>
+          <w:tcPr>
+            <w:tcW w:type="dxa" w:w="2200"/>
+            <w:tcBorders>
+              <w:top w:val="single" w:color="BBBBBB" w:sz="4"/>
+              <w:left w:val="single" w:color="BBBBBB" w:sz="4"/>
+              <w:bottom w:val="single" w:color="BBBBBB" w:sz="4"/>
+              <w:right w:val="single" w:color="BBBBBB" w:sz="4"/>
+            </w:tcBorders>
+            <w:shd w:fill="1F4E79" w:color="auto" w:val="clear"/>
+            <w:tcMar>
+              <w:top w:type="dxa" w:w="60"/>
+              <w:left w:type="dxa" w:w="100"/>
+              <w:bottom w:type="dxa" w:w="60"/>
+              <w:right w:type="dxa" w:w="100"/>
+            </w:tcMar>
+          </w:tcPr>
+          <w:p>
+            <w:r>
+              <w:rPr>
+                <w:b/>
+                <w:bCs/>
+                <w:color w:val="FFFFFF"/>
+                <w:sz w:val="20"/>
+                <w:szCs w:val="20"/>
+              </w:rPr>
+              <w:t xml:space="preserve">Tipe</w:t>
+            </w:r>
+          </w:p>
+        </w:tc>
+        <w:tc>
+          <w:tcPr>
+            <w:tcW w:type="dxa" w:w="4960"/>
+            <w:tcBorders>
+              <w:top w:val="single" w:color="BBBBBB" w:sz="4"/>
+              <w:left w:val="single" w:color="BBBBBB" w:sz="4"/>
+              <w:bottom w:val="single" w:color="BBBBBB" w:sz="4"/>
+              <w:right w:val="single" w:color="BBBBBB" w:sz="4"/>
+            </w:tcBorders>
+            <w:shd w:fill="1F4E79" w:color="auto" w:val="clear"/>
+            <w:tcMar>
+              <w:top w:type="dxa" w:w="60"/>
+              <w:left w:type="dxa" w:w="100"/>
+              <w:bottom w:type="dxa" w:w="60"/>
+              <w:right w:type="dxa" w:w="100"/>
+            </w:tcMar>
+          </w:tcPr>
+          <w:p>
+            <w:r>
+              <w:rPr>
+                <w:b/>
+                <w:bCs/>
+                <w:color w:val="FFFFFF"/>
+                <w:sz w:val="20"/>
+                <w:szCs w:val="20"/>
+              </w:rPr>
+              <w:t xml:space="preserve">Keterangan</w:t>
+            </w:r>
+          </w:p>
+        </w:tc>
+      </w:tr>
+      <w:tr>
+        <w:trPr>
+          <w:tblHeader w:val="false"/>
+        </w:trPr>
+        <w:tc>
+          <w:tcPr>
+            <w:tcW w:type="dxa" w:w="2200"/>
+            <w:tcBorders>
+              <w:top w:val="single" w:color="BBBBBB" w:sz="4"/>
+              <w:left w:val="single" w:color="BBBBBB" w:sz="4"/>
+              <w:bottom w:val="single" w:color="BBBBBB" w:sz="4"/>
+              <w:right w:val="single" w:color="BBBBBB" w:sz="4"/>
+            </w:tcBorders>
+            <w:tcMar>
+              <w:top w:type="dxa" w:w="60"/>
+              <w:left w:type="dxa" w:w="100"/>
+              <w:bottom w:type="dxa" w:w="60"/>
+              <w:right w:type="dxa" w:w="100"/>
+            </w:tcMar>
+          </w:tcPr>
+          <w:p>
+            <w:r>
+              <w:rPr>
+                <w:b w:val="false"/>
+                <w:bCs w:val="false"/>
+                <w:sz w:val="20"/>
+                <w:szCs w:val="20"/>
+              </w:rPr>
+              <w:t xml:space="preserve">TransactionID</w:t>
+            </w:r>
+          </w:p>
+        </w:tc>
+        <w:tc>
+          <w:tcPr>
+            <w:tcW w:type="dxa" w:w="2200"/>
+            <w:tcBorders>
+              <w:top w:val="single" w:color="BBBBBB" w:sz="4"/>
+              <w:left w:val="single" w:color="BBBBBB" w:sz="4"/>
+              <w:bottom w:val="single" w:color="BBBBBB" w:sz="4"/>
+              <w:right w:val="single" w:color="BBBBBB" w:sz="4"/>
+            </w:tcBorders>
+            <w:tcMar>
+              <w:top w:type="dxa" w:w="60"/>
+              <w:left w:type="dxa" w:w="100"/>
+              <w:bottom w:type="dxa" w:w="60"/>
+              <w:right w:type="dxa" w:w="100"/>
+            </w:tcMar>
+          </w:tcPr>
+          <w:p>
+            <w:r>
+              <w:rPr>
+                <w:b w:val="false"/>
+                <w:bCs w:val="false"/>
+                <w:sz w:val="20"/>
+                <w:szCs w:val="20"/>
+              </w:rPr>
+              <w:t xml:space="preserve">Identifier (teks)</w:t>
+            </w:r>
+          </w:p>
+        </w:tc>
+        <w:tc>
+          <w:tcPr>
+            <w:tcW w:type="dxa" w:w="4960"/>
+            <w:tcBorders>
+              <w:top w:val="single" w:color="BBBBBB" w:sz="4"/>
+              <w:left w:val="single" w:color="BBBBBB" w:sz="4"/>
+              <w:bottom w:val="single" w:color="BBBBBB" w:sz="4"/>
+              <w:right w:val="single" w:color="BBBBBB" w:sz="4"/>
+            </w:tcBorders>
+            <w:tcMar>
+              <w:top w:type="dxa" w:w="60"/>
+              <w:left w:type="dxa" w:w="100"/>
+              <w:bottom w:type="dxa" w:w="60"/>
+              <w:right w:type="dxa" w:w="100"/>
+            </w:tcMar>
+          </w:tcPr>
+          <w:p>
+            <w:r>
+              <w:rPr>
+                <w:b w:val="false"/>
+                <w:bCs w:val="false"/>
+                <w:sz w:val="20"/>
+                <w:szCs w:val="20"/>
+              </w:rPr>
+              <w:t xml:space="preserve">ID unik, 1.000 nilai</w:t>
+            </w:r>
+          </w:p>
+        </w:tc>
+      </w:tr>
+      <w:tr>
+        <w:trPr>
+          <w:tblHeader w:val="false"/>
+        </w:trPr>
+        <w:tc>
+          <w:tcPr>
+            <w:tcW w:type="dxa" w:w="2200"/>
+            <w:tcBorders>
+              <w:top w:val="single" w:color="BBBBBB" w:sz="4"/>
+              <w:left w:val="single" w:color="BBBBBB" w:sz="4"/>
+              <w:bottom w:val="single" w:color="BBBBBB" w:sz="4"/>
+              <w:right w:val="single" w:color="BBBBBB" w:sz="4"/>
+            </w:tcBorders>
+            <w:tcMar>
+              <w:top w:type="dxa" w:w="60"/>
+              <w:left w:type="dxa" w:w="100"/>
+              <w:bottom w:type="dxa" w:w="60"/>
+              <w:right w:type="dxa" w:w="100"/>
+            </w:tcMar>
+          </w:tcPr>
+          <w:p>
+            <w:r>
+              <w:rPr>
+                <w:b w:val="false"/>
+                <w:bCs w:val="false"/>
+                <w:sz w:val="20"/>
+                <w:szCs w:val="20"/>
+              </w:rPr>
+              <w:t xml:space="preserve">CustomerID</w:t>
+            </w:r>
+          </w:p>
+        </w:tc>
+        <w:tc>
+          <w:tcPr>
+            <w:tcW w:type="dxa" w:w="2200"/>
+            <w:tcBorders>
+              <w:top w:val="single" w:color="BBBBBB" w:sz="4"/>
+              <w:left w:val="single" w:color="BBBBBB" w:sz="4"/>
+              <w:bottom w:val="single" w:color="BBBBBB" w:sz="4"/>
+              <w:right w:val="single" w:color="BBBBBB" w:sz="4"/>
+            </w:tcBorders>
+            <w:tcMar>
+              <w:top w:type="dxa" w:w="60"/>
+              <w:left w:type="dxa" w:w="100"/>
+              <w:bottom w:type="dxa" w:w="60"/>
+              <w:right w:type="dxa" w:w="100"/>
+            </w:tcMar>
+          </w:tcPr>
+          <w:p>
+            <w:r>
+              <w:rPr>
+                <w:b w:val="false"/>
+                <w:bCs w:val="false"/>
+                <w:sz w:val="20"/>
+                <w:szCs w:val="20"/>
+              </w:rPr>
+              <w:t xml:space="preserve">Identifier (teks)</w:t>
+            </w:r>
+          </w:p>
+        </w:tc>
+        <w:tc>
+          <w:tcPr>
+            <w:tcW w:type="dxa" w:w="4960"/>
+            <w:tcBorders>
+              <w:top w:val="single" w:color="BBBBBB" w:sz="4"/>
+              <w:left w:val="single" w:color="BBBBBB" w:sz="4"/>
+              <w:bottom w:val="single" w:color="BBBBBB" w:sz="4"/>
+              <w:right w:val="single" w:color="BBBBBB" w:sz="4"/>
+            </w:tcBorders>
+            <w:tcMar>
+              <w:top w:type="dxa" w:w="60"/>
+              <w:left w:type="dxa" w:w="100"/>
+              <w:bottom w:type="dxa" w:w="60"/>
+              <w:right w:type="dxa" w:w="100"/>
+            </w:tcMar>
+          </w:tcPr>
+          <w:p>
+            <w:r>
+              <w:rPr>
+                <w:b w:val="false"/>
+                <w:bCs w:val="false"/>
+                <w:sz w:val="20"/>
+                <w:szCs w:val="20"/>
+              </w:rPr>
+              <w:t xml:space="preserve">Kunci ke Customers, 199 pelanggan bertransaksi</w:t>
+            </w:r>
+          </w:p>
+        </w:tc>
+      </w:tr>
+      <w:tr>
+        <w:trPr>
+          <w:tblHeader w:val="false"/>
+        </w:trPr>
+        <w:tc>
+          <w:tcPr>
+            <w:tcW w:type="dxa" w:w="2200"/>
+            <w:tcBorders>
+              <w:top w:val="single" w:color="BBBBBB" w:sz="4"/>
+              <w:left w:val="single" w:color="BBBBBB" w:sz="4"/>
+              <w:bottom w:val="single" w:color="BBBBBB" w:sz="4"/>
+              <w:right w:val="single" w:color="BBBBBB" w:sz="4"/>
+            </w:tcBorders>
+            <w:tcMar>
+              <w:top w:type="dxa" w:w="60"/>
+              <w:left w:type="dxa" w:w="100"/>
+              <w:bottom w:type="dxa" w:w="60"/>
+              <w:right w:type="dxa" w:w="100"/>
+            </w:tcMar>
+          </w:tcPr>
+          <w:p>
+            <w:r>
+              <w:rPr>
+                <w:b w:val="false"/>
+                <w:bCs w:val="false"/>
+                <w:sz w:val="20"/>
+                <w:szCs w:val="20"/>
+              </w:rPr>
+              <w:t xml:space="preserve">ProductID</w:t>
+            </w:r>
+          </w:p>
+        </w:tc>
+        <w:tc>
+          <w:tcPr>
+            <w:tcW w:type="dxa" w:w="2200"/>
+            <w:tcBorders>
+              <w:top w:val="single" w:color="BBBBBB" w:sz="4"/>
+              <w:left w:val="single" w:color="BBBBBB" w:sz="4"/>
+              <w:bottom w:val="single" w:color="BBBBBB" w:sz="4"/>
+              <w:right w:val="single" w:color="BBBBBB" w:sz="4"/>
+            </w:tcBorders>
+            <w:tcMar>
+              <w:top w:type="dxa" w:w="60"/>
+              <w:left w:type="dxa" w:w="100"/>
+              <w:bottom w:type="dxa" w:w="60"/>
+              <w:right w:type="dxa" w:w="100"/>
+            </w:tcMar>
+          </w:tcPr>
+          <w:p>
+            <w:r>
+              <w:rPr>
+                <w:b w:val="false"/>
+                <w:bCs w:val="false"/>
+                <w:sz w:val="20"/>
+                <w:szCs w:val="20"/>
+              </w:rPr>
+              <w:t xml:space="preserve">Identifier (teks)</w:t>
+            </w:r>
+          </w:p>
+        </w:tc>
+        <w:tc>
+          <w:tcPr>
+            <w:tcW w:type="dxa" w:w="4960"/>
+            <w:tcBorders>
+              <w:top w:val="single" w:color="BBBBBB" w:sz="4"/>
+              <w:left w:val="single" w:color="BBBBBB" w:sz="4"/>
+              <w:bottom w:val="single" w:color="BBBBBB" w:sz="4"/>
+              <w:right w:val="single" w:color="BBBBBB" w:sz="4"/>
+            </w:tcBorders>
+            <w:tcMar>
+              <w:top w:type="dxa" w:w="60"/>
+              <w:left w:type="dxa" w:w="100"/>
+              <w:bottom w:type="dxa" w:w="60"/>
+              <w:right w:type="dxa" w:w="100"/>
+            </w:tcMar>
+          </w:tcPr>
+          <w:p>
+            <w:r>
+              <w:rPr>
+                <w:b w:val="false"/>
+                <w:bCs w:val="false"/>
+                <w:sz w:val="20"/>
+                <w:szCs w:val="20"/>
+              </w:rPr>
+              <w:t xml:space="preserve">Kunci ke Products, 100 produk terjual</w:t>
+            </w:r>
+          </w:p>
+        </w:tc>
+      </w:tr>
+      <w:tr>
+        <w:trPr>
+          <w:tblHeader w:val="false"/>
+        </w:trPr>
+        <w:tc>
+          <w:tcPr>
+            <w:tcW w:type="dxa" w:w="2200"/>
+            <w:tcBorders>
+              <w:top w:val="single" w:color="BBBBBB" w:sz="4"/>
+              <w:left w:val="single" w:color="BBBBBB" w:sz="4"/>
+              <w:bottom w:val="single" w:color="BBBBBB" w:sz="4"/>
+              <w:right w:val="single" w:color="BBBBBB" w:sz="4"/>
+            </w:tcBorders>
+            <w:tcMar>
+              <w:top w:type="dxa" w:w="60"/>
+              <w:left w:type="dxa" w:w="100"/>
+              <w:bottom w:type="dxa" w:w="60"/>
+              <w:right w:type="dxa" w:w="100"/>
+            </w:tcMar>
+          </w:tcPr>
+          <w:p>
+            <w:r>
+              <w:rPr>
+                <w:b w:val="false"/>
+                <w:bCs w:val="false"/>
+                <w:sz w:val="20"/>
+                <w:szCs w:val="20"/>
+              </w:rPr>
+              <w:t xml:space="preserve">TransactionDate</w:t>
+            </w:r>
+          </w:p>
+        </w:tc>
+        <w:tc>
+          <w:tcPr>
+            <w:tcW w:type="dxa" w:w="2200"/>
+            <w:tcBorders>
+              <w:top w:val="single" w:color="BBBBBB" w:sz="4"/>
+              <w:left w:val="single" w:color="BBBBBB" w:sz="4"/>
+              <w:bottom w:val="single" w:color="BBBBBB" w:sz="4"/>
+              <w:right w:val="single" w:color="BBBBBB" w:sz="4"/>
+            </w:tcBorders>
+            <w:tcMar>
+              <w:top w:type="dxa" w:w="60"/>
+              <w:left w:type="dxa" w:w="100"/>
+              <w:bottom w:type="dxa" w:w="60"/>
+              <w:right w:type="dxa" w:w="100"/>
+            </w:tcMar>
+          </w:tcPr>
+          <w:p>
+            <w:r>
+              <w:rPr>
+                <w:b w:val="false"/>
+                <w:bCs w:val="false"/>
+                <w:sz w:val="20"/>
+                <w:szCs w:val="20"/>
+              </w:rPr>
+              <w:t xml:space="preserve">Tanggal-waktu</w:t>
+            </w:r>
+          </w:p>
+        </w:tc>
+        <w:tc>
+          <w:tcPr>
+            <w:tcW w:type="dxa" w:w="4960"/>
+            <w:tcBorders>
+              <w:top w:val="single" w:color="BBBBBB" w:sz="4"/>
+              <w:left w:val="single" w:color="BBBBBB" w:sz="4"/>
+              <w:bottom w:val="single" w:color="BBBBBB" w:sz="4"/>
+              <w:right w:val="single" w:color="BBBBBB" w:sz="4"/>
+            </w:tcBorders>
+            <w:tcMar>
+              <w:top w:type="dxa" w:w="60"/>
+              <w:left w:type="dxa" w:w="100"/>
+              <w:bottom w:type="dxa" w:w="60"/>
+              <w:right w:type="dxa" w:w="100"/>
+            </w:tcMar>
+          </w:tcPr>
+          <w:p>
+            <w:r>
+              <w:rPr>
+                <w:b w:val="false"/>
+                <w:bCs w:val="false"/>
+                <w:sz w:val="20"/>
+                <w:szCs w:val="20"/>
+              </w:rPr>
+              <w:t xml:space="preserve">30 Des 2023 sampai 28 Des 2024</w:t>
+            </w:r>
+          </w:p>
+        </w:tc>
+      </w:tr>
+      <w:tr>
+        <w:trPr>
+          <w:tblHeader w:val="false"/>
+        </w:trPr>
+        <w:tc>
+          <w:tcPr>
+            <w:tcW w:type="dxa" w:w="2200"/>
+            <w:tcBorders>
+              <w:top w:val="single" w:color="BBBBBB" w:sz="4"/>
+              <w:left w:val="single" w:color="BBBBBB" w:sz="4"/>
+              <w:bottom w:val="single" w:color="BBBBBB" w:sz="4"/>
+              <w:right w:val="single" w:color="BBBBBB" w:sz="4"/>
+            </w:tcBorders>
+            <w:tcMar>
+              <w:top w:type="dxa" w:w="60"/>
+              <w:left w:type="dxa" w:w="100"/>
+              <w:bottom w:type="dxa" w:w="60"/>
+              <w:right w:type="dxa" w:w="100"/>
+            </w:tcMar>
+          </w:tcPr>
+          <w:p>
+            <w:r>
+              <w:rPr>
+                <w:b w:val="false"/>
+                <w:bCs w:val="false"/>
+                <w:sz w:val="20"/>
+                <w:szCs w:val="20"/>
+              </w:rPr>
+              <w:t xml:space="preserve">Quantity</w:t>
+            </w:r>
+          </w:p>
+        </w:tc>
+        <w:tc>
+          <w:tcPr>
+            <w:tcW w:type="dxa" w:w="2200"/>
+            <w:tcBorders>
+              <w:top w:val="single" w:color="BBBBBB" w:sz="4"/>
+              <w:left w:val="single" w:color="BBBBBB" w:sz="4"/>
+              <w:bottom w:val="single" w:color="BBBBBB" w:sz="4"/>
+              <w:right w:val="single" w:color="BBBBBB" w:sz="4"/>
+            </w:tcBorders>
+            <w:tcMar>
+              <w:top w:type="dxa" w:w="60"/>
+              <w:left w:type="dxa" w:w="100"/>
+              <w:bottom w:type="dxa" w:w="60"/>
+              <w:right w:type="dxa" w:w="100"/>
+            </w:tcMar>
+          </w:tcPr>
+          <w:p>
+            <w:r>
+              <w:rPr>
+                <w:b w:val="false"/>
+                <w:bCs w:val="false"/>
+                <w:sz w:val="20"/>
+                <w:szCs w:val="20"/>
+              </w:rPr>
+              <w:t xml:space="preserve">Bilangan bulat</w:t>
+            </w:r>
+          </w:p>
+        </w:tc>
+        <w:tc>
+          <w:tcPr>
+            <w:tcW w:type="dxa" w:w="4960"/>
+            <w:tcBorders>
+              <w:top w:val="single" w:color="BBBBBB" w:sz="4"/>
+              <w:left w:val="single" w:color="BBBBBB" w:sz="4"/>
+              <w:bottom w:val="single" w:color="BBBBBB" w:sz="4"/>
+              <w:right w:val="single" w:color="BBBBBB" w:sz="4"/>
+            </w:tcBorders>
+            <w:tcMar>
+              <w:top w:type="dxa" w:w="60"/>
+              <w:left w:type="dxa" w:w="100"/>
+              <w:bottom w:type="dxa" w:w="60"/>
+              <w:right w:type="dxa" w:w="100"/>
+            </w:tcMar>
+          </w:tcPr>
+          <w:p>
+            <w:r>
+              <w:rPr>
+                <w:b w:val="false"/>
+                <w:bCs w:val="false"/>
+                <w:sz w:val="20"/>
+                <w:szCs w:val="20"/>
+              </w:rPr>
+              <w:t xml:space="preserve">1 sampai 4 unit</w:t>
+            </w:r>
+          </w:p>
+        </w:tc>
+      </w:tr>
+      <w:tr>
+        <w:trPr>
+          <w:tblHeader w:val="false"/>
+        </w:trPr>
+        <w:tc>
+          <w:tcPr>
+            <w:tcW w:type="dxa" w:w="2200"/>
+            <w:tcBorders>
+              <w:top w:val="single" w:color="BBBBBB" w:sz="4"/>
+              <w:left w:val="single" w:color="BBBBBB" w:sz="4"/>
+              <w:bottom w:val="single" w:color="BBBBBB" w:sz="4"/>
+              <w:right w:val="single" w:color="BBBBBB" w:sz="4"/>
+            </w:tcBorders>
+            <w:tcMar>
+              <w:top w:type="dxa" w:w="60"/>
+              <w:left w:type="dxa" w:w="100"/>
+              <w:bottom w:type="dxa" w:w="60"/>
+              <w:right w:type="dxa" w:w="100"/>
+            </w:tcMar>
+          </w:tcPr>
+          <w:p>
+            <w:r>
+              <w:rPr>
+                <w:b w:val="false"/>
+                <w:bCs w:val="false"/>
+                <w:sz w:val="20"/>
+                <w:szCs w:val="20"/>
+              </w:rPr>
+              <w:t xml:space="preserve">Price</w:t>
+            </w:r>
+          </w:p>
+        </w:tc>
+        <w:tc>
+          <w:tcPr>
+            <w:tcW w:type="dxa" w:w="2200"/>
+            <w:tcBorders>
+              <w:top w:val="single" w:color="BBBBBB" w:sz="4"/>
+              <w:left w:val="single" w:color="BBBBBB" w:sz="4"/>
+              <w:bottom w:val="single" w:color="BBBBBB" w:sz="4"/>
+              <w:right w:val="single" w:color="BBBBBB" w:sz="4"/>
+            </w:tcBorders>
+            <w:tcMar>
+              <w:top w:type="dxa" w:w="60"/>
+              <w:left w:type="dxa" w:w="100"/>
+              <w:bottom w:type="dxa" w:w="60"/>
+              <w:right w:type="dxa" w:w="100"/>
+            </w:tcMar>
+          </w:tcPr>
+          <w:p>
+            <w:r>
+              <w:rPr>
+                <w:b w:val="false"/>
+                <w:bCs w:val="false"/>
+                <w:sz w:val="20"/>
+                <w:szCs w:val="20"/>
+              </w:rPr>
+              <w:t xml:space="preserve">Desimal</w:t>
+            </w:r>
+          </w:p>
+        </w:tc>
+        <w:tc>
+          <w:tcPr>
+            <w:tcW w:type="dxa" w:w="4960"/>
+            <w:tcBorders>
+              <w:top w:val="single" w:color="BBBBBB" w:sz="4"/>
+              <w:left w:val="single" w:color="BBBBBB" w:sz="4"/>
+              <w:bottom w:val="single" w:color="BBBBBB" w:sz="4"/>
+              <w:right w:val="single" w:color="BBBBBB" w:sz="4"/>
+            </w:tcBorders>
+            <w:tcMar>
+              <w:top w:type="dxa" w:w="60"/>
+              <w:left w:type="dxa" w:w="100"/>
+              <w:bottom w:type="dxa" w:w="60"/>
+              <w:right w:type="dxa" w:w="100"/>
+            </w:tcMar>
+          </w:tcPr>
+          <w:p>
+            <w:r>
+              <w:rPr>
+                <w:b w:val="false"/>
+                <w:bCs w:val="false"/>
+                <w:sz w:val="20"/>
+                <w:szCs w:val="20"/>
+              </w:rPr>
+              <w:t xml:space="preserve">Harga satuan, 16,08 sampai 497,76</w:t>
+            </w:r>
+          </w:p>
+        </w:tc>
+      </w:tr>
+      <w:tr>
+        <w:trPr>
+          <w:tblHeader w:val="false"/>
+        </w:trPr>
+        <w:tc>
+          <w:tcPr>
+            <w:tcW w:type="dxa" w:w="2200"/>
+            <w:tcBorders>
+              <w:top w:val="single" w:color="BBBBBB" w:sz="4"/>
+              <w:left w:val="single" w:color="BBBBBB" w:sz="4"/>
+              <w:bottom w:val="single" w:color="BBBBBB" w:sz="4"/>
+              <w:right w:val="single" w:color="BBBBBB" w:sz="4"/>
+            </w:tcBorders>
+            <w:tcMar>
+              <w:top w:type="dxa" w:w="60"/>
+              <w:left w:type="dxa" w:w="100"/>
+              <w:bottom w:type="dxa" w:w="60"/>
+              <w:right w:type="dxa" w:w="100"/>
+            </w:tcMar>
+          </w:tcPr>
+          <w:p>
+            <w:r>
+              <w:rPr>
+                <w:b w:val="false"/>
+                <w:bCs w:val="false"/>
+                <w:sz w:val="20"/>
+                <w:szCs w:val="20"/>
+              </w:rPr>
+              <w:t xml:space="preserve">TotalValue</w:t>
+            </w:r>
+          </w:p>
+        </w:tc>
+        <w:tc>
+          <w:tcPr>
+            <w:tcW w:type="dxa" w:w="2200"/>
+            <w:tcBorders>
+              <w:top w:val="single" w:color="BBBBBB" w:sz="4"/>
+              <w:left w:val="single" w:color="BBBBBB" w:sz="4"/>
+              <w:bottom w:val="single" w:color="BBBBBB" w:sz="4"/>
+              <w:right w:val="single" w:color="BBBBBB" w:sz="4"/>
+            </w:tcBorders>
+            <w:tcMar>
+              <w:top w:type="dxa" w:w="60"/>
+              <w:left w:type="dxa" w:w="100"/>
+              <w:bottom w:type="dxa" w:w="60"/>
+              <w:right w:type="dxa" w:w="100"/>
+            </w:tcMar>
+          </w:tcPr>
+          <w:p>
+            <w:r>
+              <w:rPr>
+                <w:b w:val="false"/>
+                <w:bCs w:val="false"/>
+                <w:sz w:val="20"/>
+                <w:szCs w:val="20"/>
+              </w:rPr>
+              <w:t xml:space="preserve">Desimal</w:t>
+            </w:r>
+          </w:p>
+        </w:tc>
+        <w:tc>
+          <w:tcPr>
+            <w:tcW w:type="dxa" w:w="4960"/>
+            <w:tcBorders>
+              <w:top w:val="single" w:color="BBBBBB" w:sz="4"/>
+              <w:left w:val="single" w:color="BBBBBB" w:sz="4"/>
+              <w:bottom w:val="single" w:color="BBBBBB" w:sz="4"/>
+              <w:right w:val="single" w:color="BBBBBB" w:sz="4"/>
+            </w:tcBorders>
+            <w:tcMar>
+              <w:top w:type="dxa" w:w="60"/>
+              <w:left w:type="dxa" w:w="100"/>
+              <w:bottom w:type="dxa" w:w="60"/>
+              <w:right w:type="dxa" w:w="100"/>
+            </w:tcMar>
+          </w:tcPr>
+          <w:p>
+            <w:r>
+              <w:rPr>
+                <w:b w:val="false"/>
+                <w:bCs w:val="false"/>
+                <w:sz w:val="20"/>
+                <w:szCs w:val="20"/>
+              </w:rPr>
+              <w:t xml:space="preserve">Quantity x Price, 16,08 sampai 1.991,04</w:t>
+            </w:r>
+          </w:p>
+        </w:tc>
+      </w:tr>
+    </w:tbl>
+    <w:p>
+      <w:pPr>
+        <w:spacing w:after="120"/>
+      </w:pPr>
+    </w:p>
+    <w:p>
+      <w:pPr>
         <w:spacing w:after="120"/>
       </w:pPr>
       <w:r>
-        <w:t xml:space="preserve">Kualitas data: tidak ada nilai kosong dan tidak ada ID duplikat di kedua tabel.</w:t>
+        <w:t xml:space="preserve">Kualitas data: tidak ada nilai kosong dan tidak ada ID duplikat di ketiga tabel. Seluruh CustomerID dan ProductID pada Transactions punya pasangan di tabel dimensi, dan TotalValue sama dengan Quantity x Price pada semua 1.000 baris.</w:t>
       </w:r>
     </w:p>
     <w:p>
@@ -3207,6 +3949,2500 @@
       </w:pPr>
       <w:r>
         <w:t xml:space="preserve">Seluruh produk: rata-rata harga 267,55; median 292,88; simpangan baku 143,22; minimum 16,08; maksimum 497,76.</w:t>
+      </w:r>
+    </w:p>
+    <w:p>
+      <w:pPr>
+        <w:pStyle w:val="Heading2"/>
+        <w:spacing w:after="120" w:before="240"/>
+      </w:pPr>
+      <w:r>
+        <w:t xml:space="preserve">4.3 Transaksi (1.000 baris)</w:t>
+      </w:r>
+    </w:p>
+    <w:tbl>
+      <w:tblPr>
+        <w:tblW w:type="dxa" w:w="9360"/>
+        <w:tblBorders>
+          <w:top w:val="single" w:color="auto" w:sz="4"/>
+          <w:left w:val="single" w:color="auto" w:sz="4"/>
+          <w:bottom w:val="single" w:color="auto" w:sz="4"/>
+          <w:right w:val="single" w:color="auto" w:sz="4"/>
+          <w:insideH w:val="single" w:color="auto" w:sz="4"/>
+          <w:insideV w:val="single" w:color="auto" w:sz="4"/>
+        </w:tblBorders>
+      </w:tblPr>
+      <w:tblGrid>
+        <w:gridCol w:w="4680"/>
+        <w:gridCol w:w="4680"/>
+      </w:tblGrid>
+      <w:tr>
+        <w:trPr>
+          <w:tblHeader/>
+        </w:trPr>
+        <w:tc>
+          <w:tcPr>
+            <w:tcW w:type="dxa" w:w="4680"/>
+            <w:tcBorders>
+              <w:top w:val="single" w:color="BBBBBB" w:sz="4"/>
+              <w:left w:val="single" w:color="BBBBBB" w:sz="4"/>
+              <w:bottom w:val="single" w:color="BBBBBB" w:sz="4"/>
+              <w:right w:val="single" w:color="BBBBBB" w:sz="4"/>
+            </w:tcBorders>
+            <w:shd w:fill="1F4E79" w:color="auto" w:val="clear"/>
+            <w:tcMar>
+              <w:top w:type="dxa" w:w="60"/>
+              <w:left w:type="dxa" w:w="100"/>
+              <w:bottom w:type="dxa" w:w="60"/>
+              <w:right w:type="dxa" w:w="100"/>
+            </w:tcMar>
+          </w:tcPr>
+          <w:p>
+            <w:r>
+              <w:rPr>
+                <w:b/>
+                <w:bCs/>
+                <w:color w:val="FFFFFF"/>
+                <w:sz w:val="20"/>
+                <w:szCs w:val="20"/>
+              </w:rPr>
+              <w:t xml:space="preserve">Ukuran</w:t>
+            </w:r>
+          </w:p>
+        </w:tc>
+        <w:tc>
+          <w:tcPr>
+            <w:tcW w:type="dxa" w:w="4680"/>
+            <w:tcBorders>
+              <w:top w:val="single" w:color="BBBBBB" w:sz="4"/>
+              <w:left w:val="single" w:color="BBBBBB" w:sz="4"/>
+              <w:bottom w:val="single" w:color="BBBBBB" w:sz="4"/>
+              <w:right w:val="single" w:color="BBBBBB" w:sz="4"/>
+            </w:tcBorders>
+            <w:shd w:fill="1F4E79" w:color="auto" w:val="clear"/>
+            <w:tcMar>
+              <w:top w:type="dxa" w:w="60"/>
+              <w:left w:type="dxa" w:w="100"/>
+              <w:bottom w:type="dxa" w:w="60"/>
+              <w:right w:type="dxa" w:w="100"/>
+            </w:tcMar>
+          </w:tcPr>
+          <w:p>
+            <w:r>
+              <w:rPr>
+                <w:b/>
+                <w:bCs/>
+                <w:color w:val="FFFFFF"/>
+                <w:sz w:val="20"/>
+                <w:szCs w:val="20"/>
+              </w:rPr>
+              <w:t xml:space="preserve">Nilai</w:t>
+            </w:r>
+          </w:p>
+        </w:tc>
+      </w:tr>
+      <w:tr>
+        <w:trPr>
+          <w:tblHeader w:val="false"/>
+        </w:trPr>
+        <w:tc>
+          <w:tcPr>
+            <w:tcW w:type="dxa" w:w="4680"/>
+            <w:tcBorders>
+              <w:top w:val="single" w:color="BBBBBB" w:sz="4"/>
+              <w:left w:val="single" w:color="BBBBBB" w:sz="4"/>
+              <w:bottom w:val="single" w:color="BBBBBB" w:sz="4"/>
+              <w:right w:val="single" w:color="BBBBBB" w:sz="4"/>
+            </w:tcBorders>
+            <w:tcMar>
+              <w:top w:type="dxa" w:w="60"/>
+              <w:left w:type="dxa" w:w="100"/>
+              <w:bottom w:type="dxa" w:w="60"/>
+              <w:right w:type="dxa" w:w="100"/>
+            </w:tcMar>
+          </w:tcPr>
+          <w:p>
+            <w:r>
+              <w:rPr>
+                <w:b w:val="false"/>
+                <w:bCs w:val="false"/>
+                <w:sz w:val="20"/>
+                <w:szCs w:val="20"/>
+              </w:rPr>
+              <w:t xml:space="preserve">Total revenue</w:t>
+            </w:r>
+          </w:p>
+        </w:tc>
+        <w:tc>
+          <w:tcPr>
+            <w:tcW w:type="dxa" w:w="4680"/>
+            <w:tcBorders>
+              <w:top w:val="single" w:color="BBBBBB" w:sz="4"/>
+              <w:left w:val="single" w:color="BBBBBB" w:sz="4"/>
+              <w:bottom w:val="single" w:color="BBBBBB" w:sz="4"/>
+              <w:right w:val="single" w:color="BBBBBB" w:sz="4"/>
+            </w:tcBorders>
+            <w:tcMar>
+              <w:top w:type="dxa" w:w="60"/>
+              <w:left w:type="dxa" w:w="100"/>
+              <w:bottom w:type="dxa" w:w="60"/>
+              <w:right w:type="dxa" w:w="100"/>
+            </w:tcMar>
+          </w:tcPr>
+          <w:p>
+            <w:r>
+              <w:rPr>
+                <w:b w:val="false"/>
+                <w:bCs w:val="false"/>
+                <w:sz w:val="20"/>
+                <w:szCs w:val="20"/>
+              </w:rPr>
+              <w:t xml:space="preserve">689.995,56</w:t>
+            </w:r>
+          </w:p>
+        </w:tc>
+      </w:tr>
+      <w:tr>
+        <w:trPr>
+          <w:tblHeader w:val="false"/>
+        </w:trPr>
+        <w:tc>
+          <w:tcPr>
+            <w:tcW w:type="dxa" w:w="4680"/>
+            <w:tcBorders>
+              <w:top w:val="single" w:color="BBBBBB" w:sz="4"/>
+              <w:left w:val="single" w:color="BBBBBB" w:sz="4"/>
+              <w:bottom w:val="single" w:color="BBBBBB" w:sz="4"/>
+              <w:right w:val="single" w:color="BBBBBB" w:sz="4"/>
+            </w:tcBorders>
+            <w:tcMar>
+              <w:top w:type="dxa" w:w="60"/>
+              <w:left w:type="dxa" w:w="100"/>
+              <w:bottom w:type="dxa" w:w="60"/>
+              <w:right w:type="dxa" w:w="100"/>
+            </w:tcMar>
+          </w:tcPr>
+          <w:p>
+            <w:r>
+              <w:rPr>
+                <w:b w:val="false"/>
+                <w:bCs w:val="false"/>
+                <w:sz w:val="20"/>
+                <w:szCs w:val="20"/>
+              </w:rPr>
+              <w:t xml:space="preserve">Total transaksi</w:t>
+            </w:r>
+          </w:p>
+        </w:tc>
+        <w:tc>
+          <w:tcPr>
+            <w:tcW w:type="dxa" w:w="4680"/>
+            <w:tcBorders>
+              <w:top w:val="single" w:color="BBBBBB" w:sz="4"/>
+              <w:left w:val="single" w:color="BBBBBB" w:sz="4"/>
+              <w:bottom w:val="single" w:color="BBBBBB" w:sz="4"/>
+              <w:right w:val="single" w:color="BBBBBB" w:sz="4"/>
+            </w:tcBorders>
+            <w:tcMar>
+              <w:top w:type="dxa" w:w="60"/>
+              <w:left w:type="dxa" w:w="100"/>
+              <w:bottom w:type="dxa" w:w="60"/>
+              <w:right w:type="dxa" w:w="100"/>
+            </w:tcMar>
+          </w:tcPr>
+          <w:p>
+            <w:r>
+              <w:rPr>
+                <w:b w:val="false"/>
+                <w:bCs w:val="false"/>
+                <w:sz w:val="20"/>
+                <w:szCs w:val="20"/>
+              </w:rPr>
+              <w:t xml:space="preserve">1.000</w:t>
+            </w:r>
+          </w:p>
+        </w:tc>
+      </w:tr>
+      <w:tr>
+        <w:trPr>
+          <w:tblHeader w:val="false"/>
+        </w:trPr>
+        <w:tc>
+          <w:tcPr>
+            <w:tcW w:type="dxa" w:w="4680"/>
+            <w:tcBorders>
+              <w:top w:val="single" w:color="BBBBBB" w:sz="4"/>
+              <w:left w:val="single" w:color="BBBBBB" w:sz="4"/>
+              <w:bottom w:val="single" w:color="BBBBBB" w:sz="4"/>
+              <w:right w:val="single" w:color="BBBBBB" w:sz="4"/>
+            </w:tcBorders>
+            <w:tcMar>
+              <w:top w:type="dxa" w:w="60"/>
+              <w:left w:type="dxa" w:w="100"/>
+              <w:bottom w:type="dxa" w:w="60"/>
+              <w:right w:type="dxa" w:w="100"/>
+            </w:tcMar>
+          </w:tcPr>
+          <w:p>
+            <w:r>
+              <w:rPr>
+                <w:b w:val="false"/>
+                <w:bCs w:val="false"/>
+                <w:sz w:val="20"/>
+                <w:szCs w:val="20"/>
+              </w:rPr>
+              <w:t xml:space="preserve">Pelanggan yang bertransaksi</w:t>
+            </w:r>
+          </w:p>
+        </w:tc>
+        <w:tc>
+          <w:tcPr>
+            <w:tcW w:type="dxa" w:w="4680"/>
+            <w:tcBorders>
+              <w:top w:val="single" w:color="BBBBBB" w:sz="4"/>
+              <w:left w:val="single" w:color="BBBBBB" w:sz="4"/>
+              <w:bottom w:val="single" w:color="BBBBBB" w:sz="4"/>
+              <w:right w:val="single" w:color="BBBBBB" w:sz="4"/>
+            </w:tcBorders>
+            <w:tcMar>
+              <w:top w:type="dxa" w:w="60"/>
+              <w:left w:type="dxa" w:w="100"/>
+              <w:bottom w:type="dxa" w:w="60"/>
+              <w:right w:type="dxa" w:w="100"/>
+            </w:tcMar>
+          </w:tcPr>
+          <w:p>
+            <w:r>
+              <w:rPr>
+                <w:b w:val="false"/>
+                <w:bCs w:val="false"/>
+                <w:sz w:val="20"/>
+                <w:szCs w:val="20"/>
+              </w:rPr>
+              <w:t xml:space="preserve">199 dari 200</w:t>
+            </w:r>
+          </w:p>
+        </w:tc>
+      </w:tr>
+      <w:tr>
+        <w:trPr>
+          <w:tblHeader w:val="false"/>
+        </w:trPr>
+        <w:tc>
+          <w:tcPr>
+            <w:tcW w:type="dxa" w:w="4680"/>
+            <w:tcBorders>
+              <w:top w:val="single" w:color="BBBBBB" w:sz="4"/>
+              <w:left w:val="single" w:color="BBBBBB" w:sz="4"/>
+              <w:bottom w:val="single" w:color="BBBBBB" w:sz="4"/>
+              <w:right w:val="single" w:color="BBBBBB" w:sz="4"/>
+            </w:tcBorders>
+            <w:tcMar>
+              <w:top w:type="dxa" w:w="60"/>
+              <w:left w:type="dxa" w:w="100"/>
+              <w:bottom w:type="dxa" w:w="60"/>
+              <w:right w:type="dxa" w:w="100"/>
+            </w:tcMar>
+          </w:tcPr>
+          <w:p>
+            <w:r>
+              <w:rPr>
+                <w:b w:val="false"/>
+                <w:bCs w:val="false"/>
+                <w:sz w:val="20"/>
+                <w:szCs w:val="20"/>
+              </w:rPr>
+              <w:t xml:space="preserve">Unit terjual</w:t>
+            </w:r>
+          </w:p>
+        </w:tc>
+        <w:tc>
+          <w:tcPr>
+            <w:tcW w:type="dxa" w:w="4680"/>
+            <w:tcBorders>
+              <w:top w:val="single" w:color="BBBBBB" w:sz="4"/>
+              <w:left w:val="single" w:color="BBBBBB" w:sz="4"/>
+              <w:bottom w:val="single" w:color="BBBBBB" w:sz="4"/>
+              <w:right w:val="single" w:color="BBBBBB" w:sz="4"/>
+            </w:tcBorders>
+            <w:tcMar>
+              <w:top w:type="dxa" w:w="60"/>
+              <w:left w:type="dxa" w:w="100"/>
+              <w:bottom w:type="dxa" w:w="60"/>
+              <w:right w:type="dxa" w:w="100"/>
+            </w:tcMar>
+          </w:tcPr>
+          <w:p>
+            <w:r>
+              <w:rPr>
+                <w:b w:val="false"/>
+                <w:bCs w:val="false"/>
+                <w:sz w:val="20"/>
+                <w:szCs w:val="20"/>
+              </w:rPr>
+              <w:t xml:space="preserve">2.537</w:t>
+            </w:r>
+          </w:p>
+        </w:tc>
+      </w:tr>
+      <w:tr>
+        <w:trPr>
+          <w:tblHeader w:val="false"/>
+        </w:trPr>
+        <w:tc>
+          <w:tcPr>
+            <w:tcW w:type="dxa" w:w="4680"/>
+            <w:tcBorders>
+              <w:top w:val="single" w:color="BBBBBB" w:sz="4"/>
+              <w:left w:val="single" w:color="BBBBBB" w:sz="4"/>
+              <w:bottom w:val="single" w:color="BBBBBB" w:sz="4"/>
+              <w:right w:val="single" w:color="BBBBBB" w:sz="4"/>
+            </w:tcBorders>
+            <w:tcMar>
+              <w:top w:type="dxa" w:w="60"/>
+              <w:left w:type="dxa" w:w="100"/>
+              <w:bottom w:type="dxa" w:w="60"/>
+              <w:right w:type="dxa" w:w="100"/>
+            </w:tcMar>
+          </w:tcPr>
+          <w:p>
+            <w:r>
+              <w:rPr>
+                <w:b w:val="false"/>
+                <w:bCs w:val="false"/>
+                <w:sz w:val="20"/>
+                <w:szCs w:val="20"/>
+              </w:rPr>
+              <w:t xml:space="preserve">Rata-rata nilai per transaksi</w:t>
+            </w:r>
+          </w:p>
+        </w:tc>
+        <w:tc>
+          <w:tcPr>
+            <w:tcW w:type="dxa" w:w="4680"/>
+            <w:tcBorders>
+              <w:top w:val="single" w:color="BBBBBB" w:sz="4"/>
+              <w:left w:val="single" w:color="BBBBBB" w:sz="4"/>
+              <w:bottom w:val="single" w:color="BBBBBB" w:sz="4"/>
+              <w:right w:val="single" w:color="BBBBBB" w:sz="4"/>
+            </w:tcBorders>
+            <w:tcMar>
+              <w:top w:type="dxa" w:w="60"/>
+              <w:left w:type="dxa" w:w="100"/>
+              <w:bottom w:type="dxa" w:w="60"/>
+              <w:right w:type="dxa" w:w="100"/>
+            </w:tcMar>
+          </w:tcPr>
+          <w:p>
+            <w:r>
+              <w:rPr>
+                <w:b w:val="false"/>
+                <w:bCs w:val="false"/>
+                <w:sz w:val="20"/>
+                <w:szCs w:val="20"/>
+              </w:rPr>
+              <w:t xml:space="preserve">690,00</w:t>
+            </w:r>
+          </w:p>
+        </w:tc>
+      </w:tr>
+    </w:tbl>
+    <w:p>
+      <w:pPr>
+        <w:spacing w:after="120"/>
+      </w:pPr>
+    </w:p>
+    <w:tbl>
+      <w:tblPr>
+        <w:tblW w:type="dxa" w:w="9360"/>
+        <w:tblBorders>
+          <w:top w:val="single" w:color="auto" w:sz="4"/>
+          <w:left w:val="single" w:color="auto" w:sz="4"/>
+          <w:bottom w:val="single" w:color="auto" w:sz="4"/>
+          <w:right w:val="single" w:color="auto" w:sz="4"/>
+          <w:insideH w:val="single" w:color="auto" w:sz="4"/>
+          <w:insideV w:val="single" w:color="auto" w:sz="4"/>
+        </w:tblBorders>
+      </w:tblPr>
+      <w:tblGrid>
+        <w:gridCol w:w="2340"/>
+        <w:gridCol w:w="2340"/>
+        <w:gridCol w:w="2340"/>
+        <w:gridCol w:w="2340"/>
+      </w:tblGrid>
+      <w:tr>
+        <w:trPr>
+          <w:tblHeader/>
+        </w:trPr>
+        <w:tc>
+          <w:tcPr>
+            <w:tcW w:type="dxa" w:w="2340"/>
+            <w:tcBorders>
+              <w:top w:val="single" w:color="BBBBBB" w:sz="4"/>
+              <w:left w:val="single" w:color="BBBBBB" w:sz="4"/>
+              <w:bottom w:val="single" w:color="BBBBBB" w:sz="4"/>
+              <w:right w:val="single" w:color="BBBBBB" w:sz="4"/>
+            </w:tcBorders>
+            <w:shd w:fill="1F4E79" w:color="auto" w:val="clear"/>
+            <w:tcMar>
+              <w:top w:type="dxa" w:w="60"/>
+              <w:left w:type="dxa" w:w="100"/>
+              <w:bottom w:type="dxa" w:w="60"/>
+              <w:right w:type="dxa" w:w="100"/>
+            </w:tcMar>
+          </w:tcPr>
+          <w:p>
+            <w:r>
+              <w:rPr>
+                <w:b/>
+                <w:bCs/>
+                <w:color w:val="FFFFFF"/>
+                <w:sz w:val="20"/>
+                <w:szCs w:val="20"/>
+              </w:rPr>
+              <w:t xml:space="preserve">Kategori</w:t>
+            </w:r>
+          </w:p>
+        </w:tc>
+        <w:tc>
+          <w:tcPr>
+            <w:tcW w:type="dxa" w:w="2340"/>
+            <w:tcBorders>
+              <w:top w:val="single" w:color="BBBBBB" w:sz="4"/>
+              <w:left w:val="single" w:color="BBBBBB" w:sz="4"/>
+              <w:bottom w:val="single" w:color="BBBBBB" w:sz="4"/>
+              <w:right w:val="single" w:color="BBBBBB" w:sz="4"/>
+            </w:tcBorders>
+            <w:shd w:fill="1F4E79" w:color="auto" w:val="clear"/>
+            <w:tcMar>
+              <w:top w:type="dxa" w:w="60"/>
+              <w:left w:type="dxa" w:w="100"/>
+              <w:bottom w:type="dxa" w:w="60"/>
+              <w:right w:type="dxa" w:w="100"/>
+            </w:tcMar>
+          </w:tcPr>
+          <w:p>
+            <w:r>
+              <w:rPr>
+                <w:b/>
+                <w:bCs/>
+                <w:color w:val="FFFFFF"/>
+                <w:sz w:val="20"/>
+                <w:szCs w:val="20"/>
+              </w:rPr>
+              <w:t xml:space="preserve">Revenue</w:t>
+            </w:r>
+          </w:p>
+        </w:tc>
+        <w:tc>
+          <w:tcPr>
+            <w:tcW w:type="dxa" w:w="2340"/>
+            <w:tcBorders>
+              <w:top w:val="single" w:color="BBBBBB" w:sz="4"/>
+              <w:left w:val="single" w:color="BBBBBB" w:sz="4"/>
+              <w:bottom w:val="single" w:color="BBBBBB" w:sz="4"/>
+              <w:right w:val="single" w:color="BBBBBB" w:sz="4"/>
+            </w:tcBorders>
+            <w:shd w:fill="1F4E79" w:color="auto" w:val="clear"/>
+            <w:tcMar>
+              <w:top w:type="dxa" w:w="60"/>
+              <w:left w:type="dxa" w:w="100"/>
+              <w:bottom w:type="dxa" w:w="60"/>
+              <w:right w:type="dxa" w:w="100"/>
+            </w:tcMar>
+          </w:tcPr>
+          <w:p>
+            <w:r>
+              <w:rPr>
+                <w:b/>
+                <w:bCs/>
+                <w:color w:val="FFFFFF"/>
+                <w:sz w:val="20"/>
+                <w:szCs w:val="20"/>
+              </w:rPr>
+              <w:t xml:space="preserve">Porsi</w:t>
+            </w:r>
+          </w:p>
+        </w:tc>
+        <w:tc>
+          <w:tcPr>
+            <w:tcW w:type="dxa" w:w="2340"/>
+            <w:tcBorders>
+              <w:top w:val="single" w:color="BBBBBB" w:sz="4"/>
+              <w:left w:val="single" w:color="BBBBBB" w:sz="4"/>
+              <w:bottom w:val="single" w:color="BBBBBB" w:sz="4"/>
+              <w:right w:val="single" w:color="BBBBBB" w:sz="4"/>
+            </w:tcBorders>
+            <w:shd w:fill="1F4E79" w:color="auto" w:val="clear"/>
+            <w:tcMar>
+              <w:top w:type="dxa" w:w="60"/>
+              <w:left w:type="dxa" w:w="100"/>
+              <w:bottom w:type="dxa" w:w="60"/>
+              <w:right w:type="dxa" w:w="100"/>
+            </w:tcMar>
+          </w:tcPr>
+          <w:p>
+            <w:r>
+              <w:rPr>
+                <w:b/>
+                <w:bCs/>
+                <w:color w:val="FFFFFF"/>
+                <w:sz w:val="20"/>
+                <w:szCs w:val="20"/>
+              </w:rPr>
+              <w:t xml:space="preserve">Transaksi</w:t>
+            </w:r>
+          </w:p>
+        </w:tc>
+      </w:tr>
+      <w:tr>
+        <w:trPr>
+          <w:tblHeader w:val="false"/>
+        </w:trPr>
+        <w:tc>
+          <w:tcPr>
+            <w:tcW w:type="dxa" w:w="2340"/>
+            <w:tcBorders>
+              <w:top w:val="single" w:color="BBBBBB" w:sz="4"/>
+              <w:left w:val="single" w:color="BBBBBB" w:sz="4"/>
+              <w:bottom w:val="single" w:color="BBBBBB" w:sz="4"/>
+              <w:right w:val="single" w:color="BBBBBB" w:sz="4"/>
+            </w:tcBorders>
+            <w:tcMar>
+              <w:top w:type="dxa" w:w="60"/>
+              <w:left w:type="dxa" w:w="100"/>
+              <w:bottom w:type="dxa" w:w="60"/>
+              <w:right w:type="dxa" w:w="100"/>
+            </w:tcMar>
+          </w:tcPr>
+          <w:p>
+            <w:r>
+              <w:rPr>
+                <w:b w:val="false"/>
+                <w:bCs w:val="false"/>
+                <w:sz w:val="20"/>
+                <w:szCs w:val="20"/>
+              </w:rPr>
+              <w:t xml:space="preserve">Books</w:t>
+            </w:r>
+          </w:p>
+        </w:tc>
+        <w:tc>
+          <w:tcPr>
+            <w:tcW w:type="dxa" w:w="2340"/>
+            <w:tcBorders>
+              <w:top w:val="single" w:color="BBBBBB" w:sz="4"/>
+              <w:left w:val="single" w:color="BBBBBB" w:sz="4"/>
+              <w:bottom w:val="single" w:color="BBBBBB" w:sz="4"/>
+              <w:right w:val="single" w:color="BBBBBB" w:sz="4"/>
+            </w:tcBorders>
+            <w:tcMar>
+              <w:top w:type="dxa" w:w="60"/>
+              <w:left w:type="dxa" w:w="100"/>
+              <w:bottom w:type="dxa" w:w="60"/>
+              <w:right w:type="dxa" w:w="100"/>
+            </w:tcMar>
+          </w:tcPr>
+          <w:p>
+            <w:r>
+              <w:rPr>
+                <w:b w:val="false"/>
+                <w:bCs w:val="false"/>
+                <w:sz w:val="20"/>
+                <w:szCs w:val="20"/>
+              </w:rPr>
+              <w:t xml:space="preserve">192.147</w:t>
+            </w:r>
+          </w:p>
+        </w:tc>
+        <w:tc>
+          <w:tcPr>
+            <w:tcW w:type="dxa" w:w="2340"/>
+            <w:tcBorders>
+              <w:top w:val="single" w:color="BBBBBB" w:sz="4"/>
+              <w:left w:val="single" w:color="BBBBBB" w:sz="4"/>
+              <w:bottom w:val="single" w:color="BBBBBB" w:sz="4"/>
+              <w:right w:val="single" w:color="BBBBBB" w:sz="4"/>
+            </w:tcBorders>
+            <w:tcMar>
+              <w:top w:type="dxa" w:w="60"/>
+              <w:left w:type="dxa" w:w="100"/>
+              <w:bottom w:type="dxa" w:w="60"/>
+              <w:right w:type="dxa" w:w="100"/>
+            </w:tcMar>
+          </w:tcPr>
+          <w:p>
+            <w:r>
+              <w:rPr>
+                <w:b w:val="false"/>
+                <w:bCs w:val="false"/>
+                <w:sz w:val="20"/>
+                <w:szCs w:val="20"/>
+              </w:rPr>
+              <w:t xml:space="preserve">27,8%</w:t>
+            </w:r>
+          </w:p>
+        </w:tc>
+        <w:tc>
+          <w:tcPr>
+            <w:tcW w:type="dxa" w:w="2340"/>
+            <w:tcBorders>
+              <w:top w:val="single" w:color="BBBBBB" w:sz="4"/>
+              <w:left w:val="single" w:color="BBBBBB" w:sz="4"/>
+              <w:bottom w:val="single" w:color="BBBBBB" w:sz="4"/>
+              <w:right w:val="single" w:color="BBBBBB" w:sz="4"/>
+            </w:tcBorders>
+            <w:tcMar>
+              <w:top w:type="dxa" w:w="60"/>
+              <w:left w:type="dxa" w:w="100"/>
+              <w:bottom w:type="dxa" w:w="60"/>
+              <w:right w:type="dxa" w:w="100"/>
+            </w:tcMar>
+          </w:tcPr>
+          <w:p>
+            <w:r>
+              <w:rPr>
+                <w:b w:val="false"/>
+                <w:bCs w:val="false"/>
+                <w:sz w:val="20"/>
+                <w:szCs w:val="20"/>
+              </w:rPr>
+              <w:t xml:space="preserve">270</w:t>
+            </w:r>
+          </w:p>
+        </w:tc>
+      </w:tr>
+      <w:tr>
+        <w:trPr>
+          <w:tblHeader w:val="false"/>
+        </w:trPr>
+        <w:tc>
+          <w:tcPr>
+            <w:tcW w:type="dxa" w:w="2340"/>
+            <w:tcBorders>
+              <w:top w:val="single" w:color="BBBBBB" w:sz="4"/>
+              <w:left w:val="single" w:color="BBBBBB" w:sz="4"/>
+              <w:bottom w:val="single" w:color="BBBBBB" w:sz="4"/>
+              <w:right w:val="single" w:color="BBBBBB" w:sz="4"/>
+            </w:tcBorders>
+            <w:tcMar>
+              <w:top w:type="dxa" w:w="60"/>
+              <w:left w:type="dxa" w:w="100"/>
+              <w:bottom w:type="dxa" w:w="60"/>
+              <w:right w:type="dxa" w:w="100"/>
+            </w:tcMar>
+          </w:tcPr>
+          <w:p>
+            <w:r>
+              <w:rPr>
+                <w:b w:val="false"/>
+                <w:bCs w:val="false"/>
+                <w:sz w:val="20"/>
+                <w:szCs w:val="20"/>
+              </w:rPr>
+              <w:t xml:space="preserve">Electronics</w:t>
+            </w:r>
+          </w:p>
+        </w:tc>
+        <w:tc>
+          <w:tcPr>
+            <w:tcW w:type="dxa" w:w="2340"/>
+            <w:tcBorders>
+              <w:top w:val="single" w:color="BBBBBB" w:sz="4"/>
+              <w:left w:val="single" w:color="BBBBBB" w:sz="4"/>
+              <w:bottom w:val="single" w:color="BBBBBB" w:sz="4"/>
+              <w:right w:val="single" w:color="BBBBBB" w:sz="4"/>
+            </w:tcBorders>
+            <w:tcMar>
+              <w:top w:type="dxa" w:w="60"/>
+              <w:left w:type="dxa" w:w="100"/>
+              <w:bottom w:type="dxa" w:w="60"/>
+              <w:right w:type="dxa" w:w="100"/>
+            </w:tcMar>
+          </w:tcPr>
+          <w:p>
+            <w:r>
+              <w:rPr>
+                <w:b w:val="false"/>
+                <w:bCs w:val="false"/>
+                <w:sz w:val="20"/>
+                <w:szCs w:val="20"/>
+              </w:rPr>
+              <w:t xml:space="preserve">180.784</w:t>
+            </w:r>
+          </w:p>
+        </w:tc>
+        <w:tc>
+          <w:tcPr>
+            <w:tcW w:type="dxa" w:w="2340"/>
+            <w:tcBorders>
+              <w:top w:val="single" w:color="BBBBBB" w:sz="4"/>
+              <w:left w:val="single" w:color="BBBBBB" w:sz="4"/>
+              <w:bottom w:val="single" w:color="BBBBBB" w:sz="4"/>
+              <w:right w:val="single" w:color="BBBBBB" w:sz="4"/>
+            </w:tcBorders>
+            <w:tcMar>
+              <w:top w:type="dxa" w:w="60"/>
+              <w:left w:type="dxa" w:w="100"/>
+              <w:bottom w:type="dxa" w:w="60"/>
+              <w:right w:type="dxa" w:w="100"/>
+            </w:tcMar>
+          </w:tcPr>
+          <w:p>
+            <w:r>
+              <w:rPr>
+                <w:b w:val="false"/>
+                <w:bCs w:val="false"/>
+                <w:sz w:val="20"/>
+                <w:szCs w:val="20"/>
+              </w:rPr>
+              <w:t xml:space="preserve">26,2%</w:t>
+            </w:r>
+          </w:p>
+        </w:tc>
+        <w:tc>
+          <w:tcPr>
+            <w:tcW w:type="dxa" w:w="2340"/>
+            <w:tcBorders>
+              <w:top w:val="single" w:color="BBBBBB" w:sz="4"/>
+              <w:left w:val="single" w:color="BBBBBB" w:sz="4"/>
+              <w:bottom w:val="single" w:color="BBBBBB" w:sz="4"/>
+              <w:right w:val="single" w:color="BBBBBB" w:sz="4"/>
+            </w:tcBorders>
+            <w:tcMar>
+              <w:top w:type="dxa" w:w="60"/>
+              <w:left w:type="dxa" w:w="100"/>
+              <w:bottom w:type="dxa" w:w="60"/>
+              <w:right w:type="dxa" w:w="100"/>
+            </w:tcMar>
+          </w:tcPr>
+          <w:p>
+            <w:r>
+              <w:rPr>
+                <w:b w:val="false"/>
+                <w:bCs w:val="false"/>
+                <w:sz w:val="20"/>
+                <w:szCs w:val="20"/>
+              </w:rPr>
+              <w:t xml:space="preserve">254</w:t>
+            </w:r>
+          </w:p>
+        </w:tc>
+      </w:tr>
+      <w:tr>
+        <w:trPr>
+          <w:tblHeader w:val="false"/>
+        </w:trPr>
+        <w:tc>
+          <w:tcPr>
+            <w:tcW w:type="dxa" w:w="2340"/>
+            <w:tcBorders>
+              <w:top w:val="single" w:color="BBBBBB" w:sz="4"/>
+              <w:left w:val="single" w:color="BBBBBB" w:sz="4"/>
+              <w:bottom w:val="single" w:color="BBBBBB" w:sz="4"/>
+              <w:right w:val="single" w:color="BBBBBB" w:sz="4"/>
+            </w:tcBorders>
+            <w:tcMar>
+              <w:top w:type="dxa" w:w="60"/>
+              <w:left w:type="dxa" w:w="100"/>
+              <w:bottom w:type="dxa" w:w="60"/>
+              <w:right w:type="dxa" w:w="100"/>
+            </w:tcMar>
+          </w:tcPr>
+          <w:p>
+            <w:r>
+              <w:rPr>
+                <w:b w:val="false"/>
+                <w:bCs w:val="false"/>
+                <w:sz w:val="20"/>
+                <w:szCs w:val="20"/>
+              </w:rPr>
+              <w:t xml:space="preserve">Clothing</w:t>
+            </w:r>
+          </w:p>
+        </w:tc>
+        <w:tc>
+          <w:tcPr>
+            <w:tcW w:type="dxa" w:w="2340"/>
+            <w:tcBorders>
+              <w:top w:val="single" w:color="BBBBBB" w:sz="4"/>
+              <w:left w:val="single" w:color="BBBBBB" w:sz="4"/>
+              <w:bottom w:val="single" w:color="BBBBBB" w:sz="4"/>
+              <w:right w:val="single" w:color="BBBBBB" w:sz="4"/>
+            </w:tcBorders>
+            <w:tcMar>
+              <w:top w:type="dxa" w:w="60"/>
+              <w:left w:type="dxa" w:w="100"/>
+              <w:bottom w:type="dxa" w:w="60"/>
+              <w:right w:type="dxa" w:w="100"/>
+            </w:tcMar>
+          </w:tcPr>
+          <w:p>
+            <w:r>
+              <w:rPr>
+                <w:b w:val="false"/>
+                <w:bCs w:val="false"/>
+                <w:sz w:val="20"/>
+                <w:szCs w:val="20"/>
+              </w:rPr>
+              <w:t xml:space="preserve">166.171</w:t>
+            </w:r>
+          </w:p>
+        </w:tc>
+        <w:tc>
+          <w:tcPr>
+            <w:tcW w:type="dxa" w:w="2340"/>
+            <w:tcBorders>
+              <w:top w:val="single" w:color="BBBBBB" w:sz="4"/>
+              <w:left w:val="single" w:color="BBBBBB" w:sz="4"/>
+              <w:bottom w:val="single" w:color="BBBBBB" w:sz="4"/>
+              <w:right w:val="single" w:color="BBBBBB" w:sz="4"/>
+            </w:tcBorders>
+            <w:tcMar>
+              <w:top w:type="dxa" w:w="60"/>
+              <w:left w:type="dxa" w:w="100"/>
+              <w:bottom w:type="dxa" w:w="60"/>
+              <w:right w:type="dxa" w:w="100"/>
+            </w:tcMar>
+          </w:tcPr>
+          <w:p>
+            <w:r>
+              <w:rPr>
+                <w:b w:val="false"/>
+                <w:bCs w:val="false"/>
+                <w:sz w:val="20"/>
+                <w:szCs w:val="20"/>
+              </w:rPr>
+              <w:t xml:space="preserve">24,1%</w:t>
+            </w:r>
+          </w:p>
+        </w:tc>
+        <w:tc>
+          <w:tcPr>
+            <w:tcW w:type="dxa" w:w="2340"/>
+            <w:tcBorders>
+              <w:top w:val="single" w:color="BBBBBB" w:sz="4"/>
+              <w:left w:val="single" w:color="BBBBBB" w:sz="4"/>
+              <w:bottom w:val="single" w:color="BBBBBB" w:sz="4"/>
+              <w:right w:val="single" w:color="BBBBBB" w:sz="4"/>
+            </w:tcBorders>
+            <w:tcMar>
+              <w:top w:type="dxa" w:w="60"/>
+              <w:left w:type="dxa" w:w="100"/>
+              <w:bottom w:type="dxa" w:w="60"/>
+              <w:right w:type="dxa" w:w="100"/>
+            </w:tcMar>
+          </w:tcPr>
+          <w:p>
+            <w:r>
+              <w:rPr>
+                <w:b w:val="false"/>
+                <w:bCs w:val="false"/>
+                <w:sz w:val="20"/>
+                <w:szCs w:val="20"/>
+              </w:rPr>
+              <w:t xml:space="preserve">228</w:t>
+            </w:r>
+          </w:p>
+        </w:tc>
+      </w:tr>
+      <w:tr>
+        <w:trPr>
+          <w:tblHeader w:val="false"/>
+        </w:trPr>
+        <w:tc>
+          <w:tcPr>
+            <w:tcW w:type="dxa" w:w="2340"/>
+            <w:tcBorders>
+              <w:top w:val="single" w:color="BBBBBB" w:sz="4"/>
+              <w:left w:val="single" w:color="BBBBBB" w:sz="4"/>
+              <w:bottom w:val="single" w:color="BBBBBB" w:sz="4"/>
+              <w:right w:val="single" w:color="BBBBBB" w:sz="4"/>
+            </w:tcBorders>
+            <w:tcMar>
+              <w:top w:type="dxa" w:w="60"/>
+              <w:left w:type="dxa" w:w="100"/>
+              <w:bottom w:type="dxa" w:w="60"/>
+              <w:right w:type="dxa" w:w="100"/>
+            </w:tcMar>
+          </w:tcPr>
+          <w:p>
+            <w:r>
+              <w:rPr>
+                <w:b w:val="false"/>
+                <w:bCs w:val="false"/>
+                <w:sz w:val="20"/>
+                <w:szCs w:val="20"/>
+              </w:rPr>
+              <w:t xml:space="preserve">Home Decor</w:t>
+            </w:r>
+          </w:p>
+        </w:tc>
+        <w:tc>
+          <w:tcPr>
+            <w:tcW w:type="dxa" w:w="2340"/>
+            <w:tcBorders>
+              <w:top w:val="single" w:color="BBBBBB" w:sz="4"/>
+              <w:left w:val="single" w:color="BBBBBB" w:sz="4"/>
+              <w:bottom w:val="single" w:color="BBBBBB" w:sz="4"/>
+              <w:right w:val="single" w:color="BBBBBB" w:sz="4"/>
+            </w:tcBorders>
+            <w:tcMar>
+              <w:top w:type="dxa" w:w="60"/>
+              <w:left w:type="dxa" w:w="100"/>
+              <w:bottom w:type="dxa" w:w="60"/>
+              <w:right w:type="dxa" w:w="100"/>
+            </w:tcMar>
+          </w:tcPr>
+          <w:p>
+            <w:r>
+              <w:rPr>
+                <w:b w:val="false"/>
+                <w:bCs w:val="false"/>
+                <w:sz w:val="20"/>
+                <w:szCs w:val="20"/>
+              </w:rPr>
+              <w:t xml:space="preserve">150.894</w:t>
+            </w:r>
+          </w:p>
+        </w:tc>
+        <w:tc>
+          <w:tcPr>
+            <w:tcW w:type="dxa" w:w="2340"/>
+            <w:tcBorders>
+              <w:top w:val="single" w:color="BBBBBB" w:sz="4"/>
+              <w:left w:val="single" w:color="BBBBBB" w:sz="4"/>
+              <w:bottom w:val="single" w:color="BBBBBB" w:sz="4"/>
+              <w:right w:val="single" w:color="BBBBBB" w:sz="4"/>
+            </w:tcBorders>
+            <w:tcMar>
+              <w:top w:type="dxa" w:w="60"/>
+              <w:left w:type="dxa" w:w="100"/>
+              <w:bottom w:type="dxa" w:w="60"/>
+              <w:right w:type="dxa" w:w="100"/>
+            </w:tcMar>
+          </w:tcPr>
+          <w:p>
+            <w:r>
+              <w:rPr>
+                <w:b w:val="false"/>
+                <w:bCs w:val="false"/>
+                <w:sz w:val="20"/>
+                <w:szCs w:val="20"/>
+              </w:rPr>
+              <w:t xml:space="preserve">21,9%</w:t>
+            </w:r>
+          </w:p>
+        </w:tc>
+        <w:tc>
+          <w:tcPr>
+            <w:tcW w:type="dxa" w:w="2340"/>
+            <w:tcBorders>
+              <w:top w:val="single" w:color="BBBBBB" w:sz="4"/>
+              <w:left w:val="single" w:color="BBBBBB" w:sz="4"/>
+              <w:bottom w:val="single" w:color="BBBBBB" w:sz="4"/>
+              <w:right w:val="single" w:color="BBBBBB" w:sz="4"/>
+            </w:tcBorders>
+            <w:tcMar>
+              <w:top w:type="dxa" w:w="60"/>
+              <w:left w:type="dxa" w:w="100"/>
+              <w:bottom w:type="dxa" w:w="60"/>
+              <w:right w:type="dxa" w:w="100"/>
+            </w:tcMar>
+          </w:tcPr>
+          <w:p>
+            <w:r>
+              <w:rPr>
+                <w:b w:val="false"/>
+                <w:bCs w:val="false"/>
+                <w:sz w:val="20"/>
+                <w:szCs w:val="20"/>
+              </w:rPr>
+              <w:t xml:space="preserve">248</w:t>
+            </w:r>
+          </w:p>
+        </w:tc>
+      </w:tr>
+    </w:tbl>
+    <w:p>
+      <w:pPr>
+        <w:spacing w:after="120"/>
+      </w:pPr>
+    </w:p>
+    <w:tbl>
+      <w:tblPr>
+        <w:tblW w:type="dxa" w:w="9360"/>
+        <w:tblBorders>
+          <w:top w:val="single" w:color="auto" w:sz="4"/>
+          <w:left w:val="single" w:color="auto" w:sz="4"/>
+          <w:bottom w:val="single" w:color="auto" w:sz="4"/>
+          <w:right w:val="single" w:color="auto" w:sz="4"/>
+          <w:insideH w:val="single" w:color="auto" w:sz="4"/>
+          <w:insideV w:val="single" w:color="auto" w:sz="4"/>
+        </w:tblBorders>
+      </w:tblPr>
+      <w:tblGrid>
+        <w:gridCol w:w="2340"/>
+        <w:gridCol w:w="2340"/>
+        <w:gridCol w:w="2340"/>
+        <w:gridCol w:w="2340"/>
+      </w:tblGrid>
+      <w:tr>
+        <w:trPr>
+          <w:tblHeader/>
+        </w:trPr>
+        <w:tc>
+          <w:tcPr>
+            <w:tcW w:type="dxa" w:w="2340"/>
+            <w:tcBorders>
+              <w:top w:val="single" w:color="BBBBBB" w:sz="4"/>
+              <w:left w:val="single" w:color="BBBBBB" w:sz="4"/>
+              <w:bottom w:val="single" w:color="BBBBBB" w:sz="4"/>
+              <w:right w:val="single" w:color="BBBBBB" w:sz="4"/>
+            </w:tcBorders>
+            <w:shd w:fill="1F4E79" w:color="auto" w:val="clear"/>
+            <w:tcMar>
+              <w:top w:type="dxa" w:w="60"/>
+              <w:left w:type="dxa" w:w="100"/>
+              <w:bottom w:type="dxa" w:w="60"/>
+              <w:right w:type="dxa" w:w="100"/>
+            </w:tcMar>
+          </w:tcPr>
+          <w:p>
+            <w:r>
+              <w:rPr>
+                <w:b/>
+                <w:bCs/>
+                <w:color w:val="FFFFFF"/>
+                <w:sz w:val="20"/>
+                <w:szCs w:val="20"/>
+              </w:rPr>
+              <w:t xml:space="preserve">Wilayah</w:t>
+            </w:r>
+          </w:p>
+        </w:tc>
+        <w:tc>
+          <w:tcPr>
+            <w:tcW w:type="dxa" w:w="2340"/>
+            <w:tcBorders>
+              <w:top w:val="single" w:color="BBBBBB" w:sz="4"/>
+              <w:left w:val="single" w:color="BBBBBB" w:sz="4"/>
+              <w:bottom w:val="single" w:color="BBBBBB" w:sz="4"/>
+              <w:right w:val="single" w:color="BBBBBB" w:sz="4"/>
+            </w:tcBorders>
+            <w:shd w:fill="1F4E79" w:color="auto" w:val="clear"/>
+            <w:tcMar>
+              <w:top w:type="dxa" w:w="60"/>
+              <w:left w:type="dxa" w:w="100"/>
+              <w:bottom w:type="dxa" w:w="60"/>
+              <w:right w:type="dxa" w:w="100"/>
+            </w:tcMar>
+          </w:tcPr>
+          <w:p>
+            <w:r>
+              <w:rPr>
+                <w:b/>
+                <w:bCs/>
+                <w:color w:val="FFFFFF"/>
+                <w:sz w:val="20"/>
+                <w:szCs w:val="20"/>
+              </w:rPr>
+              <w:t xml:space="preserve">Revenue</w:t>
+            </w:r>
+          </w:p>
+        </w:tc>
+        <w:tc>
+          <w:tcPr>
+            <w:tcW w:type="dxa" w:w="2340"/>
+            <w:tcBorders>
+              <w:top w:val="single" w:color="BBBBBB" w:sz="4"/>
+              <w:left w:val="single" w:color="BBBBBB" w:sz="4"/>
+              <w:bottom w:val="single" w:color="BBBBBB" w:sz="4"/>
+              <w:right w:val="single" w:color="BBBBBB" w:sz="4"/>
+            </w:tcBorders>
+            <w:shd w:fill="1F4E79" w:color="auto" w:val="clear"/>
+            <w:tcMar>
+              <w:top w:type="dxa" w:w="60"/>
+              <w:left w:type="dxa" w:w="100"/>
+              <w:bottom w:type="dxa" w:w="60"/>
+              <w:right w:type="dxa" w:w="100"/>
+            </w:tcMar>
+          </w:tcPr>
+          <w:p>
+            <w:r>
+              <w:rPr>
+                <w:b/>
+                <w:bCs/>
+                <w:color w:val="FFFFFF"/>
+                <w:sz w:val="20"/>
+                <w:szCs w:val="20"/>
+              </w:rPr>
+              <w:t xml:space="preserve">Porsi</w:t>
+            </w:r>
+          </w:p>
+        </w:tc>
+        <w:tc>
+          <w:tcPr>
+            <w:tcW w:type="dxa" w:w="2340"/>
+            <w:tcBorders>
+              <w:top w:val="single" w:color="BBBBBB" w:sz="4"/>
+              <w:left w:val="single" w:color="BBBBBB" w:sz="4"/>
+              <w:bottom w:val="single" w:color="BBBBBB" w:sz="4"/>
+              <w:right w:val="single" w:color="BBBBBB" w:sz="4"/>
+            </w:tcBorders>
+            <w:shd w:fill="1F4E79" w:color="auto" w:val="clear"/>
+            <w:tcMar>
+              <w:top w:type="dxa" w:w="60"/>
+              <w:left w:type="dxa" w:w="100"/>
+              <w:bottom w:type="dxa" w:w="60"/>
+              <w:right w:type="dxa" w:w="100"/>
+            </w:tcMar>
+          </w:tcPr>
+          <w:p>
+            <w:r>
+              <w:rPr>
+                <w:b/>
+                <w:bCs/>
+                <w:color w:val="FFFFFF"/>
+                <w:sz w:val="20"/>
+                <w:szCs w:val="20"/>
+              </w:rPr>
+              <w:t xml:space="preserve">Revenue/pelanggan</w:t>
+            </w:r>
+          </w:p>
+        </w:tc>
+      </w:tr>
+      <w:tr>
+        <w:trPr>
+          <w:tblHeader w:val="false"/>
+        </w:trPr>
+        <w:tc>
+          <w:tcPr>
+            <w:tcW w:type="dxa" w:w="2340"/>
+            <w:tcBorders>
+              <w:top w:val="single" w:color="BBBBBB" w:sz="4"/>
+              <w:left w:val="single" w:color="BBBBBB" w:sz="4"/>
+              <w:bottom w:val="single" w:color="BBBBBB" w:sz="4"/>
+              <w:right w:val="single" w:color="BBBBBB" w:sz="4"/>
+            </w:tcBorders>
+            <w:tcMar>
+              <w:top w:type="dxa" w:w="60"/>
+              <w:left w:type="dxa" w:w="100"/>
+              <w:bottom w:type="dxa" w:w="60"/>
+              <w:right w:type="dxa" w:w="100"/>
+            </w:tcMar>
+          </w:tcPr>
+          <w:p>
+            <w:r>
+              <w:rPr>
+                <w:b w:val="false"/>
+                <w:bCs w:val="false"/>
+                <w:sz w:val="20"/>
+                <w:szCs w:val="20"/>
+              </w:rPr>
+              <w:t xml:space="preserve">South America</w:t>
+            </w:r>
+          </w:p>
+        </w:tc>
+        <w:tc>
+          <w:tcPr>
+            <w:tcW w:type="dxa" w:w="2340"/>
+            <w:tcBorders>
+              <w:top w:val="single" w:color="BBBBBB" w:sz="4"/>
+              <w:left w:val="single" w:color="BBBBBB" w:sz="4"/>
+              <w:bottom w:val="single" w:color="BBBBBB" w:sz="4"/>
+              <w:right w:val="single" w:color="BBBBBB" w:sz="4"/>
+            </w:tcBorders>
+            <w:tcMar>
+              <w:top w:type="dxa" w:w="60"/>
+              <w:left w:type="dxa" w:w="100"/>
+              <w:bottom w:type="dxa" w:w="60"/>
+              <w:right w:type="dxa" w:w="100"/>
+            </w:tcMar>
+          </w:tcPr>
+          <w:p>
+            <w:r>
+              <w:rPr>
+                <w:b w:val="false"/>
+                <w:bCs w:val="false"/>
+                <w:sz w:val="20"/>
+                <w:szCs w:val="20"/>
+              </w:rPr>
+              <w:t xml:space="preserve">219.353</w:t>
+            </w:r>
+          </w:p>
+        </w:tc>
+        <w:tc>
+          <w:tcPr>
+            <w:tcW w:type="dxa" w:w="2340"/>
+            <w:tcBorders>
+              <w:top w:val="single" w:color="BBBBBB" w:sz="4"/>
+              <w:left w:val="single" w:color="BBBBBB" w:sz="4"/>
+              <w:bottom w:val="single" w:color="BBBBBB" w:sz="4"/>
+              <w:right w:val="single" w:color="BBBBBB" w:sz="4"/>
+            </w:tcBorders>
+            <w:tcMar>
+              <w:top w:type="dxa" w:w="60"/>
+              <w:left w:type="dxa" w:w="100"/>
+              <w:bottom w:type="dxa" w:w="60"/>
+              <w:right w:type="dxa" w:w="100"/>
+            </w:tcMar>
+          </w:tcPr>
+          <w:p>
+            <w:r>
+              <w:rPr>
+                <w:b w:val="false"/>
+                <w:bCs w:val="false"/>
+                <w:sz w:val="20"/>
+                <w:szCs w:val="20"/>
+              </w:rPr>
+              <w:t xml:space="preserve">31,8%</w:t>
+            </w:r>
+          </w:p>
+        </w:tc>
+        <w:tc>
+          <w:tcPr>
+            <w:tcW w:type="dxa" w:w="2340"/>
+            <w:tcBorders>
+              <w:top w:val="single" w:color="BBBBBB" w:sz="4"/>
+              <w:left w:val="single" w:color="BBBBBB" w:sz="4"/>
+              <w:bottom w:val="single" w:color="BBBBBB" w:sz="4"/>
+              <w:right w:val="single" w:color="BBBBBB" w:sz="4"/>
+            </w:tcBorders>
+            <w:tcMar>
+              <w:top w:type="dxa" w:w="60"/>
+              <w:left w:type="dxa" w:w="100"/>
+              <w:bottom w:type="dxa" w:w="60"/>
+              <w:right w:type="dxa" w:w="100"/>
+            </w:tcMar>
+          </w:tcPr>
+          <w:p>
+            <w:r>
+              <w:rPr>
+                <w:b w:val="false"/>
+                <w:bCs w:val="false"/>
+                <w:sz w:val="20"/>
+                <w:szCs w:val="20"/>
+              </w:rPr>
+              <w:t xml:space="preserve">3.718</w:t>
+            </w:r>
+          </w:p>
+        </w:tc>
+      </w:tr>
+      <w:tr>
+        <w:trPr>
+          <w:tblHeader w:val="false"/>
+        </w:trPr>
+        <w:tc>
+          <w:tcPr>
+            <w:tcW w:type="dxa" w:w="2340"/>
+            <w:tcBorders>
+              <w:top w:val="single" w:color="BBBBBB" w:sz="4"/>
+              <w:left w:val="single" w:color="BBBBBB" w:sz="4"/>
+              <w:bottom w:val="single" w:color="BBBBBB" w:sz="4"/>
+              <w:right w:val="single" w:color="BBBBBB" w:sz="4"/>
+            </w:tcBorders>
+            <w:tcMar>
+              <w:top w:type="dxa" w:w="60"/>
+              <w:left w:type="dxa" w:w="100"/>
+              <w:bottom w:type="dxa" w:w="60"/>
+              <w:right w:type="dxa" w:w="100"/>
+            </w:tcMar>
+          </w:tcPr>
+          <w:p>
+            <w:r>
+              <w:rPr>
+                <w:b w:val="false"/>
+                <w:bCs w:val="false"/>
+                <w:sz w:val="20"/>
+                <w:szCs w:val="20"/>
+              </w:rPr>
+              <w:t xml:space="preserve">Europe</w:t>
+            </w:r>
+          </w:p>
+        </w:tc>
+        <w:tc>
+          <w:tcPr>
+            <w:tcW w:type="dxa" w:w="2340"/>
+            <w:tcBorders>
+              <w:top w:val="single" w:color="BBBBBB" w:sz="4"/>
+              <w:left w:val="single" w:color="BBBBBB" w:sz="4"/>
+              <w:bottom w:val="single" w:color="BBBBBB" w:sz="4"/>
+              <w:right w:val="single" w:color="BBBBBB" w:sz="4"/>
+            </w:tcBorders>
+            <w:tcMar>
+              <w:top w:type="dxa" w:w="60"/>
+              <w:left w:type="dxa" w:w="100"/>
+              <w:bottom w:type="dxa" w:w="60"/>
+              <w:right w:type="dxa" w:w="100"/>
+            </w:tcMar>
+          </w:tcPr>
+          <w:p>
+            <w:r>
+              <w:rPr>
+                <w:b w:val="false"/>
+                <w:bCs w:val="false"/>
+                <w:sz w:val="20"/>
+                <w:szCs w:val="20"/>
+              </w:rPr>
+              <w:t xml:space="preserve">166.255</w:t>
+            </w:r>
+          </w:p>
+        </w:tc>
+        <w:tc>
+          <w:tcPr>
+            <w:tcW w:type="dxa" w:w="2340"/>
+            <w:tcBorders>
+              <w:top w:val="single" w:color="BBBBBB" w:sz="4"/>
+              <w:left w:val="single" w:color="BBBBBB" w:sz="4"/>
+              <w:bottom w:val="single" w:color="BBBBBB" w:sz="4"/>
+              <w:right w:val="single" w:color="BBBBBB" w:sz="4"/>
+            </w:tcBorders>
+            <w:tcMar>
+              <w:top w:type="dxa" w:w="60"/>
+              <w:left w:type="dxa" w:w="100"/>
+              <w:bottom w:type="dxa" w:w="60"/>
+              <w:right w:type="dxa" w:w="100"/>
+            </w:tcMar>
+          </w:tcPr>
+          <w:p>
+            <w:r>
+              <w:rPr>
+                <w:b w:val="false"/>
+                <w:bCs w:val="false"/>
+                <w:sz w:val="20"/>
+                <w:szCs w:val="20"/>
+              </w:rPr>
+              <w:t xml:space="preserve">24,1%</w:t>
+            </w:r>
+          </w:p>
+        </w:tc>
+        <w:tc>
+          <w:tcPr>
+            <w:tcW w:type="dxa" w:w="2340"/>
+            <w:tcBorders>
+              <w:top w:val="single" w:color="BBBBBB" w:sz="4"/>
+              <w:left w:val="single" w:color="BBBBBB" w:sz="4"/>
+              <w:bottom w:val="single" w:color="BBBBBB" w:sz="4"/>
+              <w:right w:val="single" w:color="BBBBBB" w:sz="4"/>
+            </w:tcBorders>
+            <w:tcMar>
+              <w:top w:type="dxa" w:w="60"/>
+              <w:left w:type="dxa" w:w="100"/>
+              <w:bottom w:type="dxa" w:w="60"/>
+              <w:right w:type="dxa" w:w="100"/>
+            </w:tcMar>
+          </w:tcPr>
+          <w:p>
+            <w:r>
+              <w:rPr>
+                <w:b w:val="false"/>
+                <w:bCs w:val="false"/>
+                <w:sz w:val="20"/>
+                <w:szCs w:val="20"/>
+              </w:rPr>
+              <w:t xml:space="preserve">3.325</w:t>
+            </w:r>
+          </w:p>
+        </w:tc>
+      </w:tr>
+      <w:tr>
+        <w:trPr>
+          <w:tblHeader w:val="false"/>
+        </w:trPr>
+        <w:tc>
+          <w:tcPr>
+            <w:tcW w:type="dxa" w:w="2340"/>
+            <w:tcBorders>
+              <w:top w:val="single" w:color="BBBBBB" w:sz="4"/>
+              <w:left w:val="single" w:color="BBBBBB" w:sz="4"/>
+              <w:bottom w:val="single" w:color="BBBBBB" w:sz="4"/>
+              <w:right w:val="single" w:color="BBBBBB" w:sz="4"/>
+            </w:tcBorders>
+            <w:tcMar>
+              <w:top w:type="dxa" w:w="60"/>
+              <w:left w:type="dxa" w:w="100"/>
+              <w:bottom w:type="dxa" w:w="60"/>
+              <w:right w:type="dxa" w:w="100"/>
+            </w:tcMar>
+          </w:tcPr>
+          <w:p>
+            <w:r>
+              <w:rPr>
+                <w:b w:val="false"/>
+                <w:bCs w:val="false"/>
+                <w:sz w:val="20"/>
+                <w:szCs w:val="20"/>
+              </w:rPr>
+              <w:t xml:space="preserve">North America</w:t>
+            </w:r>
+          </w:p>
+        </w:tc>
+        <w:tc>
+          <w:tcPr>
+            <w:tcW w:type="dxa" w:w="2340"/>
+            <w:tcBorders>
+              <w:top w:val="single" w:color="BBBBBB" w:sz="4"/>
+              <w:left w:val="single" w:color="BBBBBB" w:sz="4"/>
+              <w:bottom w:val="single" w:color="BBBBBB" w:sz="4"/>
+              <w:right w:val="single" w:color="BBBBBB" w:sz="4"/>
+            </w:tcBorders>
+            <w:tcMar>
+              <w:top w:type="dxa" w:w="60"/>
+              <w:left w:type="dxa" w:w="100"/>
+              <w:bottom w:type="dxa" w:w="60"/>
+              <w:right w:type="dxa" w:w="100"/>
+            </w:tcMar>
+          </w:tcPr>
+          <w:p>
+            <w:r>
+              <w:rPr>
+                <w:b w:val="false"/>
+                <w:bCs w:val="false"/>
+                <w:sz w:val="20"/>
+                <w:szCs w:val="20"/>
+              </w:rPr>
+              <w:t xml:space="preserve">152.313</w:t>
+            </w:r>
+          </w:p>
+        </w:tc>
+        <w:tc>
+          <w:tcPr>
+            <w:tcW w:type="dxa" w:w="2340"/>
+            <w:tcBorders>
+              <w:top w:val="single" w:color="BBBBBB" w:sz="4"/>
+              <w:left w:val="single" w:color="BBBBBB" w:sz="4"/>
+              <w:bottom w:val="single" w:color="BBBBBB" w:sz="4"/>
+              <w:right w:val="single" w:color="BBBBBB" w:sz="4"/>
+            </w:tcBorders>
+            <w:tcMar>
+              <w:top w:type="dxa" w:w="60"/>
+              <w:left w:type="dxa" w:w="100"/>
+              <w:bottom w:type="dxa" w:w="60"/>
+              <w:right w:type="dxa" w:w="100"/>
+            </w:tcMar>
+          </w:tcPr>
+          <w:p>
+            <w:r>
+              <w:rPr>
+                <w:b w:val="false"/>
+                <w:bCs w:val="false"/>
+                <w:sz w:val="20"/>
+                <w:szCs w:val="20"/>
+              </w:rPr>
+              <w:t xml:space="preserve">22,1%</w:t>
+            </w:r>
+          </w:p>
+        </w:tc>
+        <w:tc>
+          <w:tcPr>
+            <w:tcW w:type="dxa" w:w="2340"/>
+            <w:tcBorders>
+              <w:top w:val="single" w:color="BBBBBB" w:sz="4"/>
+              <w:left w:val="single" w:color="BBBBBB" w:sz="4"/>
+              <w:bottom w:val="single" w:color="BBBBBB" w:sz="4"/>
+              <w:right w:val="single" w:color="BBBBBB" w:sz="4"/>
+            </w:tcBorders>
+            <w:tcMar>
+              <w:top w:type="dxa" w:w="60"/>
+              <w:left w:type="dxa" w:w="100"/>
+              <w:bottom w:type="dxa" w:w="60"/>
+              <w:right w:type="dxa" w:w="100"/>
+            </w:tcMar>
+          </w:tcPr>
+          <w:p>
+            <w:r>
+              <w:rPr>
+                <w:b w:val="false"/>
+                <w:bCs w:val="false"/>
+                <w:sz w:val="20"/>
+                <w:szCs w:val="20"/>
+              </w:rPr>
+              <w:t xml:space="preserve">3.311</w:t>
+            </w:r>
+          </w:p>
+        </w:tc>
+      </w:tr>
+      <w:tr>
+        <w:trPr>
+          <w:tblHeader w:val="false"/>
+        </w:trPr>
+        <w:tc>
+          <w:tcPr>
+            <w:tcW w:type="dxa" w:w="2340"/>
+            <w:tcBorders>
+              <w:top w:val="single" w:color="BBBBBB" w:sz="4"/>
+              <w:left w:val="single" w:color="BBBBBB" w:sz="4"/>
+              <w:bottom w:val="single" w:color="BBBBBB" w:sz="4"/>
+              <w:right w:val="single" w:color="BBBBBB" w:sz="4"/>
+            </w:tcBorders>
+            <w:tcMar>
+              <w:top w:type="dxa" w:w="60"/>
+              <w:left w:type="dxa" w:w="100"/>
+              <w:bottom w:type="dxa" w:w="60"/>
+              <w:right w:type="dxa" w:w="100"/>
+            </w:tcMar>
+          </w:tcPr>
+          <w:p>
+            <w:r>
+              <w:rPr>
+                <w:b w:val="false"/>
+                <w:bCs w:val="false"/>
+                <w:sz w:val="20"/>
+                <w:szCs w:val="20"/>
+              </w:rPr>
+              <w:t xml:space="preserve">Asia</w:t>
+            </w:r>
+          </w:p>
+        </w:tc>
+        <w:tc>
+          <w:tcPr>
+            <w:tcW w:type="dxa" w:w="2340"/>
+            <w:tcBorders>
+              <w:top w:val="single" w:color="BBBBBB" w:sz="4"/>
+              <w:left w:val="single" w:color="BBBBBB" w:sz="4"/>
+              <w:bottom w:val="single" w:color="BBBBBB" w:sz="4"/>
+              <w:right w:val="single" w:color="BBBBBB" w:sz="4"/>
+            </w:tcBorders>
+            <w:tcMar>
+              <w:top w:type="dxa" w:w="60"/>
+              <w:left w:type="dxa" w:w="100"/>
+              <w:bottom w:type="dxa" w:w="60"/>
+              <w:right w:type="dxa" w:w="100"/>
+            </w:tcMar>
+          </w:tcPr>
+          <w:p>
+            <w:r>
+              <w:rPr>
+                <w:b w:val="false"/>
+                <w:bCs w:val="false"/>
+                <w:sz w:val="20"/>
+                <w:szCs w:val="20"/>
+              </w:rPr>
+              <w:t xml:space="preserve">152.075</w:t>
+            </w:r>
+          </w:p>
+        </w:tc>
+        <w:tc>
+          <w:tcPr>
+            <w:tcW w:type="dxa" w:w="2340"/>
+            <w:tcBorders>
+              <w:top w:val="single" w:color="BBBBBB" w:sz="4"/>
+              <w:left w:val="single" w:color="BBBBBB" w:sz="4"/>
+              <w:bottom w:val="single" w:color="BBBBBB" w:sz="4"/>
+              <w:right w:val="single" w:color="BBBBBB" w:sz="4"/>
+            </w:tcBorders>
+            <w:tcMar>
+              <w:top w:type="dxa" w:w="60"/>
+              <w:left w:type="dxa" w:w="100"/>
+              <w:bottom w:type="dxa" w:w="60"/>
+              <w:right w:type="dxa" w:w="100"/>
+            </w:tcMar>
+          </w:tcPr>
+          <w:p>
+            <w:r>
+              <w:rPr>
+                <w:b w:val="false"/>
+                <w:bCs w:val="false"/>
+                <w:sz w:val="20"/>
+                <w:szCs w:val="20"/>
+              </w:rPr>
+              <w:t xml:space="preserve">22,0%</w:t>
+            </w:r>
+          </w:p>
+        </w:tc>
+        <w:tc>
+          <w:tcPr>
+            <w:tcW w:type="dxa" w:w="2340"/>
+            <w:tcBorders>
+              <w:top w:val="single" w:color="BBBBBB" w:sz="4"/>
+              <w:left w:val="single" w:color="BBBBBB" w:sz="4"/>
+              <w:bottom w:val="single" w:color="BBBBBB" w:sz="4"/>
+              <w:right w:val="single" w:color="BBBBBB" w:sz="4"/>
+            </w:tcBorders>
+            <w:tcMar>
+              <w:top w:type="dxa" w:w="60"/>
+              <w:left w:type="dxa" w:w="100"/>
+              <w:bottom w:type="dxa" w:w="60"/>
+              <w:right w:type="dxa" w:w="100"/>
+            </w:tcMar>
+          </w:tcPr>
+          <w:p>
+            <w:r>
+              <w:rPr>
+                <w:b w:val="false"/>
+                <w:bCs w:val="false"/>
+                <w:sz w:val="20"/>
+                <w:szCs w:val="20"/>
+              </w:rPr>
+              <w:t xml:space="preserve">3.456</w:t>
+            </w:r>
+          </w:p>
+        </w:tc>
+      </w:tr>
+    </w:tbl>
+    <w:p>
+      <w:pPr>
+        <w:spacing w:after="120"/>
+      </w:pPr>
+    </w:p>
+    <w:tbl>
+      <w:tblPr>
+        <w:tblW w:type="dxa" w:w="9360"/>
+        <w:tblBorders>
+          <w:top w:val="single" w:color="auto" w:sz="4"/>
+          <w:left w:val="single" w:color="auto" w:sz="4"/>
+          <w:bottom w:val="single" w:color="auto" w:sz="4"/>
+          <w:right w:val="single" w:color="auto" w:sz="4"/>
+          <w:insideH w:val="single" w:color="auto" w:sz="4"/>
+          <w:insideV w:val="single" w:color="auto" w:sz="4"/>
+        </w:tblBorders>
+      </w:tblPr>
+      <w:tblGrid>
+        <w:gridCol w:w="1200"/>
+        <w:gridCol w:w="2800"/>
+        <w:gridCol w:w="2800"/>
+        <w:gridCol w:w="2560"/>
+      </w:tblGrid>
+      <w:tr>
+        <w:trPr>
+          <w:tblHeader/>
+        </w:trPr>
+        <w:tc>
+          <w:tcPr>
+            <w:tcW w:type="dxa" w:w="1200"/>
+            <w:tcBorders>
+              <w:top w:val="single" w:color="BBBBBB" w:sz="4"/>
+              <w:left w:val="single" w:color="BBBBBB" w:sz="4"/>
+              <w:bottom w:val="single" w:color="BBBBBB" w:sz="4"/>
+              <w:right w:val="single" w:color="BBBBBB" w:sz="4"/>
+            </w:tcBorders>
+            <w:shd w:fill="1F4E79" w:color="auto" w:val="clear"/>
+            <w:tcMar>
+              <w:top w:type="dxa" w:w="60"/>
+              <w:left w:type="dxa" w:w="100"/>
+              <w:bottom w:type="dxa" w:w="60"/>
+              <w:right w:type="dxa" w:w="100"/>
+            </w:tcMar>
+          </w:tcPr>
+          <w:p>
+            <w:r>
+              <w:rPr>
+                <w:b/>
+                <w:bCs/>
+                <w:color w:val="FFFFFF"/>
+                <w:sz w:val="20"/>
+                <w:szCs w:val="20"/>
+              </w:rPr>
+              <w:t xml:space="preserve">Bulan 2024</w:t>
+            </w:r>
+          </w:p>
+        </w:tc>
+        <w:tc>
+          <w:tcPr>
+            <w:tcW w:type="dxa" w:w="2800"/>
+            <w:tcBorders>
+              <w:top w:val="single" w:color="BBBBBB" w:sz="4"/>
+              <w:left w:val="single" w:color="BBBBBB" w:sz="4"/>
+              <w:bottom w:val="single" w:color="BBBBBB" w:sz="4"/>
+              <w:right w:val="single" w:color="BBBBBB" w:sz="4"/>
+            </w:tcBorders>
+            <w:shd w:fill="1F4E79" w:color="auto" w:val="clear"/>
+            <w:tcMar>
+              <w:top w:type="dxa" w:w="60"/>
+              <w:left w:type="dxa" w:w="100"/>
+              <w:bottom w:type="dxa" w:w="60"/>
+              <w:right w:type="dxa" w:w="100"/>
+            </w:tcMar>
+          </w:tcPr>
+          <w:p>
+            <w:r>
+              <w:rPr>
+                <w:b/>
+                <w:bCs/>
+                <w:color w:val="FFFFFF"/>
+                <w:sz w:val="20"/>
+                <w:szCs w:val="20"/>
+              </w:rPr>
+              <w:t xml:space="preserve">Revenue</w:t>
+            </w:r>
+          </w:p>
+        </w:tc>
+        <w:tc>
+          <w:tcPr>
+            <w:tcW w:type="dxa" w:w="2800"/>
+            <w:tcBorders>
+              <w:top w:val="single" w:color="BBBBBB" w:sz="4"/>
+              <w:left w:val="single" w:color="BBBBBB" w:sz="4"/>
+              <w:bottom w:val="single" w:color="BBBBBB" w:sz="4"/>
+              <w:right w:val="single" w:color="BBBBBB" w:sz="4"/>
+            </w:tcBorders>
+            <w:shd w:fill="1F4E79" w:color="auto" w:val="clear"/>
+            <w:tcMar>
+              <w:top w:type="dxa" w:w="60"/>
+              <w:left w:type="dxa" w:w="100"/>
+              <w:bottom w:type="dxa" w:w="60"/>
+              <w:right w:type="dxa" w:w="100"/>
+            </w:tcMar>
+          </w:tcPr>
+          <w:p>
+            <w:r>
+              <w:rPr>
+                <w:b/>
+                <w:bCs/>
+                <w:color w:val="FFFFFF"/>
+                <w:sz w:val="20"/>
+                <w:szCs w:val="20"/>
+              </w:rPr>
+              <w:t xml:space="preserve">Bulan 2024</w:t>
+            </w:r>
+          </w:p>
+        </w:tc>
+        <w:tc>
+          <w:tcPr>
+            <w:tcW w:type="dxa" w:w="2560"/>
+            <w:tcBorders>
+              <w:top w:val="single" w:color="BBBBBB" w:sz="4"/>
+              <w:left w:val="single" w:color="BBBBBB" w:sz="4"/>
+              <w:bottom w:val="single" w:color="BBBBBB" w:sz="4"/>
+              <w:right w:val="single" w:color="BBBBBB" w:sz="4"/>
+            </w:tcBorders>
+            <w:shd w:fill="1F4E79" w:color="auto" w:val="clear"/>
+            <w:tcMar>
+              <w:top w:type="dxa" w:w="60"/>
+              <w:left w:type="dxa" w:w="100"/>
+              <w:bottom w:type="dxa" w:w="60"/>
+              <w:right w:type="dxa" w:w="100"/>
+            </w:tcMar>
+          </w:tcPr>
+          <w:p>
+            <w:r>
+              <w:rPr>
+                <w:b/>
+                <w:bCs/>
+                <w:color w:val="FFFFFF"/>
+                <w:sz w:val="20"/>
+                <w:szCs w:val="20"/>
+              </w:rPr>
+              <w:t xml:space="preserve">Revenue</w:t>
+            </w:r>
+          </w:p>
+        </w:tc>
+      </w:tr>
+      <w:tr>
+        <w:trPr>
+          <w:tblHeader w:val="false"/>
+        </w:trPr>
+        <w:tc>
+          <w:tcPr>
+            <w:tcW w:type="dxa" w:w="1200"/>
+            <w:tcBorders>
+              <w:top w:val="single" w:color="BBBBBB" w:sz="4"/>
+              <w:left w:val="single" w:color="BBBBBB" w:sz="4"/>
+              <w:bottom w:val="single" w:color="BBBBBB" w:sz="4"/>
+              <w:right w:val="single" w:color="BBBBBB" w:sz="4"/>
+            </w:tcBorders>
+            <w:tcMar>
+              <w:top w:type="dxa" w:w="60"/>
+              <w:left w:type="dxa" w:w="100"/>
+              <w:bottom w:type="dxa" w:w="60"/>
+              <w:right w:type="dxa" w:w="100"/>
+            </w:tcMar>
+          </w:tcPr>
+          <w:p>
+            <w:r>
+              <w:rPr>
+                <w:b w:val="false"/>
+                <w:bCs w:val="false"/>
+                <w:sz w:val="20"/>
+                <w:szCs w:val="20"/>
+              </w:rPr>
+              <w:t xml:space="preserve">Jan</w:t>
+            </w:r>
+          </w:p>
+        </w:tc>
+        <w:tc>
+          <w:tcPr>
+            <w:tcW w:type="dxa" w:w="2800"/>
+            <w:tcBorders>
+              <w:top w:val="single" w:color="BBBBBB" w:sz="4"/>
+              <w:left w:val="single" w:color="BBBBBB" w:sz="4"/>
+              <w:bottom w:val="single" w:color="BBBBBB" w:sz="4"/>
+              <w:right w:val="single" w:color="BBBBBB" w:sz="4"/>
+            </w:tcBorders>
+            <w:tcMar>
+              <w:top w:type="dxa" w:w="60"/>
+              <w:left w:type="dxa" w:w="100"/>
+              <w:bottom w:type="dxa" w:w="60"/>
+              <w:right w:type="dxa" w:w="100"/>
+            </w:tcMar>
+          </w:tcPr>
+          <w:p>
+            <w:r>
+              <w:rPr>
+                <w:b w:val="false"/>
+                <w:bCs w:val="false"/>
+                <w:sz w:val="20"/>
+                <w:szCs w:val="20"/>
+              </w:rPr>
+              <w:t xml:space="preserve">66.376</w:t>
+            </w:r>
+          </w:p>
+        </w:tc>
+        <w:tc>
+          <w:tcPr>
+            <w:tcW w:type="dxa" w:w="2800"/>
+            <w:tcBorders>
+              <w:top w:val="single" w:color="BBBBBB" w:sz="4"/>
+              <w:left w:val="single" w:color="BBBBBB" w:sz="4"/>
+              <w:bottom w:val="single" w:color="BBBBBB" w:sz="4"/>
+              <w:right w:val="single" w:color="BBBBBB" w:sz="4"/>
+            </w:tcBorders>
+            <w:tcMar>
+              <w:top w:type="dxa" w:w="60"/>
+              <w:left w:type="dxa" w:w="100"/>
+              <w:bottom w:type="dxa" w:w="60"/>
+              <w:right w:type="dxa" w:w="100"/>
+            </w:tcMar>
+          </w:tcPr>
+          <w:p>
+            <w:r>
+              <w:rPr>
+                <w:b w:val="false"/>
+                <w:bCs w:val="false"/>
+                <w:sz w:val="20"/>
+                <w:szCs w:val="20"/>
+              </w:rPr>
+              <w:t xml:space="preserve">Jul</w:t>
+            </w:r>
+          </w:p>
+        </w:tc>
+        <w:tc>
+          <w:tcPr>
+            <w:tcW w:type="dxa" w:w="2560"/>
+            <w:tcBorders>
+              <w:top w:val="single" w:color="BBBBBB" w:sz="4"/>
+              <w:left w:val="single" w:color="BBBBBB" w:sz="4"/>
+              <w:bottom w:val="single" w:color="BBBBBB" w:sz="4"/>
+              <w:right w:val="single" w:color="BBBBBB" w:sz="4"/>
+            </w:tcBorders>
+            <w:tcMar>
+              <w:top w:type="dxa" w:w="60"/>
+              <w:left w:type="dxa" w:w="100"/>
+              <w:bottom w:type="dxa" w:w="60"/>
+              <w:right w:type="dxa" w:w="100"/>
+            </w:tcMar>
+          </w:tcPr>
+          <w:p>
+            <w:r>
+              <w:rPr>
+                <w:b w:val="false"/>
+                <w:bCs w:val="false"/>
+                <w:sz w:val="20"/>
+                <w:szCs w:val="20"/>
+              </w:rPr>
+              <w:t xml:space="preserve">71.366</w:t>
+            </w:r>
+          </w:p>
+        </w:tc>
+      </w:tr>
+      <w:tr>
+        <w:trPr>
+          <w:tblHeader w:val="false"/>
+        </w:trPr>
+        <w:tc>
+          <w:tcPr>
+            <w:tcW w:type="dxa" w:w="1200"/>
+            <w:tcBorders>
+              <w:top w:val="single" w:color="BBBBBB" w:sz="4"/>
+              <w:left w:val="single" w:color="BBBBBB" w:sz="4"/>
+              <w:bottom w:val="single" w:color="BBBBBB" w:sz="4"/>
+              <w:right w:val="single" w:color="BBBBBB" w:sz="4"/>
+            </w:tcBorders>
+            <w:tcMar>
+              <w:top w:type="dxa" w:w="60"/>
+              <w:left w:type="dxa" w:w="100"/>
+              <w:bottom w:type="dxa" w:w="60"/>
+              <w:right w:type="dxa" w:w="100"/>
+            </w:tcMar>
+          </w:tcPr>
+          <w:p>
+            <w:r>
+              <w:rPr>
+                <w:b w:val="false"/>
+                <w:bCs w:val="false"/>
+                <w:sz w:val="20"/>
+                <w:szCs w:val="20"/>
+              </w:rPr>
+              <w:t xml:space="preserve">Feb</w:t>
+            </w:r>
+          </w:p>
+        </w:tc>
+        <w:tc>
+          <w:tcPr>
+            <w:tcW w:type="dxa" w:w="2800"/>
+            <w:tcBorders>
+              <w:top w:val="single" w:color="BBBBBB" w:sz="4"/>
+              <w:left w:val="single" w:color="BBBBBB" w:sz="4"/>
+              <w:bottom w:val="single" w:color="BBBBBB" w:sz="4"/>
+              <w:right w:val="single" w:color="BBBBBB" w:sz="4"/>
+            </w:tcBorders>
+            <w:tcMar>
+              <w:top w:type="dxa" w:w="60"/>
+              <w:left w:type="dxa" w:w="100"/>
+              <w:bottom w:type="dxa" w:w="60"/>
+              <w:right w:type="dxa" w:w="100"/>
+            </w:tcMar>
+          </w:tcPr>
+          <w:p>
+            <w:r>
+              <w:rPr>
+                <w:b w:val="false"/>
+                <w:bCs w:val="false"/>
+                <w:sz w:val="20"/>
+                <w:szCs w:val="20"/>
+              </w:rPr>
+              <w:t xml:space="preserve">51.459</w:t>
+            </w:r>
+          </w:p>
+        </w:tc>
+        <w:tc>
+          <w:tcPr>
+            <w:tcW w:type="dxa" w:w="2800"/>
+            <w:tcBorders>
+              <w:top w:val="single" w:color="BBBBBB" w:sz="4"/>
+              <w:left w:val="single" w:color="BBBBBB" w:sz="4"/>
+              <w:bottom w:val="single" w:color="BBBBBB" w:sz="4"/>
+              <w:right w:val="single" w:color="BBBBBB" w:sz="4"/>
+            </w:tcBorders>
+            <w:tcMar>
+              <w:top w:type="dxa" w:w="60"/>
+              <w:left w:type="dxa" w:w="100"/>
+              <w:bottom w:type="dxa" w:w="60"/>
+              <w:right w:type="dxa" w:w="100"/>
+            </w:tcMar>
+          </w:tcPr>
+          <w:p>
+            <w:r>
+              <w:rPr>
+                <w:b w:val="false"/>
+                <w:bCs w:val="false"/>
+                <w:sz w:val="20"/>
+                <w:szCs w:val="20"/>
+              </w:rPr>
+              <w:t xml:space="preserve">Agu</w:t>
+            </w:r>
+          </w:p>
+        </w:tc>
+        <w:tc>
+          <w:tcPr>
+            <w:tcW w:type="dxa" w:w="2560"/>
+            <w:tcBorders>
+              <w:top w:val="single" w:color="BBBBBB" w:sz="4"/>
+              <w:left w:val="single" w:color="BBBBBB" w:sz="4"/>
+              <w:bottom w:val="single" w:color="BBBBBB" w:sz="4"/>
+              <w:right w:val="single" w:color="BBBBBB" w:sz="4"/>
+            </w:tcBorders>
+            <w:tcMar>
+              <w:top w:type="dxa" w:w="60"/>
+              <w:left w:type="dxa" w:w="100"/>
+              <w:bottom w:type="dxa" w:w="60"/>
+              <w:right w:type="dxa" w:w="100"/>
+            </w:tcMar>
+          </w:tcPr>
+          <w:p>
+            <w:r>
+              <w:rPr>
+                <w:b w:val="false"/>
+                <w:bCs w:val="false"/>
+                <w:sz w:val="20"/>
+                <w:szCs w:val="20"/>
+              </w:rPr>
+              <w:t xml:space="preserve">63.437</w:t>
+            </w:r>
+          </w:p>
+        </w:tc>
+      </w:tr>
+      <w:tr>
+        <w:trPr>
+          <w:tblHeader w:val="false"/>
+        </w:trPr>
+        <w:tc>
+          <w:tcPr>
+            <w:tcW w:type="dxa" w:w="1200"/>
+            <w:tcBorders>
+              <w:top w:val="single" w:color="BBBBBB" w:sz="4"/>
+              <w:left w:val="single" w:color="BBBBBB" w:sz="4"/>
+              <w:bottom w:val="single" w:color="BBBBBB" w:sz="4"/>
+              <w:right w:val="single" w:color="BBBBBB" w:sz="4"/>
+            </w:tcBorders>
+            <w:tcMar>
+              <w:top w:type="dxa" w:w="60"/>
+              <w:left w:type="dxa" w:w="100"/>
+              <w:bottom w:type="dxa" w:w="60"/>
+              <w:right w:type="dxa" w:w="100"/>
+            </w:tcMar>
+          </w:tcPr>
+          <w:p>
+            <w:r>
+              <w:rPr>
+                <w:b w:val="false"/>
+                <w:bCs w:val="false"/>
+                <w:sz w:val="20"/>
+                <w:szCs w:val="20"/>
+              </w:rPr>
+              <w:t xml:space="preserve">Mar</w:t>
+            </w:r>
+          </w:p>
+        </w:tc>
+        <w:tc>
+          <w:tcPr>
+            <w:tcW w:type="dxa" w:w="2800"/>
+            <w:tcBorders>
+              <w:top w:val="single" w:color="BBBBBB" w:sz="4"/>
+              <w:left w:val="single" w:color="BBBBBB" w:sz="4"/>
+              <w:bottom w:val="single" w:color="BBBBBB" w:sz="4"/>
+              <w:right w:val="single" w:color="BBBBBB" w:sz="4"/>
+            </w:tcBorders>
+            <w:tcMar>
+              <w:top w:type="dxa" w:w="60"/>
+              <w:left w:type="dxa" w:w="100"/>
+              <w:bottom w:type="dxa" w:w="60"/>
+              <w:right w:type="dxa" w:w="100"/>
+            </w:tcMar>
+          </w:tcPr>
+          <w:p>
+            <w:r>
+              <w:rPr>
+                <w:b w:val="false"/>
+                <w:bCs w:val="false"/>
+                <w:sz w:val="20"/>
+                <w:szCs w:val="20"/>
+              </w:rPr>
+              <w:t xml:space="preserve">47.829</w:t>
+            </w:r>
+          </w:p>
+        </w:tc>
+        <w:tc>
+          <w:tcPr>
+            <w:tcW w:type="dxa" w:w="2800"/>
+            <w:tcBorders>
+              <w:top w:val="single" w:color="BBBBBB" w:sz="4"/>
+              <w:left w:val="single" w:color="BBBBBB" w:sz="4"/>
+              <w:bottom w:val="single" w:color="BBBBBB" w:sz="4"/>
+              <w:right w:val="single" w:color="BBBBBB" w:sz="4"/>
+            </w:tcBorders>
+            <w:tcMar>
+              <w:top w:type="dxa" w:w="60"/>
+              <w:left w:type="dxa" w:w="100"/>
+              <w:bottom w:type="dxa" w:w="60"/>
+              <w:right w:type="dxa" w:w="100"/>
+            </w:tcMar>
+          </w:tcPr>
+          <w:p>
+            <w:r>
+              <w:rPr>
+                <w:b w:val="false"/>
+                <w:bCs w:val="false"/>
+                <w:sz w:val="20"/>
+                <w:szCs w:val="20"/>
+              </w:rPr>
+              <w:t xml:space="preserve">Sep</w:t>
+            </w:r>
+          </w:p>
+        </w:tc>
+        <w:tc>
+          <w:tcPr>
+            <w:tcW w:type="dxa" w:w="2560"/>
+            <w:tcBorders>
+              <w:top w:val="single" w:color="BBBBBB" w:sz="4"/>
+              <w:left w:val="single" w:color="BBBBBB" w:sz="4"/>
+              <w:bottom w:val="single" w:color="BBBBBB" w:sz="4"/>
+              <w:right w:val="single" w:color="BBBBBB" w:sz="4"/>
+            </w:tcBorders>
+            <w:tcMar>
+              <w:top w:type="dxa" w:w="60"/>
+              <w:left w:type="dxa" w:w="100"/>
+              <w:bottom w:type="dxa" w:w="60"/>
+              <w:right w:type="dxa" w:w="100"/>
+            </w:tcMar>
+          </w:tcPr>
+          <w:p>
+            <w:r>
+              <w:rPr>
+                <w:b w:val="false"/>
+                <w:bCs w:val="false"/>
+                <w:sz w:val="20"/>
+                <w:szCs w:val="20"/>
+              </w:rPr>
+              <w:t xml:space="preserve">70.604</w:t>
+            </w:r>
+          </w:p>
+        </w:tc>
+      </w:tr>
+      <w:tr>
+        <w:trPr>
+          <w:tblHeader w:val="false"/>
+        </w:trPr>
+        <w:tc>
+          <w:tcPr>
+            <w:tcW w:type="dxa" w:w="1200"/>
+            <w:tcBorders>
+              <w:top w:val="single" w:color="BBBBBB" w:sz="4"/>
+              <w:left w:val="single" w:color="BBBBBB" w:sz="4"/>
+              <w:bottom w:val="single" w:color="BBBBBB" w:sz="4"/>
+              <w:right w:val="single" w:color="BBBBBB" w:sz="4"/>
+            </w:tcBorders>
+            <w:tcMar>
+              <w:top w:type="dxa" w:w="60"/>
+              <w:left w:type="dxa" w:w="100"/>
+              <w:bottom w:type="dxa" w:w="60"/>
+              <w:right w:type="dxa" w:w="100"/>
+            </w:tcMar>
+          </w:tcPr>
+          <w:p>
+            <w:r>
+              <w:rPr>
+                <w:b w:val="false"/>
+                <w:bCs w:val="false"/>
+                <w:sz w:val="20"/>
+                <w:szCs w:val="20"/>
+              </w:rPr>
+              <w:t xml:space="preserve">Apr</w:t>
+            </w:r>
+          </w:p>
+        </w:tc>
+        <w:tc>
+          <w:tcPr>
+            <w:tcW w:type="dxa" w:w="2800"/>
+            <w:tcBorders>
+              <w:top w:val="single" w:color="BBBBBB" w:sz="4"/>
+              <w:left w:val="single" w:color="BBBBBB" w:sz="4"/>
+              <w:bottom w:val="single" w:color="BBBBBB" w:sz="4"/>
+              <w:right w:val="single" w:color="BBBBBB" w:sz="4"/>
+            </w:tcBorders>
+            <w:tcMar>
+              <w:top w:type="dxa" w:w="60"/>
+              <w:left w:type="dxa" w:w="100"/>
+              <w:bottom w:type="dxa" w:w="60"/>
+              <w:right w:type="dxa" w:w="100"/>
+            </w:tcMar>
+          </w:tcPr>
+          <w:p>
+            <w:r>
+              <w:rPr>
+                <w:b w:val="false"/>
+                <w:bCs w:val="false"/>
+                <w:sz w:val="20"/>
+                <w:szCs w:val="20"/>
+              </w:rPr>
+              <w:t xml:space="preserve">57.519</w:t>
+            </w:r>
+          </w:p>
+        </w:tc>
+        <w:tc>
+          <w:tcPr>
+            <w:tcW w:type="dxa" w:w="2800"/>
+            <w:tcBorders>
+              <w:top w:val="single" w:color="BBBBBB" w:sz="4"/>
+              <w:left w:val="single" w:color="BBBBBB" w:sz="4"/>
+              <w:bottom w:val="single" w:color="BBBBBB" w:sz="4"/>
+              <w:right w:val="single" w:color="BBBBBB" w:sz="4"/>
+            </w:tcBorders>
+            <w:tcMar>
+              <w:top w:type="dxa" w:w="60"/>
+              <w:left w:type="dxa" w:w="100"/>
+              <w:bottom w:type="dxa" w:w="60"/>
+              <w:right w:type="dxa" w:w="100"/>
+            </w:tcMar>
+          </w:tcPr>
+          <w:p>
+            <w:r>
+              <w:rPr>
+                <w:b w:val="false"/>
+                <w:bCs w:val="false"/>
+                <w:sz w:val="20"/>
+                <w:szCs w:val="20"/>
+              </w:rPr>
+              <w:t xml:space="preserve">Okt</w:t>
+            </w:r>
+          </w:p>
+        </w:tc>
+        <w:tc>
+          <w:tcPr>
+            <w:tcW w:type="dxa" w:w="2560"/>
+            <w:tcBorders>
+              <w:top w:val="single" w:color="BBBBBB" w:sz="4"/>
+              <w:left w:val="single" w:color="BBBBBB" w:sz="4"/>
+              <w:bottom w:val="single" w:color="BBBBBB" w:sz="4"/>
+              <w:right w:val="single" w:color="BBBBBB" w:sz="4"/>
+            </w:tcBorders>
+            <w:tcMar>
+              <w:top w:type="dxa" w:w="60"/>
+              <w:left w:type="dxa" w:w="100"/>
+              <w:bottom w:type="dxa" w:w="60"/>
+              <w:right w:type="dxa" w:w="100"/>
+            </w:tcMar>
+          </w:tcPr>
+          <w:p>
+            <w:r>
+              <w:rPr>
+                <w:b w:val="false"/>
+                <w:bCs w:val="false"/>
+                <w:sz w:val="20"/>
+                <w:szCs w:val="20"/>
+              </w:rPr>
+              <w:t xml:space="preserve">47.063</w:t>
+            </w:r>
+          </w:p>
+        </w:tc>
+      </w:tr>
+      <w:tr>
+        <w:trPr>
+          <w:tblHeader w:val="false"/>
+        </w:trPr>
+        <w:tc>
+          <w:tcPr>
+            <w:tcW w:type="dxa" w:w="1200"/>
+            <w:tcBorders>
+              <w:top w:val="single" w:color="BBBBBB" w:sz="4"/>
+              <w:left w:val="single" w:color="BBBBBB" w:sz="4"/>
+              <w:bottom w:val="single" w:color="BBBBBB" w:sz="4"/>
+              <w:right w:val="single" w:color="BBBBBB" w:sz="4"/>
+            </w:tcBorders>
+            <w:tcMar>
+              <w:top w:type="dxa" w:w="60"/>
+              <w:left w:type="dxa" w:w="100"/>
+              <w:bottom w:type="dxa" w:w="60"/>
+              <w:right w:type="dxa" w:w="100"/>
+            </w:tcMar>
+          </w:tcPr>
+          <w:p>
+            <w:r>
+              <w:rPr>
+                <w:b w:val="false"/>
+                <w:bCs w:val="false"/>
+                <w:sz w:val="20"/>
+                <w:szCs w:val="20"/>
+              </w:rPr>
+              <w:t xml:space="preserve">Mei</w:t>
+            </w:r>
+          </w:p>
+        </w:tc>
+        <w:tc>
+          <w:tcPr>
+            <w:tcW w:type="dxa" w:w="2800"/>
+            <w:tcBorders>
+              <w:top w:val="single" w:color="BBBBBB" w:sz="4"/>
+              <w:left w:val="single" w:color="BBBBBB" w:sz="4"/>
+              <w:bottom w:val="single" w:color="BBBBBB" w:sz="4"/>
+              <w:right w:val="single" w:color="BBBBBB" w:sz="4"/>
+            </w:tcBorders>
+            <w:tcMar>
+              <w:top w:type="dxa" w:w="60"/>
+              <w:left w:type="dxa" w:w="100"/>
+              <w:bottom w:type="dxa" w:w="60"/>
+              <w:right w:type="dxa" w:w="100"/>
+            </w:tcMar>
+          </w:tcPr>
+          <w:p>
+            <w:r>
+              <w:rPr>
+                <w:b w:val="false"/>
+                <w:bCs w:val="false"/>
+                <w:sz w:val="20"/>
+                <w:szCs w:val="20"/>
+              </w:rPr>
+              <w:t xml:space="preserve">64.528</w:t>
+            </w:r>
+          </w:p>
+        </w:tc>
+        <w:tc>
+          <w:tcPr>
+            <w:tcW w:type="dxa" w:w="2800"/>
+            <w:tcBorders>
+              <w:top w:val="single" w:color="BBBBBB" w:sz="4"/>
+              <w:left w:val="single" w:color="BBBBBB" w:sz="4"/>
+              <w:bottom w:val="single" w:color="BBBBBB" w:sz="4"/>
+              <w:right w:val="single" w:color="BBBBBB" w:sz="4"/>
+            </w:tcBorders>
+            <w:tcMar>
+              <w:top w:type="dxa" w:w="60"/>
+              <w:left w:type="dxa" w:w="100"/>
+              <w:bottom w:type="dxa" w:w="60"/>
+              <w:right w:type="dxa" w:w="100"/>
+            </w:tcMar>
+          </w:tcPr>
+          <w:p>
+            <w:r>
+              <w:rPr>
+                <w:b w:val="false"/>
+                <w:bCs w:val="false"/>
+                <w:sz w:val="20"/>
+                <w:szCs w:val="20"/>
+              </w:rPr>
+              <w:t xml:space="preserve">Nov</w:t>
+            </w:r>
+          </w:p>
+        </w:tc>
+        <w:tc>
+          <w:tcPr>
+            <w:tcW w:type="dxa" w:w="2560"/>
+            <w:tcBorders>
+              <w:top w:val="single" w:color="BBBBBB" w:sz="4"/>
+              <w:left w:val="single" w:color="BBBBBB" w:sz="4"/>
+              <w:bottom w:val="single" w:color="BBBBBB" w:sz="4"/>
+              <w:right w:val="single" w:color="BBBBBB" w:sz="4"/>
+            </w:tcBorders>
+            <w:tcMar>
+              <w:top w:type="dxa" w:w="60"/>
+              <w:left w:type="dxa" w:w="100"/>
+              <w:bottom w:type="dxa" w:w="60"/>
+              <w:right w:type="dxa" w:w="100"/>
+            </w:tcMar>
+          </w:tcPr>
+          <w:p>
+            <w:r>
+              <w:rPr>
+                <w:b w:val="false"/>
+                <w:bCs w:val="false"/>
+                <w:sz w:val="20"/>
+                <w:szCs w:val="20"/>
+              </w:rPr>
+              <w:t xml:space="preserve">38.224</w:t>
+            </w:r>
+          </w:p>
+        </w:tc>
+      </w:tr>
+      <w:tr>
+        <w:trPr>
+          <w:tblHeader w:val="false"/>
+        </w:trPr>
+        <w:tc>
+          <w:tcPr>
+            <w:tcW w:type="dxa" w:w="1200"/>
+            <w:tcBorders>
+              <w:top w:val="single" w:color="BBBBBB" w:sz="4"/>
+              <w:left w:val="single" w:color="BBBBBB" w:sz="4"/>
+              <w:bottom w:val="single" w:color="BBBBBB" w:sz="4"/>
+              <w:right w:val="single" w:color="BBBBBB" w:sz="4"/>
+            </w:tcBorders>
+            <w:tcMar>
+              <w:top w:type="dxa" w:w="60"/>
+              <w:left w:type="dxa" w:w="100"/>
+              <w:bottom w:type="dxa" w:w="60"/>
+              <w:right w:type="dxa" w:w="100"/>
+            </w:tcMar>
+          </w:tcPr>
+          <w:p>
+            <w:r>
+              <w:rPr>
+                <w:b w:val="false"/>
+                <w:bCs w:val="false"/>
+                <w:sz w:val="20"/>
+                <w:szCs w:val="20"/>
+              </w:rPr>
+              <w:t xml:space="preserve">Jun</w:t>
+            </w:r>
+          </w:p>
+        </w:tc>
+        <w:tc>
+          <w:tcPr>
+            <w:tcW w:type="dxa" w:w="2800"/>
+            <w:tcBorders>
+              <w:top w:val="single" w:color="BBBBBB" w:sz="4"/>
+              <w:left w:val="single" w:color="BBBBBB" w:sz="4"/>
+              <w:bottom w:val="single" w:color="BBBBBB" w:sz="4"/>
+              <w:right w:val="single" w:color="BBBBBB" w:sz="4"/>
+            </w:tcBorders>
+            <w:tcMar>
+              <w:top w:type="dxa" w:w="60"/>
+              <w:left w:type="dxa" w:w="100"/>
+              <w:bottom w:type="dxa" w:w="60"/>
+              <w:right w:type="dxa" w:w="100"/>
+            </w:tcMar>
+          </w:tcPr>
+          <w:p>
+            <w:r>
+              <w:rPr>
+                <w:b w:val="false"/>
+                <w:bCs w:val="false"/>
+                <w:sz w:val="20"/>
+                <w:szCs w:val="20"/>
+              </w:rPr>
+              <w:t xml:space="preserve">48.771</w:t>
+            </w:r>
+          </w:p>
+        </w:tc>
+        <w:tc>
+          <w:tcPr>
+            <w:tcW w:type="dxa" w:w="2800"/>
+            <w:tcBorders>
+              <w:top w:val="single" w:color="BBBBBB" w:sz="4"/>
+              <w:left w:val="single" w:color="BBBBBB" w:sz="4"/>
+              <w:bottom w:val="single" w:color="BBBBBB" w:sz="4"/>
+              <w:right w:val="single" w:color="BBBBBB" w:sz="4"/>
+            </w:tcBorders>
+            <w:tcMar>
+              <w:top w:type="dxa" w:w="60"/>
+              <w:left w:type="dxa" w:w="100"/>
+              <w:bottom w:type="dxa" w:w="60"/>
+              <w:right w:type="dxa" w:w="100"/>
+            </w:tcMar>
+          </w:tcPr>
+          <w:p>
+            <w:r>
+              <w:rPr>
+                <w:b w:val="false"/>
+                <w:bCs w:val="false"/>
+                <w:sz w:val="20"/>
+                <w:szCs w:val="20"/>
+              </w:rPr>
+              <w:t xml:space="preserve">Des</w:t>
+            </w:r>
+          </w:p>
+        </w:tc>
+        <w:tc>
+          <w:tcPr>
+            <w:tcW w:type="dxa" w:w="2560"/>
+            <w:tcBorders>
+              <w:top w:val="single" w:color="BBBBBB" w:sz="4"/>
+              <w:left w:val="single" w:color="BBBBBB" w:sz="4"/>
+              <w:bottom w:val="single" w:color="BBBBBB" w:sz="4"/>
+              <w:right w:val="single" w:color="BBBBBB" w:sz="4"/>
+            </w:tcBorders>
+            <w:tcMar>
+              <w:top w:type="dxa" w:w="60"/>
+              <w:left w:type="dxa" w:w="100"/>
+              <w:bottom w:type="dxa" w:w="60"/>
+              <w:right w:type="dxa" w:w="100"/>
+            </w:tcMar>
+          </w:tcPr>
+          <w:p>
+            <w:r>
+              <w:rPr>
+                <w:b w:val="false"/>
+                <w:bCs w:val="false"/>
+                <w:sz w:val="20"/>
+                <w:szCs w:val="20"/>
+              </w:rPr>
+              <w:t xml:space="preserve">59.049</w:t>
+            </w:r>
+          </w:p>
+        </w:tc>
+      </w:tr>
+    </w:tbl>
+    <w:p>
+      <w:pPr>
+        <w:spacing w:after="120"/>
+      </w:pPr>
+    </w:p>
+    <w:p>
+      <w:pPr>
+        <w:spacing w:after="120"/>
+      </w:pPr>
+      <w:r>
+        <w:t xml:space="preserve">Sepuluh produk teratas berdasarkan revenue: P029 TechPro Headphones (19.514), P079 ActiveWear Rug (17.947), P048 TechPro Cookbook (17.905), P020 ActiveWear Jacket (15.061), P062 HomeSense Novel (14.592), P059 SoundWave Jeans (13.947), P039 TechPro Smartwatch (13.779), P083 ActiveWear Smartwatch (13.672), P019 ComfortLiving Sweater (13.488), P041 ComfortLiving Smartphone (13.232).</w:t>
       </w:r>
     </w:p>
     <w:p>
@@ -3267,6 +6503,45 @@
         <w:spacing w:after="60"/>
       </w:pPr>
       <w:r>
+        <w:t xml:space="preserve">Revenue 2024 mencapai 689.996 dengan puncak di Juli (71.366) dan September (70.604), serta dasar di November (38.224). Kuartal 3 terkuat (205.407).</w:t>
+      </w:r>
+    </w:p>
+    <w:p>
+      <w:pPr>
+        <w:pStyle w:val="ListParagraph"/>
+        <w:numPr>
+          <w:ilvl w:val="0"/>
+          <w:numId w:val="2"/>
+        </w:numPr>
+        <w:spacing w:after="60"/>
+      </w:pPr>
+      <w:r>
+        <w:t xml:space="preserve">Books dan Electronics menyumbang 54% revenue, sedangkan Home Decor paling rendah (21,9%).</w:t>
+      </w:r>
+    </w:p>
+    <w:p>
+      <w:pPr>
+        <w:pStyle w:val="ListParagraph"/>
+        <w:numPr>
+          <w:ilvl w:val="0"/>
+          <w:numId w:val="2"/>
+        </w:numPr>
+        <w:spacing w:after="60"/>
+      </w:pPr>
+      <w:r>
+        <w:t xml:space="preserve">South America unggul: 31,8% revenue dan revenue per pelanggan tertinggi. Dua puluh pelanggan teratas hanya menyumbang 20% revenue, jadi pendapatan tidak bergantung pada segelintir pelanggan.</w:t>
+      </w:r>
+    </w:p>
+    <w:p>
+      <w:pPr>
+        <w:pStyle w:val="ListParagraph"/>
+        <w:numPr>
+          <w:ilvl w:val="0"/>
+          <w:numId w:val="2"/>
+        </w:numPr>
+        <w:spacing w:after="60"/>
+      </w:pPr>
+      <w:r>
         <w:t xml:space="preserve">Nama produk tidak sinkron dengan kategorinya (contoh: "TechPro T-Shirt" masuk Clothing, "BookWorld Rug" masuk Home Decor, "ActiveWear Biography" masuk Books). Data ini kemungkinan sintetis.</w:t>
       </w:r>
     </w:p>
@@ -3314,7 +6589,7 @@
         <w:spacing w:after="60"/>
       </w:pPr>
       <w:r>
-        <w:t xml:space="preserve">Line chart Total Revenue per waktu</w:t>
+        <w:t xml:space="preserve">Line chart Total Revenue per tanggal</w:t>
       </w:r>
     </w:p>
     <w:p>
@@ -3327,7 +6602,7 @@
         <w:spacing w:after="60"/>
       </w:pPr>
       <w:r>
-        <w:t xml:space="preserve">Bar chart Total Sales per produk</w:t>
+        <w:t xml:space="preserve">Bar chart penjualan per produk</w:t>
       </w:r>
     </w:p>
     <w:p>
@@ -3340,7 +6615,7 @@
         <w:spacing w:after="60"/>
       </w:pPr>
       <w:r>
-        <w:t xml:space="preserve">Donut chart Total Sales per Category</w:t>
+        <w:t xml:space="preserve">Donut chart penjualan per kategori</w:t>
       </w:r>
     </w:p>
     <w:p>
@@ -3378,7 +6653,7 @@
         <w:spacing w:after="60"/>
       </w:pPr>
       <w:r>
-        <w:t xml:space="preserve">Peta per Region dengan ukuran Customer Total</w:t>
+        <w:t xml:space="preserve">Peta pelanggan per wilayah dan tabel Share of Total</w:t>
       </w:r>
     </w:p>
     <w:p>
@@ -3391,7 +6666,20 @@
         <w:spacing w:after="60"/>
       </w:pPr>
       <w:r>
-        <w:t xml:space="preserve">Tabel Share of Total: produk terjual, pelanggan, transaksi, revenue</w:t>
+        <w:t xml:space="preserve">Kolom dan line chart revenue per kategori</w:t>
+      </w:r>
+    </w:p>
+    <w:p>
+      <w:pPr>
+        <w:pStyle w:val="ListParagraph"/>
+        <w:numPr>
+          <w:ilvl w:val="0"/>
+          <w:numId w:val="2"/>
+        </w:numPr>
+        <w:spacing w:after="60"/>
+      </w:pPr>
+      <w:r>
+        <w:t xml:space="preserve">Slicer: Region, Price, TransactionDate (Year, Quarter, Month), dan Quantity</w:t>
       </w:r>
     </w:p>
     <w:p>
@@ -3448,7 +6736,7 @@
         <w:spacing w:after="60"/>
       </w:pPr>
       <w:r>
-        <w:t xml:space="preserve">6. Revenue dan perilaku pelanggan (menunggu data transaksi)</w:t>
+        <w:t xml:space="preserve">6. Tren, kategori, wilayah, dan produk terlaris</w:t>
       </w:r>
     </w:p>
     <w:p>
@@ -3465,15 +6753,59 @@
         <w:spacing w:after="120" w:before="240"/>
       </w:pPr>
       <w:r>
-        <w:t xml:space="preserve">8. Langkah Selanjutnya</w:t>
+        <w:t xml:space="preserve">8. Rekomendasi</w:t>
       </w:r>
     </w:p>
     <w:p>
       <w:pPr>
-        <w:spacing w:after="120"/>
+        <w:pStyle w:val="ListParagraph"/>
+        <w:numPr>
+          <w:ilvl w:val="0"/>
+          <w:numId w:val="2"/>
+        </w:numPr>
+        <w:spacing w:after="60"/>
       </w:pPr>
       <w:r>
-        <w:t xml:space="preserve">Upload file evermart_online_transactions.xlsx atau export tabel Transactions dari Power BI ke CSV. Setelah itu dapat dihitung jumlah baris transaksi, total revenue, produk dan region terlaris, serta tren bulanan, lalu bagian 2, 6, dan 7 dilengkapi.</w:t>
+        <w:t xml:space="preserve">Prioritaskan South America untuk promosi dan stok.</w:t>
+      </w:r>
+    </w:p>
+    <w:p>
+      <w:pPr>
+        <w:pStyle w:val="ListParagraph"/>
+        <w:numPr>
+          <w:ilvl w:val="0"/>
+          <w:numId w:val="2"/>
+        </w:numPr>
+        <w:spacing w:after="60"/>
+      </w:pPr>
+      <w:r>
+        <w:t xml:space="preserve">Jaga stok produk terlaris dan dorong Books serta Electronics; beri bundling atau diskon untuk Home Decor.</w:t>
+      </w:r>
+    </w:p>
+    <w:p>
+      <w:pPr>
+        <w:pStyle w:val="ListParagraph"/>
+        <w:numPr>
+          <w:ilvl w:val="0"/>
+          <w:numId w:val="2"/>
+        </w:numPr>
+        <w:spacing w:after="60"/>
+      </w:pPr>
+      <w:r>
+        <w:t xml:space="preserve">Siapkan promo untuk Oktober dan November saat revenue turun.</w:t>
+      </w:r>
+    </w:p>
+    <w:p>
+      <w:pPr>
+        <w:pStyle w:val="ListParagraph"/>
+        <w:numPr>
+          <w:ilvl w:val="0"/>
+          <w:numId w:val="2"/>
+        </w:numPr>
+        <w:spacing w:after="60"/>
+      </w:pPr>
+      <w:r>
+        <w:t xml:space="preserve">Buat program loyalitas untuk pelanggan teratas dan rapikan nama produk agar sesuai kategori.</w:t>
       </w:r>
     </w:p>
     <w:sectPr>

</xml_diff>

<commit_message>
Add customer behavior analysis section to Word report
Co-Authored-By: Claude Sonnet 5.5 <noreply@anthropic.com>
Claude-Session: https://claude.ai/code/session_017RLvirTSx84UWnroqbbqTM
</commit_message>
<xml_diff>
--- a/output/Laporan_Data_EverMart.docx
+++ b/output/Laporan_Data_EverMart.docx
@@ -6564,7 +6564,1626 @@
         <w:spacing w:after="120" w:before="240"/>
       </w:pPr>
       <w:r>
-        <w:t xml:space="preserve">6. Isi Dashboard Power BI</w:t>
+        <w:t xml:space="preserve">6. Analisis Perilaku Pelanggan</w:t>
+      </w:r>
+    </w:p>
+    <w:p>
+      <w:pPr>
+        <w:pStyle w:val="Heading2"/>
+        <w:spacing w:after="120" w:before="240"/>
+      </w:pPr>
+      <w:r>
+        <w:t xml:space="preserve">6.1 Tujuan</w:t>
+      </w:r>
+    </w:p>
+    <w:p>
+      <w:pPr>
+        <w:spacing w:after="120"/>
+      </w:pPr>
+      <w:r>
+        <w:t xml:space="preserve">Bagian ini menyajikan sebaran pelanggan dan nilai belanjanya menurut wilayah. Dua indikator digunakan, yaitu jumlah pelanggan aktif dan rata-rata pendapatan per pelanggan. Analisis ini sejalan dengan halaman Laporan Perilaku Pelanggan pada dashboard Power BI.</w:t>
+      </w:r>
+    </w:p>
+    <w:p>
+      <w:pPr>
+        <w:pStyle w:val="Heading2"/>
+        <w:spacing w:after="120" w:before="240"/>
+      </w:pPr>
+      <w:r>
+        <w:t xml:space="preserve">6.2 Jumlah Pelanggan</w:t>
+      </w:r>
+    </w:p>
+    <w:p>
+      <w:pPr>
+        <w:spacing w:after="120"/>
+      </w:pPr>
+      <w:r>
+        <w:t xml:space="preserve">Basis data memuat 200 pelanggan terdaftar. Dari jumlah tersebut, 199 pelanggan aktif, yaitu pelanggan yang melakukan minimal satu transaksi. Satu pelanggan (C0180, wilayah Asia, terdaftar pada 25 Oktober 2023) tidak pernah bertransaksi, sehingga tingkat aktivasi pelanggan mencapai 99,5%.</w:t>
+      </w:r>
+    </w:p>
+    <w:tbl>
+      <w:tblPr>
+        <w:tblW w:type="dxa" w:w="9360"/>
+        <w:tblBorders>
+          <w:top w:val="single" w:color="auto" w:sz="4"/>
+          <w:left w:val="single" w:color="auto" w:sz="4"/>
+          <w:bottom w:val="single" w:color="auto" w:sz="4"/>
+          <w:right w:val="single" w:color="auto" w:sz="4"/>
+          <w:insideH w:val="single" w:color="auto" w:sz="4"/>
+          <w:insideV w:val="single" w:color="auto" w:sz="4"/>
+        </w:tblBorders>
+      </w:tblPr>
+      <w:tblGrid>
+        <w:gridCol w:w="2760"/>
+        <w:gridCol w:w="2000"/>
+        <w:gridCol w:w="2000"/>
+        <w:gridCol w:w="2600"/>
+      </w:tblGrid>
+      <w:tr>
+        <w:trPr>
+          <w:tblHeader/>
+        </w:trPr>
+        <w:tc>
+          <w:tcPr>
+            <w:tcW w:type="dxa" w:w="2760"/>
+            <w:tcBorders>
+              <w:top w:val="single" w:color="BBBBBB" w:sz="4"/>
+              <w:left w:val="single" w:color="BBBBBB" w:sz="4"/>
+              <w:bottom w:val="single" w:color="BBBBBB" w:sz="4"/>
+              <w:right w:val="single" w:color="BBBBBB" w:sz="4"/>
+            </w:tcBorders>
+            <w:shd w:fill="1F4E79" w:color="auto" w:val="clear"/>
+            <w:tcMar>
+              <w:top w:type="dxa" w:w="60"/>
+              <w:left w:type="dxa" w:w="100"/>
+              <w:bottom w:type="dxa" w:w="60"/>
+              <w:right w:type="dxa" w:w="100"/>
+            </w:tcMar>
+          </w:tcPr>
+          <w:p>
+            <w:r>
+              <w:rPr>
+                <w:b/>
+                <w:bCs/>
+                <w:color w:val="FFFFFF"/>
+                <w:sz w:val="20"/>
+                <w:szCs w:val="20"/>
+              </w:rPr>
+              <w:t xml:space="preserve">Wilayah</w:t>
+            </w:r>
+          </w:p>
+        </w:tc>
+        <w:tc>
+          <w:tcPr>
+            <w:tcW w:type="dxa" w:w="2000"/>
+            <w:tcBorders>
+              <w:top w:val="single" w:color="BBBBBB" w:sz="4"/>
+              <w:left w:val="single" w:color="BBBBBB" w:sz="4"/>
+              <w:bottom w:val="single" w:color="BBBBBB" w:sz="4"/>
+              <w:right w:val="single" w:color="BBBBBB" w:sz="4"/>
+            </w:tcBorders>
+            <w:shd w:fill="1F4E79" w:color="auto" w:val="clear"/>
+            <w:tcMar>
+              <w:top w:type="dxa" w:w="60"/>
+              <w:left w:type="dxa" w:w="100"/>
+              <w:bottom w:type="dxa" w:w="60"/>
+              <w:right w:type="dxa" w:w="100"/>
+            </w:tcMar>
+          </w:tcPr>
+          <w:p>
+            <w:r>
+              <w:rPr>
+                <w:b/>
+                <w:bCs/>
+                <w:color w:val="FFFFFF"/>
+                <w:sz w:val="20"/>
+                <w:szCs w:val="20"/>
+              </w:rPr>
+              <w:t xml:space="preserve">Terdaftar</w:t>
+            </w:r>
+          </w:p>
+        </w:tc>
+        <w:tc>
+          <w:tcPr>
+            <w:tcW w:type="dxa" w:w="2000"/>
+            <w:tcBorders>
+              <w:top w:val="single" w:color="BBBBBB" w:sz="4"/>
+              <w:left w:val="single" w:color="BBBBBB" w:sz="4"/>
+              <w:bottom w:val="single" w:color="BBBBBB" w:sz="4"/>
+              <w:right w:val="single" w:color="BBBBBB" w:sz="4"/>
+            </w:tcBorders>
+            <w:shd w:fill="1F4E79" w:color="auto" w:val="clear"/>
+            <w:tcMar>
+              <w:top w:type="dxa" w:w="60"/>
+              <w:left w:type="dxa" w:w="100"/>
+              <w:bottom w:type="dxa" w:w="60"/>
+              <w:right w:type="dxa" w:w="100"/>
+            </w:tcMar>
+          </w:tcPr>
+          <w:p>
+            <w:r>
+              <w:rPr>
+                <w:b/>
+                <w:bCs/>
+                <w:color w:val="FFFFFF"/>
+                <w:sz w:val="20"/>
+                <w:szCs w:val="20"/>
+              </w:rPr>
+              <w:t xml:space="preserve">Aktif</w:t>
+            </w:r>
+          </w:p>
+        </w:tc>
+        <w:tc>
+          <w:tcPr>
+            <w:tcW w:type="dxa" w:w="2600"/>
+            <w:tcBorders>
+              <w:top w:val="single" w:color="BBBBBB" w:sz="4"/>
+              <w:left w:val="single" w:color="BBBBBB" w:sz="4"/>
+              <w:bottom w:val="single" w:color="BBBBBB" w:sz="4"/>
+              <w:right w:val="single" w:color="BBBBBB" w:sz="4"/>
+            </w:tcBorders>
+            <w:shd w:fill="1F4E79" w:color="auto" w:val="clear"/>
+            <w:tcMar>
+              <w:top w:type="dxa" w:w="60"/>
+              <w:left w:type="dxa" w:w="100"/>
+              <w:bottom w:type="dxa" w:w="60"/>
+              <w:right w:type="dxa" w:w="100"/>
+            </w:tcMar>
+          </w:tcPr>
+          <w:p>
+            <w:r>
+              <w:rPr>
+                <w:b/>
+                <w:bCs/>
+                <w:color w:val="FFFFFF"/>
+                <w:sz w:val="20"/>
+                <w:szCs w:val="20"/>
+              </w:rPr>
+              <w:t xml:space="preserve">Proporsi pelanggan aktif</w:t>
+            </w:r>
+          </w:p>
+        </w:tc>
+      </w:tr>
+      <w:tr>
+        <w:trPr>
+          <w:tblHeader w:val="false"/>
+        </w:trPr>
+        <w:tc>
+          <w:tcPr>
+            <w:tcW w:type="dxa" w:w="2760"/>
+            <w:tcBorders>
+              <w:top w:val="single" w:color="BBBBBB" w:sz="4"/>
+              <w:left w:val="single" w:color="BBBBBB" w:sz="4"/>
+              <w:bottom w:val="single" w:color="BBBBBB" w:sz="4"/>
+              <w:right w:val="single" w:color="BBBBBB" w:sz="4"/>
+            </w:tcBorders>
+            <w:tcMar>
+              <w:top w:type="dxa" w:w="60"/>
+              <w:left w:type="dxa" w:w="100"/>
+              <w:bottom w:type="dxa" w:w="60"/>
+              <w:right w:type="dxa" w:w="100"/>
+            </w:tcMar>
+          </w:tcPr>
+          <w:p>
+            <w:r>
+              <w:rPr>
+                <w:b w:val="false"/>
+                <w:bCs w:val="false"/>
+                <w:sz w:val="20"/>
+                <w:szCs w:val="20"/>
+              </w:rPr>
+              <w:t xml:space="preserve">South America</w:t>
+            </w:r>
+          </w:p>
+        </w:tc>
+        <w:tc>
+          <w:tcPr>
+            <w:tcW w:type="dxa" w:w="2000"/>
+            <w:tcBorders>
+              <w:top w:val="single" w:color="BBBBBB" w:sz="4"/>
+              <w:left w:val="single" w:color="BBBBBB" w:sz="4"/>
+              <w:bottom w:val="single" w:color="BBBBBB" w:sz="4"/>
+              <w:right w:val="single" w:color="BBBBBB" w:sz="4"/>
+            </w:tcBorders>
+            <w:tcMar>
+              <w:top w:type="dxa" w:w="60"/>
+              <w:left w:type="dxa" w:w="100"/>
+              <w:bottom w:type="dxa" w:w="60"/>
+              <w:right w:type="dxa" w:w="100"/>
+            </w:tcMar>
+          </w:tcPr>
+          <w:p>
+            <w:r>
+              <w:rPr>
+                <w:b w:val="false"/>
+                <w:bCs w:val="false"/>
+                <w:sz w:val="20"/>
+                <w:szCs w:val="20"/>
+              </w:rPr>
+              <w:t xml:space="preserve">59</w:t>
+            </w:r>
+          </w:p>
+        </w:tc>
+        <w:tc>
+          <w:tcPr>
+            <w:tcW w:type="dxa" w:w="2000"/>
+            <w:tcBorders>
+              <w:top w:val="single" w:color="BBBBBB" w:sz="4"/>
+              <w:left w:val="single" w:color="BBBBBB" w:sz="4"/>
+              <w:bottom w:val="single" w:color="BBBBBB" w:sz="4"/>
+              <w:right w:val="single" w:color="BBBBBB" w:sz="4"/>
+            </w:tcBorders>
+            <w:tcMar>
+              <w:top w:type="dxa" w:w="60"/>
+              <w:left w:type="dxa" w:w="100"/>
+              <w:bottom w:type="dxa" w:w="60"/>
+              <w:right w:type="dxa" w:w="100"/>
+            </w:tcMar>
+          </w:tcPr>
+          <w:p>
+            <w:r>
+              <w:rPr>
+                <w:b w:val="false"/>
+                <w:bCs w:val="false"/>
+                <w:sz w:val="20"/>
+                <w:szCs w:val="20"/>
+              </w:rPr>
+              <w:t xml:space="preserve">59</w:t>
+            </w:r>
+          </w:p>
+        </w:tc>
+        <w:tc>
+          <w:tcPr>
+            <w:tcW w:type="dxa" w:w="2600"/>
+            <w:tcBorders>
+              <w:top w:val="single" w:color="BBBBBB" w:sz="4"/>
+              <w:left w:val="single" w:color="BBBBBB" w:sz="4"/>
+              <w:bottom w:val="single" w:color="BBBBBB" w:sz="4"/>
+              <w:right w:val="single" w:color="BBBBBB" w:sz="4"/>
+            </w:tcBorders>
+            <w:tcMar>
+              <w:top w:type="dxa" w:w="60"/>
+              <w:left w:type="dxa" w:w="100"/>
+              <w:bottom w:type="dxa" w:w="60"/>
+              <w:right w:type="dxa" w:w="100"/>
+            </w:tcMar>
+          </w:tcPr>
+          <w:p>
+            <w:r>
+              <w:rPr>
+                <w:b w:val="false"/>
+                <w:bCs w:val="false"/>
+                <w:sz w:val="20"/>
+                <w:szCs w:val="20"/>
+              </w:rPr>
+              <w:t xml:space="preserve">29,6%</w:t>
+            </w:r>
+          </w:p>
+        </w:tc>
+      </w:tr>
+      <w:tr>
+        <w:trPr>
+          <w:tblHeader w:val="false"/>
+        </w:trPr>
+        <w:tc>
+          <w:tcPr>
+            <w:tcW w:type="dxa" w:w="2760"/>
+            <w:tcBorders>
+              <w:top w:val="single" w:color="BBBBBB" w:sz="4"/>
+              <w:left w:val="single" w:color="BBBBBB" w:sz="4"/>
+              <w:bottom w:val="single" w:color="BBBBBB" w:sz="4"/>
+              <w:right w:val="single" w:color="BBBBBB" w:sz="4"/>
+            </w:tcBorders>
+            <w:tcMar>
+              <w:top w:type="dxa" w:w="60"/>
+              <w:left w:type="dxa" w:w="100"/>
+              <w:bottom w:type="dxa" w:w="60"/>
+              <w:right w:type="dxa" w:w="100"/>
+            </w:tcMar>
+          </w:tcPr>
+          <w:p>
+            <w:r>
+              <w:rPr>
+                <w:b w:val="false"/>
+                <w:bCs w:val="false"/>
+                <w:sz w:val="20"/>
+                <w:szCs w:val="20"/>
+              </w:rPr>
+              <w:t xml:space="preserve">Europe</w:t>
+            </w:r>
+          </w:p>
+        </w:tc>
+        <w:tc>
+          <w:tcPr>
+            <w:tcW w:type="dxa" w:w="2000"/>
+            <w:tcBorders>
+              <w:top w:val="single" w:color="BBBBBB" w:sz="4"/>
+              <w:left w:val="single" w:color="BBBBBB" w:sz="4"/>
+              <w:bottom w:val="single" w:color="BBBBBB" w:sz="4"/>
+              <w:right w:val="single" w:color="BBBBBB" w:sz="4"/>
+            </w:tcBorders>
+            <w:tcMar>
+              <w:top w:type="dxa" w:w="60"/>
+              <w:left w:type="dxa" w:w="100"/>
+              <w:bottom w:type="dxa" w:w="60"/>
+              <w:right w:type="dxa" w:w="100"/>
+            </w:tcMar>
+          </w:tcPr>
+          <w:p>
+            <w:r>
+              <w:rPr>
+                <w:b w:val="false"/>
+                <w:bCs w:val="false"/>
+                <w:sz w:val="20"/>
+                <w:szCs w:val="20"/>
+              </w:rPr>
+              <w:t xml:space="preserve">50</w:t>
+            </w:r>
+          </w:p>
+        </w:tc>
+        <w:tc>
+          <w:tcPr>
+            <w:tcW w:type="dxa" w:w="2000"/>
+            <w:tcBorders>
+              <w:top w:val="single" w:color="BBBBBB" w:sz="4"/>
+              <w:left w:val="single" w:color="BBBBBB" w:sz="4"/>
+              <w:bottom w:val="single" w:color="BBBBBB" w:sz="4"/>
+              <w:right w:val="single" w:color="BBBBBB" w:sz="4"/>
+            </w:tcBorders>
+            <w:tcMar>
+              <w:top w:type="dxa" w:w="60"/>
+              <w:left w:type="dxa" w:w="100"/>
+              <w:bottom w:type="dxa" w:w="60"/>
+              <w:right w:type="dxa" w:w="100"/>
+            </w:tcMar>
+          </w:tcPr>
+          <w:p>
+            <w:r>
+              <w:rPr>
+                <w:b w:val="false"/>
+                <w:bCs w:val="false"/>
+                <w:sz w:val="20"/>
+                <w:szCs w:val="20"/>
+              </w:rPr>
+              <w:t xml:space="preserve">50</w:t>
+            </w:r>
+          </w:p>
+        </w:tc>
+        <w:tc>
+          <w:tcPr>
+            <w:tcW w:type="dxa" w:w="2600"/>
+            <w:tcBorders>
+              <w:top w:val="single" w:color="BBBBBB" w:sz="4"/>
+              <w:left w:val="single" w:color="BBBBBB" w:sz="4"/>
+              <w:bottom w:val="single" w:color="BBBBBB" w:sz="4"/>
+              <w:right w:val="single" w:color="BBBBBB" w:sz="4"/>
+            </w:tcBorders>
+            <w:tcMar>
+              <w:top w:type="dxa" w:w="60"/>
+              <w:left w:type="dxa" w:w="100"/>
+              <w:bottom w:type="dxa" w:w="60"/>
+              <w:right w:type="dxa" w:w="100"/>
+            </w:tcMar>
+          </w:tcPr>
+          <w:p>
+            <w:r>
+              <w:rPr>
+                <w:b w:val="false"/>
+                <w:bCs w:val="false"/>
+                <w:sz w:val="20"/>
+                <w:szCs w:val="20"/>
+              </w:rPr>
+              <w:t xml:space="preserve">25,1%</w:t>
+            </w:r>
+          </w:p>
+        </w:tc>
+      </w:tr>
+      <w:tr>
+        <w:trPr>
+          <w:tblHeader w:val="false"/>
+        </w:trPr>
+        <w:tc>
+          <w:tcPr>
+            <w:tcW w:type="dxa" w:w="2760"/>
+            <w:tcBorders>
+              <w:top w:val="single" w:color="BBBBBB" w:sz="4"/>
+              <w:left w:val="single" w:color="BBBBBB" w:sz="4"/>
+              <w:bottom w:val="single" w:color="BBBBBB" w:sz="4"/>
+              <w:right w:val="single" w:color="BBBBBB" w:sz="4"/>
+            </w:tcBorders>
+            <w:tcMar>
+              <w:top w:type="dxa" w:w="60"/>
+              <w:left w:type="dxa" w:w="100"/>
+              <w:bottom w:type="dxa" w:w="60"/>
+              <w:right w:type="dxa" w:w="100"/>
+            </w:tcMar>
+          </w:tcPr>
+          <w:p>
+            <w:r>
+              <w:rPr>
+                <w:b w:val="false"/>
+                <w:bCs w:val="false"/>
+                <w:sz w:val="20"/>
+                <w:szCs w:val="20"/>
+              </w:rPr>
+              <w:t xml:space="preserve">North America</w:t>
+            </w:r>
+          </w:p>
+        </w:tc>
+        <w:tc>
+          <w:tcPr>
+            <w:tcW w:type="dxa" w:w="2000"/>
+            <w:tcBorders>
+              <w:top w:val="single" w:color="BBBBBB" w:sz="4"/>
+              <w:left w:val="single" w:color="BBBBBB" w:sz="4"/>
+              <w:bottom w:val="single" w:color="BBBBBB" w:sz="4"/>
+              <w:right w:val="single" w:color="BBBBBB" w:sz="4"/>
+            </w:tcBorders>
+            <w:tcMar>
+              <w:top w:type="dxa" w:w="60"/>
+              <w:left w:type="dxa" w:w="100"/>
+              <w:bottom w:type="dxa" w:w="60"/>
+              <w:right w:type="dxa" w:w="100"/>
+            </w:tcMar>
+          </w:tcPr>
+          <w:p>
+            <w:r>
+              <w:rPr>
+                <w:b w:val="false"/>
+                <w:bCs w:val="false"/>
+                <w:sz w:val="20"/>
+                <w:szCs w:val="20"/>
+              </w:rPr>
+              <w:t xml:space="preserve">46</w:t>
+            </w:r>
+          </w:p>
+        </w:tc>
+        <w:tc>
+          <w:tcPr>
+            <w:tcW w:type="dxa" w:w="2000"/>
+            <w:tcBorders>
+              <w:top w:val="single" w:color="BBBBBB" w:sz="4"/>
+              <w:left w:val="single" w:color="BBBBBB" w:sz="4"/>
+              <w:bottom w:val="single" w:color="BBBBBB" w:sz="4"/>
+              <w:right w:val="single" w:color="BBBBBB" w:sz="4"/>
+            </w:tcBorders>
+            <w:tcMar>
+              <w:top w:type="dxa" w:w="60"/>
+              <w:left w:type="dxa" w:w="100"/>
+              <w:bottom w:type="dxa" w:w="60"/>
+              <w:right w:type="dxa" w:w="100"/>
+            </w:tcMar>
+          </w:tcPr>
+          <w:p>
+            <w:r>
+              <w:rPr>
+                <w:b w:val="false"/>
+                <w:bCs w:val="false"/>
+                <w:sz w:val="20"/>
+                <w:szCs w:val="20"/>
+              </w:rPr>
+              <w:t xml:space="preserve">46</w:t>
+            </w:r>
+          </w:p>
+        </w:tc>
+        <w:tc>
+          <w:tcPr>
+            <w:tcW w:type="dxa" w:w="2600"/>
+            <w:tcBorders>
+              <w:top w:val="single" w:color="BBBBBB" w:sz="4"/>
+              <w:left w:val="single" w:color="BBBBBB" w:sz="4"/>
+              <w:bottom w:val="single" w:color="BBBBBB" w:sz="4"/>
+              <w:right w:val="single" w:color="BBBBBB" w:sz="4"/>
+            </w:tcBorders>
+            <w:tcMar>
+              <w:top w:type="dxa" w:w="60"/>
+              <w:left w:type="dxa" w:w="100"/>
+              <w:bottom w:type="dxa" w:w="60"/>
+              <w:right w:type="dxa" w:w="100"/>
+            </w:tcMar>
+          </w:tcPr>
+          <w:p>
+            <w:r>
+              <w:rPr>
+                <w:b w:val="false"/>
+                <w:bCs w:val="false"/>
+                <w:sz w:val="20"/>
+                <w:szCs w:val="20"/>
+              </w:rPr>
+              <w:t xml:space="preserve">23,1%</w:t>
+            </w:r>
+          </w:p>
+        </w:tc>
+      </w:tr>
+      <w:tr>
+        <w:trPr>
+          <w:tblHeader w:val="false"/>
+        </w:trPr>
+        <w:tc>
+          <w:tcPr>
+            <w:tcW w:type="dxa" w:w="2760"/>
+            <w:tcBorders>
+              <w:top w:val="single" w:color="BBBBBB" w:sz="4"/>
+              <w:left w:val="single" w:color="BBBBBB" w:sz="4"/>
+              <w:bottom w:val="single" w:color="BBBBBB" w:sz="4"/>
+              <w:right w:val="single" w:color="BBBBBB" w:sz="4"/>
+            </w:tcBorders>
+            <w:tcMar>
+              <w:top w:type="dxa" w:w="60"/>
+              <w:left w:type="dxa" w:w="100"/>
+              <w:bottom w:type="dxa" w:w="60"/>
+              <w:right w:type="dxa" w:w="100"/>
+            </w:tcMar>
+          </w:tcPr>
+          <w:p>
+            <w:r>
+              <w:rPr>
+                <w:b w:val="false"/>
+                <w:bCs w:val="false"/>
+                <w:sz w:val="20"/>
+                <w:szCs w:val="20"/>
+              </w:rPr>
+              <w:t xml:space="preserve">Asia</w:t>
+            </w:r>
+          </w:p>
+        </w:tc>
+        <w:tc>
+          <w:tcPr>
+            <w:tcW w:type="dxa" w:w="2000"/>
+            <w:tcBorders>
+              <w:top w:val="single" w:color="BBBBBB" w:sz="4"/>
+              <w:left w:val="single" w:color="BBBBBB" w:sz="4"/>
+              <w:bottom w:val="single" w:color="BBBBBB" w:sz="4"/>
+              <w:right w:val="single" w:color="BBBBBB" w:sz="4"/>
+            </w:tcBorders>
+            <w:tcMar>
+              <w:top w:type="dxa" w:w="60"/>
+              <w:left w:type="dxa" w:w="100"/>
+              <w:bottom w:type="dxa" w:w="60"/>
+              <w:right w:type="dxa" w:w="100"/>
+            </w:tcMar>
+          </w:tcPr>
+          <w:p>
+            <w:r>
+              <w:rPr>
+                <w:b w:val="false"/>
+                <w:bCs w:val="false"/>
+                <w:sz w:val="20"/>
+                <w:szCs w:val="20"/>
+              </w:rPr>
+              <w:t xml:space="preserve">45</w:t>
+            </w:r>
+          </w:p>
+        </w:tc>
+        <w:tc>
+          <w:tcPr>
+            <w:tcW w:type="dxa" w:w="2000"/>
+            <w:tcBorders>
+              <w:top w:val="single" w:color="BBBBBB" w:sz="4"/>
+              <w:left w:val="single" w:color="BBBBBB" w:sz="4"/>
+              <w:bottom w:val="single" w:color="BBBBBB" w:sz="4"/>
+              <w:right w:val="single" w:color="BBBBBB" w:sz="4"/>
+            </w:tcBorders>
+            <w:tcMar>
+              <w:top w:type="dxa" w:w="60"/>
+              <w:left w:type="dxa" w:w="100"/>
+              <w:bottom w:type="dxa" w:w="60"/>
+              <w:right w:type="dxa" w:w="100"/>
+            </w:tcMar>
+          </w:tcPr>
+          <w:p>
+            <w:r>
+              <w:rPr>
+                <w:b w:val="false"/>
+                <w:bCs w:val="false"/>
+                <w:sz w:val="20"/>
+                <w:szCs w:val="20"/>
+              </w:rPr>
+              <w:t xml:space="preserve">44</w:t>
+            </w:r>
+          </w:p>
+        </w:tc>
+        <w:tc>
+          <w:tcPr>
+            <w:tcW w:type="dxa" w:w="2600"/>
+            <w:tcBorders>
+              <w:top w:val="single" w:color="BBBBBB" w:sz="4"/>
+              <w:left w:val="single" w:color="BBBBBB" w:sz="4"/>
+              <w:bottom w:val="single" w:color="BBBBBB" w:sz="4"/>
+              <w:right w:val="single" w:color="BBBBBB" w:sz="4"/>
+            </w:tcBorders>
+            <w:tcMar>
+              <w:top w:type="dxa" w:w="60"/>
+              <w:left w:type="dxa" w:w="100"/>
+              <w:bottom w:type="dxa" w:w="60"/>
+              <w:right w:type="dxa" w:w="100"/>
+            </w:tcMar>
+          </w:tcPr>
+          <w:p>
+            <w:r>
+              <w:rPr>
+                <w:b w:val="false"/>
+                <w:bCs w:val="false"/>
+                <w:sz w:val="20"/>
+                <w:szCs w:val="20"/>
+              </w:rPr>
+              <w:t xml:space="preserve">22,1%</w:t>
+            </w:r>
+          </w:p>
+        </w:tc>
+      </w:tr>
+      <w:tr>
+        <w:trPr>
+          <w:tblHeader w:val="false"/>
+        </w:trPr>
+        <w:tc>
+          <w:tcPr>
+            <w:tcW w:type="dxa" w:w="2760"/>
+            <w:tcBorders>
+              <w:top w:val="single" w:color="BBBBBB" w:sz="4"/>
+              <w:left w:val="single" w:color="BBBBBB" w:sz="4"/>
+              <w:bottom w:val="single" w:color="BBBBBB" w:sz="4"/>
+              <w:right w:val="single" w:color="BBBBBB" w:sz="4"/>
+            </w:tcBorders>
+            <w:tcMar>
+              <w:top w:type="dxa" w:w="60"/>
+              <w:left w:type="dxa" w:w="100"/>
+              <w:bottom w:type="dxa" w:w="60"/>
+              <w:right w:type="dxa" w:w="100"/>
+            </w:tcMar>
+          </w:tcPr>
+          <w:p>
+            <w:r>
+              <w:rPr>
+                <w:b w:val="false"/>
+                <w:bCs w:val="false"/>
+                <w:sz w:val="20"/>
+                <w:szCs w:val="20"/>
+              </w:rPr>
+              <w:t xml:space="preserve">Total</w:t>
+            </w:r>
+          </w:p>
+        </w:tc>
+        <w:tc>
+          <w:tcPr>
+            <w:tcW w:type="dxa" w:w="2000"/>
+            <w:tcBorders>
+              <w:top w:val="single" w:color="BBBBBB" w:sz="4"/>
+              <w:left w:val="single" w:color="BBBBBB" w:sz="4"/>
+              <w:bottom w:val="single" w:color="BBBBBB" w:sz="4"/>
+              <w:right w:val="single" w:color="BBBBBB" w:sz="4"/>
+            </w:tcBorders>
+            <w:tcMar>
+              <w:top w:type="dxa" w:w="60"/>
+              <w:left w:type="dxa" w:w="100"/>
+              <w:bottom w:type="dxa" w:w="60"/>
+              <w:right w:type="dxa" w:w="100"/>
+            </w:tcMar>
+          </w:tcPr>
+          <w:p>
+            <w:r>
+              <w:rPr>
+                <w:b w:val="false"/>
+                <w:bCs w:val="false"/>
+                <w:sz w:val="20"/>
+                <w:szCs w:val="20"/>
+              </w:rPr>
+              <w:t xml:space="preserve">200</w:t>
+            </w:r>
+          </w:p>
+        </w:tc>
+        <w:tc>
+          <w:tcPr>
+            <w:tcW w:type="dxa" w:w="2000"/>
+            <w:tcBorders>
+              <w:top w:val="single" w:color="BBBBBB" w:sz="4"/>
+              <w:left w:val="single" w:color="BBBBBB" w:sz="4"/>
+              <w:bottom w:val="single" w:color="BBBBBB" w:sz="4"/>
+              <w:right w:val="single" w:color="BBBBBB" w:sz="4"/>
+            </w:tcBorders>
+            <w:tcMar>
+              <w:top w:type="dxa" w:w="60"/>
+              <w:left w:type="dxa" w:w="100"/>
+              <w:bottom w:type="dxa" w:w="60"/>
+              <w:right w:type="dxa" w:w="100"/>
+            </w:tcMar>
+          </w:tcPr>
+          <w:p>
+            <w:r>
+              <w:rPr>
+                <w:b w:val="false"/>
+                <w:bCs w:val="false"/>
+                <w:sz w:val="20"/>
+                <w:szCs w:val="20"/>
+              </w:rPr>
+              <w:t xml:space="preserve">199</w:t>
+            </w:r>
+          </w:p>
+        </w:tc>
+        <w:tc>
+          <w:tcPr>
+            <w:tcW w:type="dxa" w:w="2600"/>
+            <w:tcBorders>
+              <w:top w:val="single" w:color="BBBBBB" w:sz="4"/>
+              <w:left w:val="single" w:color="BBBBBB" w:sz="4"/>
+              <w:bottom w:val="single" w:color="BBBBBB" w:sz="4"/>
+              <w:right w:val="single" w:color="BBBBBB" w:sz="4"/>
+            </w:tcBorders>
+            <w:tcMar>
+              <w:top w:type="dxa" w:w="60"/>
+              <w:left w:type="dxa" w:w="100"/>
+              <w:bottom w:type="dxa" w:w="60"/>
+              <w:right w:type="dxa" w:w="100"/>
+            </w:tcMar>
+          </w:tcPr>
+          <w:p>
+            <w:r>
+              <w:rPr>
+                <w:b w:val="false"/>
+                <w:bCs w:val="false"/>
+                <w:sz w:val="20"/>
+                <w:szCs w:val="20"/>
+              </w:rPr>
+              <w:t xml:space="preserve">100%</w:t>
+            </w:r>
+          </w:p>
+        </w:tc>
+      </w:tr>
+    </w:tbl>
+    <w:p>
+      <w:pPr>
+        <w:spacing w:after="120"/>
+      </w:pPr>
+    </w:p>
+    <w:p>
+      <w:pPr>
+        <w:pStyle w:val="Heading2"/>
+        <w:spacing w:after="120" w:before="240"/>
+      </w:pPr>
+      <w:r>
+        <w:t xml:space="preserve">6.3 Nilai Belanja Pelanggan Aktif</w:t>
+      </w:r>
+    </w:p>
+    <w:p>
+      <w:pPr>
+        <w:spacing w:after="120"/>
+      </w:pPr>
+      <w:r>
+        <w:t xml:space="preserve">Total pendapatan sebesar 689.995,56, sehingga rata-rata belanja per pelanggan aktif adalah 3.467,31. Rata-rata pendapatan per pelanggan dihitung dengan measure DAX DIVIDE([Total Revenue], [Total Unique Customers]).</w:t>
+      </w:r>
+    </w:p>
+    <w:tbl>
+      <w:tblPr>
+        <w:tblW w:type="dxa" w:w="9360"/>
+        <w:tblBorders>
+          <w:top w:val="single" w:color="auto" w:sz="4"/>
+          <w:left w:val="single" w:color="auto" w:sz="4"/>
+          <w:bottom w:val="single" w:color="auto" w:sz="4"/>
+          <w:right w:val="single" w:color="auto" w:sz="4"/>
+          <w:insideH w:val="single" w:color="auto" w:sz="4"/>
+          <w:insideV w:val="single" w:color="auto" w:sz="4"/>
+        </w:tblBorders>
+      </w:tblPr>
+      <w:tblGrid>
+        <w:gridCol w:w="2160"/>
+        <w:gridCol w:w="2400"/>
+        <w:gridCol w:w="2500"/>
+        <w:gridCol w:w="2300"/>
+      </w:tblGrid>
+      <w:tr>
+        <w:trPr>
+          <w:tblHeader/>
+        </w:trPr>
+        <w:tc>
+          <w:tcPr>
+            <w:tcW w:type="dxa" w:w="2160"/>
+            <w:tcBorders>
+              <w:top w:val="single" w:color="BBBBBB" w:sz="4"/>
+              <w:left w:val="single" w:color="BBBBBB" w:sz="4"/>
+              <w:bottom w:val="single" w:color="BBBBBB" w:sz="4"/>
+              <w:right w:val="single" w:color="BBBBBB" w:sz="4"/>
+            </w:tcBorders>
+            <w:shd w:fill="1F4E79" w:color="auto" w:val="clear"/>
+            <w:tcMar>
+              <w:top w:type="dxa" w:w="60"/>
+              <w:left w:type="dxa" w:w="100"/>
+              <w:bottom w:type="dxa" w:w="60"/>
+              <w:right w:type="dxa" w:w="100"/>
+            </w:tcMar>
+          </w:tcPr>
+          <w:p>
+            <w:r>
+              <w:rPr>
+                <w:b/>
+                <w:bCs/>
+                <w:color w:val="FFFFFF"/>
+                <w:sz w:val="20"/>
+                <w:szCs w:val="20"/>
+              </w:rPr>
+              <w:t xml:space="preserve">Wilayah</w:t>
+            </w:r>
+          </w:p>
+        </w:tc>
+        <w:tc>
+          <w:tcPr>
+            <w:tcW w:type="dxa" w:w="2400"/>
+            <w:tcBorders>
+              <w:top w:val="single" w:color="BBBBBB" w:sz="4"/>
+              <w:left w:val="single" w:color="BBBBBB" w:sz="4"/>
+              <w:bottom w:val="single" w:color="BBBBBB" w:sz="4"/>
+              <w:right w:val="single" w:color="BBBBBB" w:sz="4"/>
+            </w:tcBorders>
+            <w:shd w:fill="1F4E79" w:color="auto" w:val="clear"/>
+            <w:tcMar>
+              <w:top w:type="dxa" w:w="60"/>
+              <w:left w:type="dxa" w:w="100"/>
+              <w:bottom w:type="dxa" w:w="60"/>
+              <w:right w:type="dxa" w:w="100"/>
+            </w:tcMar>
+          </w:tcPr>
+          <w:p>
+            <w:r>
+              <w:rPr>
+                <w:b/>
+                <w:bCs/>
+                <w:color w:val="FFFFFF"/>
+                <w:sz w:val="20"/>
+                <w:szCs w:val="20"/>
+              </w:rPr>
+              <w:t xml:space="preserve">Total pendapatan</w:t>
+            </w:r>
+          </w:p>
+        </w:tc>
+        <w:tc>
+          <w:tcPr>
+            <w:tcW w:type="dxa" w:w="2500"/>
+            <w:tcBorders>
+              <w:top w:val="single" w:color="BBBBBB" w:sz="4"/>
+              <w:left w:val="single" w:color="BBBBBB" w:sz="4"/>
+              <w:bottom w:val="single" w:color="BBBBBB" w:sz="4"/>
+              <w:right w:val="single" w:color="BBBBBB" w:sz="4"/>
+            </w:tcBorders>
+            <w:shd w:fill="1F4E79" w:color="auto" w:val="clear"/>
+            <w:tcMar>
+              <w:top w:type="dxa" w:w="60"/>
+              <w:left w:type="dxa" w:w="100"/>
+              <w:bottom w:type="dxa" w:w="60"/>
+              <w:right w:type="dxa" w:w="100"/>
+            </w:tcMar>
+          </w:tcPr>
+          <w:p>
+            <w:r>
+              <w:rPr>
+                <w:b/>
+                <w:bCs/>
+                <w:color w:val="FFFFFF"/>
+                <w:sz w:val="20"/>
+                <w:szCs w:val="20"/>
+              </w:rPr>
+              <w:t xml:space="preserve">Rata-rata belanja per pelanggan</w:t>
+            </w:r>
+          </w:p>
+        </w:tc>
+        <w:tc>
+          <w:tcPr>
+            <w:tcW w:type="dxa" w:w="2300"/>
+            <w:tcBorders>
+              <w:top w:val="single" w:color="BBBBBB" w:sz="4"/>
+              <w:left w:val="single" w:color="BBBBBB" w:sz="4"/>
+              <w:bottom w:val="single" w:color="BBBBBB" w:sz="4"/>
+              <w:right w:val="single" w:color="BBBBBB" w:sz="4"/>
+            </w:tcBorders>
+            <w:shd w:fill="1F4E79" w:color="auto" w:val="clear"/>
+            <w:tcMar>
+              <w:top w:type="dxa" w:w="60"/>
+              <w:left w:type="dxa" w:w="100"/>
+              <w:bottom w:type="dxa" w:w="60"/>
+              <w:right w:type="dxa" w:w="100"/>
+            </w:tcMar>
+          </w:tcPr>
+          <w:p>
+            <w:r>
+              <w:rPr>
+                <w:b/>
+                <w:bCs/>
+                <w:color w:val="FFFFFF"/>
+                <w:sz w:val="20"/>
+                <w:szCs w:val="20"/>
+              </w:rPr>
+              <w:t xml:space="preserve">Rata-rata transaksi per pelanggan</w:t>
+            </w:r>
+          </w:p>
+        </w:tc>
+      </w:tr>
+      <w:tr>
+        <w:trPr>
+          <w:tblHeader w:val="false"/>
+        </w:trPr>
+        <w:tc>
+          <w:tcPr>
+            <w:tcW w:type="dxa" w:w="2160"/>
+            <w:tcBorders>
+              <w:top w:val="single" w:color="BBBBBB" w:sz="4"/>
+              <w:left w:val="single" w:color="BBBBBB" w:sz="4"/>
+              <w:bottom w:val="single" w:color="BBBBBB" w:sz="4"/>
+              <w:right w:val="single" w:color="BBBBBB" w:sz="4"/>
+            </w:tcBorders>
+            <w:tcMar>
+              <w:top w:type="dxa" w:w="60"/>
+              <w:left w:type="dxa" w:w="100"/>
+              <w:bottom w:type="dxa" w:w="60"/>
+              <w:right w:type="dxa" w:w="100"/>
+            </w:tcMar>
+          </w:tcPr>
+          <w:p>
+            <w:r>
+              <w:rPr>
+                <w:b w:val="false"/>
+                <w:bCs w:val="false"/>
+                <w:sz w:val="20"/>
+                <w:szCs w:val="20"/>
+              </w:rPr>
+              <w:t xml:space="preserve">South America</w:t>
+            </w:r>
+          </w:p>
+        </w:tc>
+        <w:tc>
+          <w:tcPr>
+            <w:tcW w:type="dxa" w:w="2400"/>
+            <w:tcBorders>
+              <w:top w:val="single" w:color="BBBBBB" w:sz="4"/>
+              <w:left w:val="single" w:color="BBBBBB" w:sz="4"/>
+              <w:bottom w:val="single" w:color="BBBBBB" w:sz="4"/>
+              <w:right w:val="single" w:color="BBBBBB" w:sz="4"/>
+            </w:tcBorders>
+            <w:tcMar>
+              <w:top w:type="dxa" w:w="60"/>
+              <w:left w:type="dxa" w:w="100"/>
+              <w:bottom w:type="dxa" w:w="60"/>
+              <w:right w:type="dxa" w:w="100"/>
+            </w:tcMar>
+          </w:tcPr>
+          <w:p>
+            <w:r>
+              <w:rPr>
+                <w:b w:val="false"/>
+                <w:bCs w:val="false"/>
+                <w:sz w:val="20"/>
+                <w:szCs w:val="20"/>
+              </w:rPr>
+              <w:t xml:space="preserve">219.352,56</w:t>
+            </w:r>
+          </w:p>
+        </w:tc>
+        <w:tc>
+          <w:tcPr>
+            <w:tcW w:type="dxa" w:w="2500"/>
+            <w:tcBorders>
+              <w:top w:val="single" w:color="BBBBBB" w:sz="4"/>
+              <w:left w:val="single" w:color="BBBBBB" w:sz="4"/>
+              <w:bottom w:val="single" w:color="BBBBBB" w:sz="4"/>
+              <w:right w:val="single" w:color="BBBBBB" w:sz="4"/>
+            </w:tcBorders>
+            <w:tcMar>
+              <w:top w:type="dxa" w:w="60"/>
+              <w:left w:type="dxa" w:w="100"/>
+              <w:bottom w:type="dxa" w:w="60"/>
+              <w:right w:type="dxa" w:w="100"/>
+            </w:tcMar>
+          </w:tcPr>
+          <w:p>
+            <w:r>
+              <w:rPr>
+                <w:b w:val="false"/>
+                <w:bCs w:val="false"/>
+                <w:sz w:val="20"/>
+                <w:szCs w:val="20"/>
+              </w:rPr>
+              <w:t xml:space="preserve">3.717,84</w:t>
+            </w:r>
+          </w:p>
+        </w:tc>
+        <w:tc>
+          <w:tcPr>
+            <w:tcW w:type="dxa" w:w="2300"/>
+            <w:tcBorders>
+              <w:top w:val="single" w:color="BBBBBB" w:sz="4"/>
+              <w:left w:val="single" w:color="BBBBBB" w:sz="4"/>
+              <w:bottom w:val="single" w:color="BBBBBB" w:sz="4"/>
+              <w:right w:val="single" w:color="BBBBBB" w:sz="4"/>
+            </w:tcBorders>
+            <w:tcMar>
+              <w:top w:type="dxa" w:w="60"/>
+              <w:left w:type="dxa" w:w="100"/>
+              <w:bottom w:type="dxa" w:w="60"/>
+              <w:right w:type="dxa" w:w="100"/>
+            </w:tcMar>
+          </w:tcPr>
+          <w:p>
+            <w:r>
+              <w:rPr>
+                <w:b w:val="false"/>
+                <w:bCs w:val="false"/>
+                <w:sz w:val="20"/>
+                <w:szCs w:val="20"/>
+              </w:rPr>
+              <w:t xml:space="preserve">5,15</w:t>
+            </w:r>
+          </w:p>
+        </w:tc>
+      </w:tr>
+      <w:tr>
+        <w:trPr>
+          <w:tblHeader w:val="false"/>
+        </w:trPr>
+        <w:tc>
+          <w:tcPr>
+            <w:tcW w:type="dxa" w:w="2160"/>
+            <w:tcBorders>
+              <w:top w:val="single" w:color="BBBBBB" w:sz="4"/>
+              <w:left w:val="single" w:color="BBBBBB" w:sz="4"/>
+              <w:bottom w:val="single" w:color="BBBBBB" w:sz="4"/>
+              <w:right w:val="single" w:color="BBBBBB" w:sz="4"/>
+            </w:tcBorders>
+            <w:tcMar>
+              <w:top w:type="dxa" w:w="60"/>
+              <w:left w:type="dxa" w:w="100"/>
+              <w:bottom w:type="dxa" w:w="60"/>
+              <w:right w:type="dxa" w:w="100"/>
+            </w:tcMar>
+          </w:tcPr>
+          <w:p>
+            <w:r>
+              <w:rPr>
+                <w:b w:val="false"/>
+                <w:bCs w:val="false"/>
+                <w:sz w:val="20"/>
+                <w:szCs w:val="20"/>
+              </w:rPr>
+              <w:t xml:space="preserve">Asia</w:t>
+            </w:r>
+          </w:p>
+        </w:tc>
+        <w:tc>
+          <w:tcPr>
+            <w:tcW w:type="dxa" w:w="2400"/>
+            <w:tcBorders>
+              <w:top w:val="single" w:color="BBBBBB" w:sz="4"/>
+              <w:left w:val="single" w:color="BBBBBB" w:sz="4"/>
+              <w:bottom w:val="single" w:color="BBBBBB" w:sz="4"/>
+              <w:right w:val="single" w:color="BBBBBB" w:sz="4"/>
+            </w:tcBorders>
+            <w:tcMar>
+              <w:top w:type="dxa" w:w="60"/>
+              <w:left w:type="dxa" w:w="100"/>
+              <w:bottom w:type="dxa" w:w="60"/>
+              <w:right w:type="dxa" w:w="100"/>
+            </w:tcMar>
+          </w:tcPr>
+          <w:p>
+            <w:r>
+              <w:rPr>
+                <w:b w:val="false"/>
+                <w:bCs w:val="false"/>
+                <w:sz w:val="20"/>
+                <w:szCs w:val="20"/>
+              </w:rPr>
+              <w:t xml:space="preserve">152.074,97</w:t>
+            </w:r>
+          </w:p>
+        </w:tc>
+        <w:tc>
+          <w:tcPr>
+            <w:tcW w:type="dxa" w:w="2500"/>
+            <w:tcBorders>
+              <w:top w:val="single" w:color="BBBBBB" w:sz="4"/>
+              <w:left w:val="single" w:color="BBBBBB" w:sz="4"/>
+              <w:bottom w:val="single" w:color="BBBBBB" w:sz="4"/>
+              <w:right w:val="single" w:color="BBBBBB" w:sz="4"/>
+            </w:tcBorders>
+            <w:tcMar>
+              <w:top w:type="dxa" w:w="60"/>
+              <w:left w:type="dxa" w:w="100"/>
+              <w:bottom w:type="dxa" w:w="60"/>
+              <w:right w:type="dxa" w:w="100"/>
+            </w:tcMar>
+          </w:tcPr>
+          <w:p>
+            <w:r>
+              <w:rPr>
+                <w:b w:val="false"/>
+                <w:bCs w:val="false"/>
+                <w:sz w:val="20"/>
+                <w:szCs w:val="20"/>
+              </w:rPr>
+              <w:t xml:space="preserve">3.456,25</w:t>
+            </w:r>
+          </w:p>
+        </w:tc>
+        <w:tc>
+          <w:tcPr>
+            <w:tcW w:type="dxa" w:w="2300"/>
+            <w:tcBorders>
+              <w:top w:val="single" w:color="BBBBBB" w:sz="4"/>
+              <w:left w:val="single" w:color="BBBBBB" w:sz="4"/>
+              <w:bottom w:val="single" w:color="BBBBBB" w:sz="4"/>
+              <w:right w:val="single" w:color="BBBBBB" w:sz="4"/>
+            </w:tcBorders>
+            <w:tcMar>
+              <w:top w:type="dxa" w:w="60"/>
+              <w:left w:type="dxa" w:w="100"/>
+              <w:bottom w:type="dxa" w:w="60"/>
+              <w:right w:type="dxa" w:w="100"/>
+            </w:tcMar>
+          </w:tcPr>
+          <w:p>
+            <w:r>
+              <w:rPr>
+                <w:b w:val="false"/>
+                <w:bCs w:val="false"/>
+                <w:sz w:val="20"/>
+                <w:szCs w:val="20"/>
+              </w:rPr>
+              <w:t xml:space="preserve">4,95</w:t>
+            </w:r>
+          </w:p>
+        </w:tc>
+      </w:tr>
+      <w:tr>
+        <w:trPr>
+          <w:tblHeader w:val="false"/>
+        </w:trPr>
+        <w:tc>
+          <w:tcPr>
+            <w:tcW w:type="dxa" w:w="2160"/>
+            <w:tcBorders>
+              <w:top w:val="single" w:color="BBBBBB" w:sz="4"/>
+              <w:left w:val="single" w:color="BBBBBB" w:sz="4"/>
+              <w:bottom w:val="single" w:color="BBBBBB" w:sz="4"/>
+              <w:right w:val="single" w:color="BBBBBB" w:sz="4"/>
+            </w:tcBorders>
+            <w:tcMar>
+              <w:top w:type="dxa" w:w="60"/>
+              <w:left w:type="dxa" w:w="100"/>
+              <w:bottom w:type="dxa" w:w="60"/>
+              <w:right w:type="dxa" w:w="100"/>
+            </w:tcMar>
+          </w:tcPr>
+          <w:p>
+            <w:r>
+              <w:rPr>
+                <w:b w:val="false"/>
+                <w:bCs w:val="false"/>
+                <w:sz w:val="20"/>
+                <w:szCs w:val="20"/>
+              </w:rPr>
+              <w:t xml:space="preserve">Europe</w:t>
+            </w:r>
+          </w:p>
+        </w:tc>
+        <w:tc>
+          <w:tcPr>
+            <w:tcW w:type="dxa" w:w="2400"/>
+            <w:tcBorders>
+              <w:top w:val="single" w:color="BBBBBB" w:sz="4"/>
+              <w:left w:val="single" w:color="BBBBBB" w:sz="4"/>
+              <w:bottom w:val="single" w:color="BBBBBB" w:sz="4"/>
+              <w:right w:val="single" w:color="BBBBBB" w:sz="4"/>
+            </w:tcBorders>
+            <w:tcMar>
+              <w:top w:type="dxa" w:w="60"/>
+              <w:left w:type="dxa" w:w="100"/>
+              <w:bottom w:type="dxa" w:w="60"/>
+              <w:right w:type="dxa" w:w="100"/>
+            </w:tcMar>
+          </w:tcPr>
+          <w:p>
+            <w:r>
+              <w:rPr>
+                <w:b w:val="false"/>
+                <w:bCs w:val="false"/>
+                <w:sz w:val="20"/>
+                <w:szCs w:val="20"/>
+              </w:rPr>
+              <w:t xml:space="preserve">166.254,63</w:t>
+            </w:r>
+          </w:p>
+        </w:tc>
+        <w:tc>
+          <w:tcPr>
+            <w:tcW w:type="dxa" w:w="2500"/>
+            <w:tcBorders>
+              <w:top w:val="single" w:color="BBBBBB" w:sz="4"/>
+              <w:left w:val="single" w:color="BBBBBB" w:sz="4"/>
+              <w:bottom w:val="single" w:color="BBBBBB" w:sz="4"/>
+              <w:right w:val="single" w:color="BBBBBB" w:sz="4"/>
+            </w:tcBorders>
+            <w:tcMar>
+              <w:top w:type="dxa" w:w="60"/>
+              <w:left w:type="dxa" w:w="100"/>
+              <w:bottom w:type="dxa" w:w="60"/>
+              <w:right w:type="dxa" w:w="100"/>
+            </w:tcMar>
+          </w:tcPr>
+          <w:p>
+            <w:r>
+              <w:rPr>
+                <w:b w:val="false"/>
+                <w:bCs w:val="false"/>
+                <w:sz w:val="20"/>
+                <w:szCs w:val="20"/>
+              </w:rPr>
+              <w:t xml:space="preserve">3.325,09</w:t>
+            </w:r>
+          </w:p>
+        </w:tc>
+        <w:tc>
+          <w:tcPr>
+            <w:tcW w:type="dxa" w:w="2300"/>
+            <w:tcBorders>
+              <w:top w:val="single" w:color="BBBBBB" w:sz="4"/>
+              <w:left w:val="single" w:color="BBBBBB" w:sz="4"/>
+              <w:bottom w:val="single" w:color="BBBBBB" w:sz="4"/>
+              <w:right w:val="single" w:color="BBBBBB" w:sz="4"/>
+            </w:tcBorders>
+            <w:tcMar>
+              <w:top w:type="dxa" w:w="60"/>
+              <w:left w:type="dxa" w:w="100"/>
+              <w:bottom w:type="dxa" w:w="60"/>
+              <w:right w:type="dxa" w:w="100"/>
+            </w:tcMar>
+          </w:tcPr>
+          <w:p>
+            <w:r>
+              <w:rPr>
+                <w:b w:val="false"/>
+                <w:bCs w:val="false"/>
+                <w:sz w:val="20"/>
+                <w:szCs w:val="20"/>
+              </w:rPr>
+              <w:t xml:space="preserve">4,68</w:t>
+            </w:r>
+          </w:p>
+        </w:tc>
+      </w:tr>
+      <w:tr>
+        <w:trPr>
+          <w:tblHeader w:val="false"/>
+        </w:trPr>
+        <w:tc>
+          <w:tcPr>
+            <w:tcW w:type="dxa" w:w="2160"/>
+            <w:tcBorders>
+              <w:top w:val="single" w:color="BBBBBB" w:sz="4"/>
+              <w:left w:val="single" w:color="BBBBBB" w:sz="4"/>
+              <w:bottom w:val="single" w:color="BBBBBB" w:sz="4"/>
+              <w:right w:val="single" w:color="BBBBBB" w:sz="4"/>
+            </w:tcBorders>
+            <w:tcMar>
+              <w:top w:type="dxa" w:w="60"/>
+              <w:left w:type="dxa" w:w="100"/>
+              <w:bottom w:type="dxa" w:w="60"/>
+              <w:right w:type="dxa" w:w="100"/>
+            </w:tcMar>
+          </w:tcPr>
+          <w:p>
+            <w:r>
+              <w:rPr>
+                <w:b w:val="false"/>
+                <w:bCs w:val="false"/>
+                <w:sz w:val="20"/>
+                <w:szCs w:val="20"/>
+              </w:rPr>
+              <w:t xml:space="preserve">North America</w:t>
+            </w:r>
+          </w:p>
+        </w:tc>
+        <w:tc>
+          <w:tcPr>
+            <w:tcW w:type="dxa" w:w="2400"/>
+            <w:tcBorders>
+              <w:top w:val="single" w:color="BBBBBB" w:sz="4"/>
+              <w:left w:val="single" w:color="BBBBBB" w:sz="4"/>
+              <w:bottom w:val="single" w:color="BBBBBB" w:sz="4"/>
+              <w:right w:val="single" w:color="BBBBBB" w:sz="4"/>
+            </w:tcBorders>
+            <w:tcMar>
+              <w:top w:type="dxa" w:w="60"/>
+              <w:left w:type="dxa" w:w="100"/>
+              <w:bottom w:type="dxa" w:w="60"/>
+              <w:right w:type="dxa" w:w="100"/>
+            </w:tcMar>
+          </w:tcPr>
+          <w:p>
+            <w:r>
+              <w:rPr>
+                <w:b w:val="false"/>
+                <w:bCs w:val="false"/>
+                <w:sz w:val="20"/>
+                <w:szCs w:val="20"/>
+              </w:rPr>
+              <w:t xml:space="preserve">152.313,40</w:t>
+            </w:r>
+          </w:p>
+        </w:tc>
+        <w:tc>
+          <w:tcPr>
+            <w:tcW w:type="dxa" w:w="2500"/>
+            <w:tcBorders>
+              <w:top w:val="single" w:color="BBBBBB" w:sz="4"/>
+              <w:left w:val="single" w:color="BBBBBB" w:sz="4"/>
+              <w:bottom w:val="single" w:color="BBBBBB" w:sz="4"/>
+              <w:right w:val="single" w:color="BBBBBB" w:sz="4"/>
+            </w:tcBorders>
+            <w:tcMar>
+              <w:top w:type="dxa" w:w="60"/>
+              <w:left w:type="dxa" w:w="100"/>
+              <w:bottom w:type="dxa" w:w="60"/>
+              <w:right w:type="dxa" w:w="100"/>
+            </w:tcMar>
+          </w:tcPr>
+          <w:p>
+            <w:r>
+              <w:rPr>
+                <w:b w:val="false"/>
+                <w:bCs w:val="false"/>
+                <w:sz w:val="20"/>
+                <w:szCs w:val="20"/>
+              </w:rPr>
+              <w:t xml:space="preserve">3.311,16</w:t>
+            </w:r>
+          </w:p>
+        </w:tc>
+        <w:tc>
+          <w:tcPr>
+            <w:tcW w:type="dxa" w:w="2300"/>
+            <w:tcBorders>
+              <w:top w:val="single" w:color="BBBBBB" w:sz="4"/>
+              <w:left w:val="single" w:color="BBBBBB" w:sz="4"/>
+              <w:bottom w:val="single" w:color="BBBBBB" w:sz="4"/>
+              <w:right w:val="single" w:color="BBBBBB" w:sz="4"/>
+            </w:tcBorders>
+            <w:tcMar>
+              <w:top w:type="dxa" w:w="60"/>
+              <w:left w:type="dxa" w:w="100"/>
+              <w:bottom w:type="dxa" w:w="60"/>
+              <w:right w:type="dxa" w:w="100"/>
+            </w:tcMar>
+          </w:tcPr>
+          <w:p>
+            <w:r>
+              <w:rPr>
+                <w:b w:val="false"/>
+                <w:bCs w:val="false"/>
+                <w:sz w:val="20"/>
+                <w:szCs w:val="20"/>
+              </w:rPr>
+              <w:t xml:space="preserve">5,30</w:t>
+            </w:r>
+          </w:p>
+        </w:tc>
+      </w:tr>
+    </w:tbl>
+    <w:p>
+      <w:pPr>
+        <w:spacing w:after="120"/>
+      </w:pPr>
+    </w:p>
+    <w:p>
+      <w:pPr>
+        <w:pStyle w:val="Heading2"/>
+        <w:spacing w:after="120" w:before="240"/>
+      </w:pPr>
+      <w:r>
+        <w:t xml:space="preserve">6.4 Sebaran Perilaku Belanja</w:t>
+      </w:r>
+    </w:p>
+    <w:p>
+      <w:pPr>
+        <w:pStyle w:val="ListParagraph"/>
+        <w:numPr>
+          <w:ilvl w:val="0"/>
+          <w:numId w:val="2"/>
+        </w:numPr>
+        <w:spacing w:after="60"/>
+      </w:pPr>
+      <w:r>
+        <w:t xml:space="preserve">Frekuensi transaksi: rata-rata 5,03 transaksi per pelanggan aktif (median 5), dengan rentang 1 sampai 11 transaksi.</w:t>
+      </w:r>
+    </w:p>
+    <w:p>
+      <w:pPr>
+        <w:pStyle w:val="ListParagraph"/>
+        <w:numPr>
+          <w:ilvl w:val="0"/>
+          <w:numId w:val="2"/>
+        </w:numPr>
+        <w:spacing w:after="60"/>
+      </w:pPr>
+      <w:r>
+        <w:t xml:space="preserve">Nilai belanja: median 3.137,66, lebih rendah dari rata-rata (3.467,31). Distribusi sedikit condong ke kanan karena sebagian pelanggan berbelanja sangat tinggi.</w:t>
+      </w:r>
+    </w:p>
+    <w:p>
+      <w:pPr>
+        <w:pStyle w:val="ListParagraph"/>
+        <w:numPr>
+          <w:ilvl w:val="0"/>
+          <w:numId w:val="2"/>
+        </w:numPr>
+        <w:spacing w:after="60"/>
+      </w:pPr>
+      <w:r>
+        <w:t xml:space="preserve">Rentang nilai: pelanggan dengan belanja tertinggi (C0141) mencapai 10.673,87, sedangkan yang terendah (C0060) hanya 82,36.</w:t>
+      </w:r>
+    </w:p>
+    <w:p>
+      <w:pPr>
+        <w:pStyle w:val="ListParagraph"/>
+        <w:numPr>
+          <w:ilvl w:val="0"/>
+          <w:numId w:val="2"/>
+        </w:numPr>
+        <w:spacing w:after="60"/>
+      </w:pPr>
+      <w:r>
+        <w:t xml:space="preserve">Konsentrasi: 20 pelanggan teratas (sekitar 10% dari pelanggan aktif) menyumbang 20,0% pendapatan, sehingga pendapatan tidak terlalu bergantung pada segelintir pelanggan.</w:t>
+      </w:r>
+    </w:p>
+    <w:p>
+      <w:pPr>
+        <w:pStyle w:val="Heading2"/>
+        <w:spacing w:after="120" w:before="240"/>
+      </w:pPr>
+      <w:r>
+        <w:t xml:space="preserve">6.5 Interpretasi</w:t>
+      </w:r>
+    </w:p>
+    <w:p>
+      <w:pPr>
+        <w:pStyle w:val="ListParagraph"/>
+        <w:numPr>
+          <w:ilvl w:val="0"/>
+          <w:numId w:val="2"/>
+        </w:numPr>
+        <w:spacing w:after="60"/>
+      </w:pPr>
+      <w:r>
+        <w:t xml:space="preserve">South America unggul pada jumlah pelanggan (59) sekaligus nilai belanja per pelanggan (3.717,84), sehingga menjadi wilayah paling strategis.</w:t>
+      </w:r>
+    </w:p>
+    <w:p>
+      <w:pPr>
+        <w:pStyle w:val="ListParagraph"/>
+        <w:numPr>
+          <w:ilvl w:val="0"/>
+          <w:numId w:val="2"/>
+        </w:numPr>
+        <w:spacing w:after="60"/>
+      </w:pPr>
+      <w:r>
+        <w:t xml:space="preserve">Asia memiliki pelanggan paling sedikit (44), tetapi nilai belanja per pelanggannya (3.456,25) melampaui Europe dan North America. Wilayah ini menunjukkan potensi nilai tinggi dengan basis pelanggan yang kecil.</w:t>
+      </w:r>
+    </w:p>
+    <w:p>
+      <w:pPr>
+        <w:pStyle w:val="ListParagraph"/>
+        <w:numPr>
+          <w:ilvl w:val="0"/>
+          <w:numId w:val="2"/>
+        </w:numPr>
+        <w:spacing w:after="60"/>
+      </w:pPr>
+      <w:r>
+        <w:t xml:space="preserve">North America memiliki frekuensi transaksi tertinggi (5,30 per pelanggan), tetapi nilai per transaksi terendah (rata-rata 624,24). Pelanggan sering membeli, namun nilai tiap pembelian relatif kecil.</w:t>
+      </w:r>
+    </w:p>
+    <w:p>
+      <w:pPr>
+        <w:pStyle w:val="ListParagraph"/>
+        <w:numPr>
+          <w:ilvl w:val="0"/>
+          <w:numId w:val="2"/>
+        </w:numPr>
+        <w:spacing w:after="60"/>
+      </w:pPr>
+      <w:r>
+        <w:t xml:space="preserve">Europe berada pada posisi menengah dalam jumlah pelanggan (50), namun nilai belanja per pelanggannya (3.325,09) tergolong rendah.</w:t>
+      </w:r>
+    </w:p>
+    <w:p>
+      <w:pPr>
+        <w:spacing w:after="120"/>
+      </w:pPr>
+      <w:r>
+        <w:t xml:space="preserve">Secara umum, jumlah pelanggan tidak selalu berbanding lurus dengan nilai belanja per pelanggan.</w:t>
+      </w:r>
+    </w:p>
+    <w:p>
+      <w:pPr>
+        <w:pStyle w:val="Heading2"/>
+        <w:spacing w:after="120" w:before="240"/>
+      </w:pPr>
+      <w:r>
+        <w:t xml:space="preserve">6.6 Rekomendasi</w:t>
+      </w:r>
+    </w:p>
+    <w:p>
+      <w:pPr>
+        <w:pStyle w:val="ListParagraph"/>
+        <w:numPr>
+          <w:ilvl w:val="0"/>
+          <w:numId w:val="2"/>
+        </w:numPr>
+        <w:spacing w:after="60"/>
+      </w:pPr>
+      <w:r>
+        <w:t xml:space="preserve">Mempertahankan dan memperkuat layanan di South America.</w:t>
+      </w:r>
+    </w:p>
+    <w:p>
+      <w:pPr>
+        <w:pStyle w:val="ListParagraph"/>
+        <w:numPr>
+          <w:ilvl w:val="0"/>
+          <w:numId w:val="2"/>
+        </w:numPr>
+        <w:spacing w:after="60"/>
+      </w:pPr>
+      <w:r>
+        <w:t xml:space="preserve">Meningkatkan nilai tiap pembelian di North America melalui paket produk (bundling) atau penawaran produk komplementer.</w:t>
+      </w:r>
+    </w:p>
+    <w:p>
+      <w:pPr>
+        <w:pStyle w:val="ListParagraph"/>
+        <w:numPr>
+          <w:ilvl w:val="0"/>
+          <w:numId w:val="2"/>
+        </w:numPr>
+        <w:spacing w:after="60"/>
+      </w:pPr>
+      <w:r>
+        <w:t xml:space="preserve">Menambah jumlah pelanggan di Asia karena nilai belanja per pelanggannya sudah tinggi.</w:t>
+      </w:r>
+    </w:p>
+    <w:p>
+      <w:pPr>
+        <w:pStyle w:val="ListParagraph"/>
+        <w:numPr>
+          <w:ilvl w:val="0"/>
+          <w:numId w:val="2"/>
+        </w:numPr>
+        <w:spacing w:after="60"/>
+      </w:pPr>
+      <w:r>
+        <w:t xml:space="preserve">Mengaktifkan pelanggan terdaftar yang belum bertransaksi melalui program retensi.</w:t>
+      </w:r>
+    </w:p>
+    <w:p>
+      <w:pPr>
+        <w:pStyle w:val="Heading2"/>
+        <w:spacing w:after="120" w:before="240"/>
+      </w:pPr>
+      <w:r>
+        <w:t xml:space="preserve">6.7 Keterbatasan</w:t>
+      </w:r>
+    </w:p>
+    <w:p>
+      <w:pPr>
+        <w:spacing w:after="120"/>
+      </w:pPr>
+      <w:r>
+        <w:t xml:space="preserve">Data hanya mencakup periode 30 Desember 2023 sampai 28 Desember 2024. Pelanggan yang mendaftar menjelang akhir periode memiliki waktu bertransaksi lebih singkat, sehingga rata-rata belanjanya dapat lebih rendah. Selain itu, data kemungkinan bersifat sintetis sehingga generalisasi ke kondisi nyata perlu dilakukan dengan hati-hati.</w:t>
+      </w:r>
+    </w:p>
+    <w:p>
+      <w:pPr>
+        <w:pStyle w:val="Heading1"/>
+        <w:spacing w:after="120" w:before="240"/>
+      </w:pPr>
+      <w:r>
+        <w:t xml:space="preserve">7. Isi Dashboard Power BI</w:t>
       </w:r>
     </w:p>
     <w:p>
@@ -6688,7 +8307,7 @@
         <w:spacing w:after="120" w:before="240"/>
       </w:pPr>
       <w:r>
-        <w:t xml:space="preserve">7. Saran Alur Presentasi</w:t>
+        <w:t xml:space="preserve">8. Saran Alur Presentasi</w:t>
       </w:r>
     </w:p>
     <w:p>
@@ -6753,7 +8372,7 @@
         <w:spacing w:after="120" w:before="240"/>
       </w:pPr>
       <w:r>
-        <w:t xml:space="preserve">8. Rekomendasi</w:t>
+        <w:t xml:space="preserve">9. Rekomendasi</w:t>
       </w:r>
     </w:p>
     <w:p>

</xml_diff>